<commit_message>
Expand presentation with repository line references
</commit_message>
<xml_diff>
--- a/documentation/PulseGuard_Code_Presentation.docx
+++ b/documentation/PulseGuard_Code_Presentation.docx
@@ -7,12 +7,23 @@
         <w:pStyle w:val="Title"/>
       </w:pPr>
       <w:r>
-        <w:t>PulseGuard Code Presentation</w:t>
+        <w:t>PulseGuard Repository File Presentation</w:t>
       </w:r>
     </w:p>
     <w:p>
       <w:r>
-        <w:t>One minute forty five second presenter notes</w:t>
+        <w:t>Two to three presentation sentences for every file tracked in GitHub</w:t>
+      </w:r>
+    </w:p>
+    <w:p>
+      <w:r>
+        <w:rPr>
+          <w:b/>
+        </w:rPr>
+        <w:t xml:space="preserve">How to use this document  </w:t>
+      </w:r>
+      <w:r>
+        <w:t>Each bullet identifies a file's feature, quotes an exact current line when the file is readable text, and explains what that line proves about the implementation.</w:t>
       </w:r>
     </w:p>
     <w:p>
@@ -20,71 +31,322 @@
         <w:pStyle w:val="Heading1"/>
       </w:pPr>
       <w:r>
-        <w:t>Presentation bullets</w:t>
+        <w:t>Source and configuration files</w:t>
       </w:r>
     </w:p>
     <w:p>
       <w:pPr>
         <w:pStyle w:val="ListBullet"/>
-        <w:spacing w:after="160" w:line="264" w:lineRule="auto"/>
+        <w:keepLines/>
       </w:pPr>
       <w:r>
-        <w:t>PulseGuard addresses the prompt's main problem: someone may become unable to ask for help. Its homepage shows the drop tracker, 911, bystander, and substance-use choices. The tracker link appears at index.html line 32.</w:t>
+        <w:rPr>
+          <w:b/>
+        </w:rPr>
+        <w:t xml:space="preserve">.gitignore. </w:t>
+      </w:r>
+      <w:r>
+        <w:t>This file keeps machine-specific files and secrets out of GitHub. Line 3, ".env", shows the exact code used for that feature. This protects repository hygiene without affecting the website.</w:t>
       </w:r>
     </w:p>
     <w:p>
       <w:pPr>
         <w:pStyle w:val="ListBullet"/>
-        <w:spacing w:after="160" w:line="264" w:lineRule="auto"/>
+        <w:keepLines/>
       </w:pPr>
       <w:r>
-        <w:t>The user starts monitoring from fall-detection.html line 64. app.js line 20 defines a five-second arming delay, giving the user time to set the phone down before motion readings begin.</w:t>
+        <w:rPr>
+          <w:b/>
+        </w:rPr>
+        <w:t xml:space="preserve">README.md. </w:t>
+      </w:r>
+      <w:r>
+        <w:t>This file explains how to run and evaluate the project. Line 1, "# PulseGuard", shows the exact code used for that feature. This gives another developer enough context to open the prototype correctly.</w:t>
       </w:r>
     </w:p>
     <w:p>
       <w:pPr>
         <w:pStyle w:val="ListBullet"/>
-        <w:spacing w:after="160" w:line="264" w:lineRule="auto"/>
+        <w:keepLines/>
       </w:pPr>
       <w:r>
-        <w:t>A hard movement creates an impact signal. app.js lines 75 and 80 call startDropAlarm. Line 19 sets the warning to ten seconds, while fall-detection.html line 143 loads the attached warning MP3 instead of the click sound.</w:t>
+        <w:rPr>
+          <w:b/>
+        </w:rPr>
+        <w:t xml:space="preserve">about.html. </w:t>
+      </w:r>
+      <w:r>
+        <w:t>This file states the prototype's limits, privacy model, and evidence boundaries. Line 23, "&lt;h1&gt;What Lifeline can—and cannot—do.&lt;/h1&gt;", shows the exact code used for that feature. This keeps the safety claim focused on warning patterns instead of diagnosis.</w:t>
       </w:r>
     </w:p>
     <w:p>
       <w:pPr>
         <w:pStyle w:val="ListBullet"/>
-        <w:spacing w:after="160" w:line="264" w:lineRule="auto"/>
+        <w:keepLines/>
       </w:pPr>
       <w:r>
-        <w:t>The alarm is a local warning, not an emergency dispatch. Stopping it pauses and resets the audio, then app.js line 114 opens the care prompt. This keeps a dropped phone from automatically contacting anyone, matching the prompt's false-alarm safeguard.</w:t>
+        <w:rPr>
+          <w:b/>
+        </w:rPr>
+        <w:t xml:space="preserve">app.js. </w:t>
+      </w:r>
+      <w:r>
+        <w:t>This file controls the five-second arming delay, drop alarm, sensors, and nearby-care prompt. Line 20, "const ARM_DELAY_S = 5;        /* time to put the phone down after pressing Start */", shows the exact code used for that feature. This file contains the main safety sequence rather than only changing page appearance.</w:t>
       </w:r>
     </w:p>
     <w:p>
       <w:pPr>
         <w:pStyle w:val="ListBullet"/>
-        <w:spacing w:after="160" w:line="264" w:lineRule="auto"/>
+        <w:keepLines/>
       </w:pPr>
       <w:r>
-        <w:t>If the user chooses Open map, openNearbyCare begins at app.js line 117. It asks for browser location and searches for nearby emergency medical services. Location is requested after the alarm, not before it.</w:t>
+        <w:rPr>
+          <w:b/>
+        </w:rPr>
+        <w:t xml:space="preserve">auth.js. </w:t>
+      </w:r>
+      <w:r>
+        <w:t>This file opens the prototype login and sign-up dialog. Line 24, "if (!authDialog.open) authDialog.showModal();", shows the exact code used for that feature. The code makes the account interface interactive without pretending that a backend exists.</w:t>
       </w:r>
     </w:p>
     <w:p>
       <w:pPr>
         <w:pStyle w:val="ListBullet"/>
-        <w:spacing w:after="160" w:line="264" w:lineRule="auto"/>
+        <w:keepLines/>
       </w:pPr>
       <w:r>
-        <w:t>The other files support the same idea. nav.js line 11 centralizes navigation, auth.js line 24 opens the prototype account dialog, and the CSS keeps controls readable. Supporting pages show response zones, nearby resources, check-ins, and hazards without claiming a diagnosis.</w:t>
+        <w:rPr>
+          <w:b/>
+        </w:rPr>
+        <w:t xml:space="preserve">fall-detection.html. </w:t>
+      </w:r>
+      <w:r>
+        <w:t>This file provides the tracker button, alarm panel, Stop control, map prompt, and audio element. Line 143, "&lt;audio id="alarmSound" src="warning-alarm.mp3" preload="auto" loop&gt;&lt;/audio&gt;", shows the exact code used for that feature. This markup is the visible structure that app.js updates.</w:t>
       </w:r>
     </w:p>
     <w:p>
+      <w:pPr>
+        <w:pStyle w:val="ListBullet"/>
+        <w:keepLines/>
+      </w:pPr>
       <w:r>
-        <w:t>Spoken length  216 words at roughly 123 words per minute</w:t>
+        <w:rPr>
+          <w:b/>
+        </w:rPr>
+        <w:t xml:space="preserve">hazard.html. </w:t>
+      </w:r>
+      <w:r>
+        <w:t>This file demonstrates community hazard reporting and duplicate merging. Line 71, "const MERGE_M = 60;", shows the exact code used for that feature. It is a supporting public-safety experiment rather than the core drop tracker.</w:t>
       </w:r>
     </w:p>
     <w:p>
+      <w:pPr>
+        <w:pStyle w:val="ListBullet"/>
+        <w:keepLines/>
+      </w:pPr>
       <w:r>
-        <w:br w:type="page"/>
+        <w:rPr>
+          <w:b/>
+        </w:rPr>
+        <w:t xml:space="preserve">index.html. </w:t>
+      </w:r>
+      <w:r>
+        <w:t>This file presents the main emergency choices and a visible route to the tracker. Line 32, "&lt;a class="primary-btn" href="fall-detection.html"&gt;Open drop tracker&lt;/a&gt;", shows the exact code used for that feature. This makes the primary working feature easy to find from the homepage.</w:t>
+      </w:r>
+    </w:p>
+    <w:p>
+      <w:pPr>
+        <w:pStyle w:val="ListBullet"/>
+        <w:keepLines/>
+      </w:pPr>
+      <w:r>
+        <w:rPr>
+          <w:b/>
+        </w:rPr>
+        <w:t xml:space="preserve">nav.js. </w:t>
+      </w:r>
+      <w:r>
+        <w:t>This file builds one shared navigation menu for every page. Line 11, "const SITE = [", shows the exact code used for that feature. Centralizing the link list prevents different pages from showing inconsistent destinations.</w:t>
+      </w:r>
+    </w:p>
+    <w:p>
+      <w:pPr>
+        <w:pStyle w:val="ListBullet"/>
+        <w:keepLines/>
+      </w:pPr>
+      <w:r>
+        <w:rPr>
+          <w:b/>
+        </w:rPr>
+        <w:t xml:space="preserve">risk-zones.html. </w:t>
+      </w:r>
+      <w:r>
+        <w:t>This file maps privacy-thresholded response-planning zones. Line 96, "const MIN_CALLS = 5;        /* a zone below this is never drawn */", shows the exact code used for that feature. The page explores community planning while avoiding a claim about individual emergencies.</w:t>
+      </w:r>
+    </w:p>
+    <w:p>
+      <w:pPr>
+        <w:pStyle w:val="ListBullet"/>
+        <w:keepLines/>
+      </w:pPr>
+      <w:r>
+        <w:rPr>
+          <w:b/>
+        </w:rPr>
+        <w:t xml:space="preserve">robots.txt. </w:t>
+      </w:r>
+      <w:r>
+        <w:t>This file allows search crawlers to access the public site. Line 2, "Allow: /", shows the exact code used for that feature. This is the smallest site-wide SEO instruction in the repository.</w:t>
+      </w:r>
+    </w:p>
+    <w:p>
+      <w:pPr>
+        <w:pStyle w:val="ListBullet"/>
+        <w:keepLines/>
+      </w:pPr>
+      <w:r>
+        <w:rPr>
+          <w:b/>
+        </w:rPr>
+        <w:t xml:space="preserve">safewalk.html. </w:t>
+      </w:r>
+      <w:r>
+        <w:t>This file demonstrates a timed check-in and nearby emergency-care search. Line 137, "const GRACE_S = 300;             /* five minutes late before the alarm */", shows the exact code used for that feature. It supports the broader goal of shortening the route to human help.</w:t>
+      </w:r>
+    </w:p>
+    <w:p>
+      <w:pPr>
+        <w:pStyle w:val="ListBullet"/>
+        <w:keepLines/>
+      </w:pPr>
+      <w:r>
+        <w:rPr>
+          <w:b/>
+        </w:rPr>
+        <w:t xml:space="preserve">script.js. </w:t>
+      </w:r>
+      <w:r>
+        <w:t>This file renders the older illustrative city-data dashboard. Line 22, "const CITIES = [", shows the exact code used for that feature. Its data stays clearly separate from the live drop-tracker logic.</w:t>
+      </w:r>
+    </w:p>
+    <w:p>
+      <w:pPr>
+        <w:pStyle w:val="ListBullet"/>
+        <w:keepLines/>
+      </w:pPr>
+      <w:r>
+        <w:rPr>
+          <w:b/>
+        </w:rPr>
+        <w:t xml:space="preserve">shelters.html. </w:t>
+      </w:r>
+      <w:r>
+        <w:t>This file ranks nearby AED, shelter, and hydrant records. Line 68, "const NEAREST = 5;", shows the exact code used for that feature. This supporting page shows how location could surface practical safety resources.</w:t>
+      </w:r>
+    </w:p>
+    <w:p>
+      <w:pPr>
+        <w:pStyle w:val="ListBullet"/>
+        <w:keepLines/>
+      </w:pPr>
+      <w:r>
+        <w:rPr>
+          <w:b/>
+        </w:rPr>
+        <w:t xml:space="preserve">site.css. </w:t>
+      </w:r>
+      <w:r>
+        <w:t>This file defines shared navigation, controls, dialogs, accessibility states, and mobile rules. Line 889, ".care-dialog { width: min(430px, calc(100% - 32px)); padding: 24px; background: #202122; color: var(--text); border: 1px solid var(--line); }", shows the exact code used for that feature. This keeps the interface consistent across all pages.</w:t>
+      </w:r>
+    </w:p>
+    <w:p>
+      <w:pPr>
+        <w:pStyle w:val="ListBullet"/>
+        <w:keepLines/>
+      </w:pPr>
+      <w:r>
+        <w:rPr>
+          <w:b/>
+        </w:rPr>
+        <w:t xml:space="preserve">sound.js. </w:t>
+      </w:r>
+      <w:r>
+        <w:t>This file plays optional quiet feedback for ordinary interface actions. Line 8, "const SOUND_FILE = "click.mp3";", shows the exact code used for that feature. It deliberately uses click.mp3 separately from the loud warning alarm.</w:t>
+      </w:r>
+    </w:p>
+    <w:p>
+      <w:pPr>
+        <w:pStyle w:val="ListBullet"/>
+        <w:keepLines/>
+      </w:pPr>
+      <w:r>
+        <w:rPr>
+          <w:b/>
+        </w:rPr>
+        <w:t xml:space="preserve">styles.css. </w:t>
+      </w:r>
+      <w:r>
+        <w:t>This file styles homepage choices and responsive layout. Line 613, ".choice-grid { display: grid; grid-template-columns: repeat(3, 1fr); gap: 14px; }", shows the exact code used for that feature. The grid becomes one column on smaller screens so the safety actions remain readable.</w:t>
+      </w:r>
+    </w:p>
+    <w:p>
+      <w:pPr>
+        <w:pStyle w:val="ListBullet"/>
+        <w:keepLines/>
+      </w:pPr>
+      <w:r>
+        <w:rPr>
+          <w:b/>
+        </w:rPr>
+        <w:t xml:space="preserve">documentation/build_prompt_aligned_presentation.py. </w:t>
+      </w:r>
+      <w:r>
+        <w:t>This file generates the prompt-relevance version of the Word presentation. Line 7, "OUT = r"C:\Users\rishi\Downloads\public_safety_hackathon_site\public_safety_hackathon_final\documentation\Lifeline_Prompt_Aligned_Code_Presentation.docx"", shows the exact code used for that feature. Keeping the generator in GitHub makes that document reproducible.</w:t>
+      </w:r>
+    </w:p>
+    <w:p>
+      <w:pPr>
+        <w:pStyle w:val="ListBullet"/>
+        <w:keepLines/>
+      </w:pPr>
+      <w:r>
+        <w:rPr>
+          <w:b/>
+        </w:rPr>
+        <w:t xml:space="preserve">documentation/build_pulseguard_105s_presentation.py. </w:t>
+      </w:r>
+      <w:r>
+        <w:t>This file generates the earlier 105-second bullet presentation. Line 9, "talk = [", shows the exact code used for that feature. Its talk list stores the exact presenter wording before Word formatting is applied.</w:t>
+      </w:r>
+    </w:p>
+    <w:p>
+      <w:pPr>
+        <w:pStyle w:val="ListBullet"/>
+        <w:keepLines/>
+      </w:pPr>
+      <w:r>
+        <w:rPr>
+          <w:b/>
+        </w:rPr>
+        <w:t xml:space="preserve">documentation/build_two_minute_presentation.py. </w:t>
+      </w:r>
+      <w:r>
+        <w:t>This file generates the two-minute code overview. Line 8, "OUT = r"C:\Users\rishi\Downloads\public_safety_hackathon_site\PulseGuard_Code_Presentation.docx"", shows the exact code used for that feature. It records the intended output path and can rebuild the document after code changes.</w:t>
+      </w:r>
+    </w:p>
+    <w:p>
+      <w:pPr>
+        <w:pStyle w:val="ListBullet"/>
+        <w:keepLines/>
+      </w:pPr>
+      <w:r>
+        <w:rPr>
+          <w:b/>
+        </w:rPr>
+        <w:t xml:space="preserve">documentation/build_repo_file_bullets.py. </w:t>
+      </w:r>
+      <w:r>
+        <w:t>This file generates this repository-wide line-reference presentation. Line 10, "ENTRIES = [", shows the exact code used for that feature. It reads the current files to calculate line numbers instead of relying on stale manual references.</w:t>
       </w:r>
     </w:p>
     <w:p>
@@ -92,1076 +354,87 @@
         <w:pStyle w:val="Heading1"/>
       </w:pPr>
       <w:r>
-        <w:t>Code file feature guide</w:t>
+        <w:t>Binary files</w:t>
       </w:r>
     </w:p>
     <w:p>
+      <w:pPr>
+        <w:pStyle w:val="ListBullet"/>
+        <w:keepLines/>
+      </w:pPr>
       <w:r>
-        <w:t>Short references for questions after the timed presentation.</w:t>
+        <w:rPr>
+          <w:b/>
+        </w:rPr>
+        <w:t xml:space="preserve">click.mp3. </w:t>
+      </w:r>
+      <w:r>
+        <w:t>This file contains the short sound used for ordinary interface feedback. As a binary audio file, it has no readable source-code line number.</w:t>
       </w:r>
     </w:p>
-    <w:tbl>
-      <w:tblPr>
-        <w:tblW w:type="auto" w:w="0"/>
-        <w:tblLayout w:type="fixed"/>
-        <w:tblLook w:firstColumn="1" w:firstRow="1" w:lastColumn="0" w:lastRow="0" w:noHBand="0" w:noVBand="1" w:val="04A0"/>
-      </w:tblPr>
-      <w:tblGrid>
-        <w:gridCol w:w="3389"/>
-        <w:gridCol w:w="3389"/>
-        <w:gridCol w:w="3389"/>
-      </w:tblGrid>
-      <w:tr>
-        <w:tc>
-          <w:tcPr>
-            <w:tcW w:type="dxa" w:w="1944"/>
-            <w:shd w:fill="374151"/>
-            <w:tcBorders>
-              <w:top w:val="single" w:sz="4" w:color="D9D9D9"/>
-              <w:left w:val="single" w:sz="4" w:color="D9D9D9"/>
-              <w:bottom w:val="single" w:sz="4" w:color="D9D9D9"/>
-              <w:right w:val="single" w:sz="4" w:color="D9D9D9"/>
-              <w:insideH w:val="single" w:sz="4" w:color="D9D9D9"/>
-              <w:insideV w:val="single" w:sz="4" w:color="D9D9D9"/>
-            </w:tcBorders>
-          </w:tcPr>
-          <w:p>
-            <w:r>
-              <w:rPr>
-                <w:b/>
-                <w:color w:val="FFFFFF"/>
-                <w:sz w:val="18"/>
-              </w:rPr>
-              <w:t>File</w:t>
-            </w:r>
-          </w:p>
-        </w:tc>
-        <w:tc>
-          <w:tcPr>
-            <w:tcW w:type="dxa" w:w="5256"/>
-            <w:shd w:fill="374151"/>
-            <w:tcBorders>
-              <w:top w:val="single" w:sz="4" w:color="D9D9D9"/>
-              <w:left w:val="single" w:sz="4" w:color="D9D9D9"/>
-              <w:bottom w:val="single" w:sz="4" w:color="D9D9D9"/>
-              <w:right w:val="single" w:sz="4" w:color="D9D9D9"/>
-              <w:insideH w:val="single" w:sz="4" w:color="D9D9D9"/>
-              <w:insideV w:val="single" w:sz="4" w:color="D9D9D9"/>
-            </w:tcBorders>
-          </w:tcPr>
-          <w:p>
-            <w:r>
-              <w:rPr>
-                <w:b/>
-                <w:color w:val="FFFFFF"/>
-                <w:sz w:val="18"/>
-              </w:rPr>
-              <w:t>Feature</w:t>
-            </w:r>
-          </w:p>
-        </w:tc>
-        <w:tc>
-          <w:tcPr>
-            <w:tcW w:type="dxa" w:w="2808"/>
-            <w:shd w:fill="374151"/>
-            <w:tcBorders>
-              <w:top w:val="single" w:sz="4" w:color="D9D9D9"/>
-              <w:left w:val="single" w:sz="4" w:color="D9D9D9"/>
-              <w:bottom w:val="single" w:sz="4" w:color="D9D9D9"/>
-              <w:right w:val="single" w:sz="4" w:color="D9D9D9"/>
-              <w:insideH w:val="single" w:sz="4" w:color="D9D9D9"/>
-              <w:insideV w:val="single" w:sz="4" w:color="D9D9D9"/>
-            </w:tcBorders>
-          </w:tcPr>
-          <w:p>
-            <w:r>
-              <w:rPr>
-                <w:b/>
-                <w:color w:val="FFFFFF"/>
-                <w:sz w:val="18"/>
-              </w:rPr>
-              <w:t>Code reference</w:t>
-            </w:r>
-          </w:p>
-        </w:tc>
-      </w:tr>
-      <w:tr>
-        <w:tc>
-          <w:tcPr>
-            <w:tcW w:type="dxa" w:w="1944"/>
-            <w:vAlign w:val="center"/>
-            <w:tcBorders>
-              <w:top w:val="single" w:sz="4" w:color="D9D9D9"/>
-              <w:left w:val="single" w:sz="4" w:color="D9D9D9"/>
-              <w:bottom w:val="single" w:sz="4" w:color="D9D9D9"/>
-              <w:right w:val="single" w:sz="4" w:color="D9D9D9"/>
-              <w:insideH w:val="single" w:sz="4" w:color="D9D9D9"/>
-              <w:insideV w:val="single" w:sz="4" w:color="D9D9D9"/>
-            </w:tcBorders>
-          </w:tcPr>
-          <w:p>
-            <w:r>
-              <w:rPr>
-                <w:sz w:val="17"/>
-              </w:rPr>
-              <w:t>index.html</w:t>
-            </w:r>
-          </w:p>
-        </w:tc>
-        <w:tc>
-          <w:tcPr>
-            <w:tcW w:type="dxa" w:w="5256"/>
-            <w:vAlign w:val="center"/>
-            <w:tcBorders>
-              <w:top w:val="single" w:sz="4" w:color="D9D9D9"/>
-              <w:left w:val="single" w:sz="4" w:color="D9D9D9"/>
-              <w:bottom w:val="single" w:sz="4" w:color="D9D9D9"/>
-              <w:right w:val="single" w:sz="4" w:color="D9D9D9"/>
-              <w:insideH w:val="single" w:sz="4" w:color="D9D9D9"/>
-              <w:insideV w:val="single" w:sz="4" w:color="D9D9D9"/>
-            </w:tcBorders>
-          </w:tcPr>
-          <w:p>
-            <w:r>
-              <w:rPr>
-                <w:sz w:val="17"/>
-              </w:rPr>
-              <w:t>Main safety choices and visible tracker</w:t>
-            </w:r>
-          </w:p>
-        </w:tc>
-        <w:tc>
-          <w:tcPr>
-            <w:tcW w:type="dxa" w:w="2808"/>
-            <w:vAlign w:val="center"/>
-            <w:tcBorders>
-              <w:top w:val="single" w:sz="4" w:color="D9D9D9"/>
-              <w:left w:val="single" w:sz="4" w:color="D9D9D9"/>
-              <w:bottom w:val="single" w:sz="4" w:color="D9D9D9"/>
-              <w:right w:val="single" w:sz="4" w:color="D9D9D9"/>
-              <w:insideH w:val="single" w:sz="4" w:color="D9D9D9"/>
-              <w:insideV w:val="single" w:sz="4" w:color="D9D9D9"/>
-            </w:tcBorders>
-          </w:tcPr>
-          <w:p>
-            <w:r>
-              <w:rPr>
-                <w:sz w:val="17"/>
-              </w:rPr>
-              <w:t>line 32</w:t>
-            </w:r>
-          </w:p>
-        </w:tc>
-      </w:tr>
-      <w:tr>
-        <w:tc>
-          <w:tcPr>
-            <w:tcW w:type="dxa" w:w="1944"/>
-            <w:vAlign w:val="center"/>
-            <w:shd w:fill="F3F4F6"/>
-            <w:tcBorders>
-              <w:top w:val="single" w:sz="4" w:color="D9D9D9"/>
-              <w:left w:val="single" w:sz="4" w:color="D9D9D9"/>
-              <w:bottom w:val="single" w:sz="4" w:color="D9D9D9"/>
-              <w:right w:val="single" w:sz="4" w:color="D9D9D9"/>
-              <w:insideH w:val="single" w:sz="4" w:color="D9D9D9"/>
-              <w:insideV w:val="single" w:sz="4" w:color="D9D9D9"/>
-            </w:tcBorders>
-          </w:tcPr>
-          <w:p>
-            <w:r>
-              <w:rPr>
-                <w:sz w:val="17"/>
-              </w:rPr>
-              <w:t>fall-detection.html</w:t>
-            </w:r>
-          </w:p>
-        </w:tc>
-        <w:tc>
-          <w:tcPr>
-            <w:tcW w:type="dxa" w:w="5256"/>
-            <w:vAlign w:val="center"/>
-            <w:shd w:fill="F3F4F6"/>
-            <w:tcBorders>
-              <w:top w:val="single" w:sz="4" w:color="D9D9D9"/>
-              <w:left w:val="single" w:sz="4" w:color="D9D9D9"/>
-              <w:bottom w:val="single" w:sz="4" w:color="D9D9D9"/>
-              <w:right w:val="single" w:sz="4" w:color="D9D9D9"/>
-              <w:insideH w:val="single" w:sz="4" w:color="D9D9D9"/>
-              <w:insideV w:val="single" w:sz="4" w:color="D9D9D9"/>
-            </w:tcBorders>
-          </w:tcPr>
-          <w:p>
-            <w:r>
-              <w:rPr>
-                <w:sz w:val="17"/>
-              </w:rPr>
-              <w:t>Start control, alarm, Stop, care dialog, MP3</w:t>
-            </w:r>
-          </w:p>
-        </w:tc>
-        <w:tc>
-          <w:tcPr>
-            <w:tcW w:type="dxa" w:w="2808"/>
-            <w:vAlign w:val="center"/>
-            <w:shd w:fill="F3F4F6"/>
-            <w:tcBorders>
-              <w:top w:val="single" w:sz="4" w:color="D9D9D9"/>
-              <w:left w:val="single" w:sz="4" w:color="D9D9D9"/>
-              <w:bottom w:val="single" w:sz="4" w:color="D9D9D9"/>
-              <w:right w:val="single" w:sz="4" w:color="D9D9D9"/>
-              <w:insideH w:val="single" w:sz="4" w:color="D9D9D9"/>
-              <w:insideV w:val="single" w:sz="4" w:color="D9D9D9"/>
-            </w:tcBorders>
-          </w:tcPr>
-          <w:p>
-            <w:r>
-              <w:rPr>
-                <w:sz w:val="17"/>
-              </w:rPr>
-              <w:t>lines 64, 133, 143</w:t>
-            </w:r>
-          </w:p>
-        </w:tc>
-      </w:tr>
-      <w:tr>
-        <w:tc>
-          <w:tcPr>
-            <w:tcW w:type="dxa" w:w="1944"/>
-            <w:vAlign w:val="center"/>
-            <w:tcBorders>
-              <w:top w:val="single" w:sz="4" w:color="D9D9D9"/>
-              <w:left w:val="single" w:sz="4" w:color="D9D9D9"/>
-              <w:bottom w:val="single" w:sz="4" w:color="D9D9D9"/>
-              <w:right w:val="single" w:sz="4" w:color="D9D9D9"/>
-              <w:insideH w:val="single" w:sz="4" w:color="D9D9D9"/>
-              <w:insideV w:val="single" w:sz="4" w:color="D9D9D9"/>
-            </w:tcBorders>
-          </w:tcPr>
-          <w:p>
-            <w:r>
-              <w:rPr>
-                <w:sz w:val="17"/>
-              </w:rPr>
-              <w:t>app.js</w:t>
-            </w:r>
-          </w:p>
-        </w:tc>
-        <w:tc>
-          <w:tcPr>
-            <w:tcW w:type="dxa" w:w="5256"/>
-            <w:vAlign w:val="center"/>
-            <w:tcBorders>
-              <w:top w:val="single" w:sz="4" w:color="D9D9D9"/>
-              <w:left w:val="single" w:sz="4" w:color="D9D9D9"/>
-              <w:bottom w:val="single" w:sz="4" w:color="D9D9D9"/>
-              <w:right w:val="single" w:sz="4" w:color="D9D9D9"/>
-              <w:insideH w:val="single" w:sz="4" w:color="D9D9D9"/>
-              <w:insideV w:val="single" w:sz="4" w:color="D9D9D9"/>
-            </w:tcBorders>
-          </w:tcPr>
-          <w:p>
-            <w:r>
-              <w:rPr>
-                <w:sz w:val="17"/>
-              </w:rPr>
-              <w:t>Arming delay, motion logic, alarm timer, map</w:t>
-            </w:r>
-          </w:p>
-        </w:tc>
-        <w:tc>
-          <w:tcPr>
-            <w:tcW w:type="dxa" w:w="2808"/>
-            <w:vAlign w:val="center"/>
-            <w:tcBorders>
-              <w:top w:val="single" w:sz="4" w:color="D9D9D9"/>
-              <w:left w:val="single" w:sz="4" w:color="D9D9D9"/>
-              <w:bottom w:val="single" w:sz="4" w:color="D9D9D9"/>
-              <w:right w:val="single" w:sz="4" w:color="D9D9D9"/>
-              <w:insideH w:val="single" w:sz="4" w:color="D9D9D9"/>
-              <w:insideV w:val="single" w:sz="4" w:color="D9D9D9"/>
-            </w:tcBorders>
-          </w:tcPr>
-          <w:p>
-            <w:r>
-              <w:rPr>
-                <w:sz w:val="17"/>
-              </w:rPr>
-              <w:t>lines 19-20, 75-130</w:t>
-            </w:r>
-          </w:p>
-        </w:tc>
-      </w:tr>
-      <w:tr>
-        <w:tc>
-          <w:tcPr>
-            <w:tcW w:type="dxa" w:w="1944"/>
-            <w:vAlign w:val="center"/>
-            <w:shd w:fill="F3F4F6"/>
-            <w:tcBorders>
-              <w:top w:val="single" w:sz="4" w:color="D9D9D9"/>
-              <w:left w:val="single" w:sz="4" w:color="D9D9D9"/>
-              <w:bottom w:val="single" w:sz="4" w:color="D9D9D9"/>
-              <w:right w:val="single" w:sz="4" w:color="D9D9D9"/>
-              <w:insideH w:val="single" w:sz="4" w:color="D9D9D9"/>
-              <w:insideV w:val="single" w:sz="4" w:color="D9D9D9"/>
-            </w:tcBorders>
-          </w:tcPr>
-          <w:p>
-            <w:r>
-              <w:rPr>
-                <w:sz w:val="17"/>
-              </w:rPr>
-              <w:t>nav.js</w:t>
-            </w:r>
-          </w:p>
-        </w:tc>
-        <w:tc>
-          <w:tcPr>
-            <w:tcW w:type="dxa" w:w="5256"/>
-            <w:vAlign w:val="center"/>
-            <w:shd w:fill="F3F4F6"/>
-            <w:tcBorders>
-              <w:top w:val="single" w:sz="4" w:color="D9D9D9"/>
-              <w:left w:val="single" w:sz="4" w:color="D9D9D9"/>
-              <w:bottom w:val="single" w:sz="4" w:color="D9D9D9"/>
-              <w:right w:val="single" w:sz="4" w:color="D9D9D9"/>
-              <w:insideH w:val="single" w:sz="4" w:color="D9D9D9"/>
-              <w:insideV w:val="single" w:sz="4" w:color="D9D9D9"/>
-            </w:tcBorders>
-          </w:tcPr>
-          <w:p>
-            <w:r>
-              <w:rPr>
-                <w:sz w:val="17"/>
-              </w:rPr>
-              <w:t>Shared navigation and account links</w:t>
-            </w:r>
-          </w:p>
-        </w:tc>
-        <w:tc>
-          <w:tcPr>
-            <w:tcW w:type="dxa" w:w="2808"/>
-            <w:vAlign w:val="center"/>
-            <w:shd w:fill="F3F4F6"/>
-            <w:tcBorders>
-              <w:top w:val="single" w:sz="4" w:color="D9D9D9"/>
-              <w:left w:val="single" w:sz="4" w:color="D9D9D9"/>
-              <w:bottom w:val="single" w:sz="4" w:color="D9D9D9"/>
-              <w:right w:val="single" w:sz="4" w:color="D9D9D9"/>
-              <w:insideH w:val="single" w:sz="4" w:color="D9D9D9"/>
-              <w:insideV w:val="single" w:sz="4" w:color="D9D9D9"/>
-            </w:tcBorders>
-          </w:tcPr>
-          <w:p>
-            <w:r>
-              <w:rPr>
-                <w:sz w:val="17"/>
-              </w:rPr>
-              <w:t>lines 11-24, 99-113</w:t>
-            </w:r>
-          </w:p>
-        </w:tc>
-      </w:tr>
-      <w:tr>
-        <w:tc>
-          <w:tcPr>
-            <w:tcW w:type="dxa" w:w="1944"/>
-            <w:vAlign w:val="center"/>
-            <w:tcBorders>
-              <w:top w:val="single" w:sz="4" w:color="D9D9D9"/>
-              <w:left w:val="single" w:sz="4" w:color="D9D9D9"/>
-              <w:bottom w:val="single" w:sz="4" w:color="D9D9D9"/>
-              <w:right w:val="single" w:sz="4" w:color="D9D9D9"/>
-              <w:insideH w:val="single" w:sz="4" w:color="D9D9D9"/>
-              <w:insideV w:val="single" w:sz="4" w:color="D9D9D9"/>
-            </w:tcBorders>
-          </w:tcPr>
-          <w:p>
-            <w:r>
-              <w:rPr>
-                <w:sz w:val="17"/>
-              </w:rPr>
-              <w:t>auth.js</w:t>
-            </w:r>
-          </w:p>
-        </w:tc>
-        <w:tc>
-          <w:tcPr>
-            <w:tcW w:type="dxa" w:w="5256"/>
-            <w:vAlign w:val="center"/>
-            <w:tcBorders>
-              <w:top w:val="single" w:sz="4" w:color="D9D9D9"/>
-              <w:left w:val="single" w:sz="4" w:color="D9D9D9"/>
-              <w:bottom w:val="single" w:sz="4" w:color="D9D9D9"/>
-              <w:right w:val="single" w:sz="4" w:color="D9D9D9"/>
-              <w:insideH w:val="single" w:sz="4" w:color="D9D9D9"/>
-              <w:insideV w:val="single" w:sz="4" w:color="D9D9D9"/>
-            </w:tcBorders>
-          </w:tcPr>
-          <w:p>
-            <w:r>
-              <w:rPr>
-                <w:sz w:val="17"/>
-              </w:rPr>
-              <w:t>Login and sign-up prototype dialog</w:t>
-            </w:r>
-          </w:p>
-        </w:tc>
-        <w:tc>
-          <w:tcPr>
-            <w:tcW w:type="dxa" w:w="2808"/>
-            <w:vAlign w:val="center"/>
-            <w:tcBorders>
-              <w:top w:val="single" w:sz="4" w:color="D9D9D9"/>
-              <w:left w:val="single" w:sz="4" w:color="D9D9D9"/>
-              <w:bottom w:val="single" w:sz="4" w:color="D9D9D9"/>
-              <w:right w:val="single" w:sz="4" w:color="D9D9D9"/>
-              <w:insideH w:val="single" w:sz="4" w:color="D9D9D9"/>
-              <w:insideV w:val="single" w:sz="4" w:color="D9D9D9"/>
-            </w:tcBorders>
-          </w:tcPr>
-          <w:p>
-            <w:r>
-              <w:rPr>
-                <w:sz w:val="17"/>
-              </w:rPr>
-              <w:t>lines 5-42</w:t>
-            </w:r>
-          </w:p>
-        </w:tc>
-      </w:tr>
-      <w:tr>
-        <w:tc>
-          <w:tcPr>
-            <w:tcW w:type="dxa" w:w="1944"/>
-            <w:vAlign w:val="center"/>
-            <w:shd w:fill="F3F4F6"/>
-            <w:tcBorders>
-              <w:top w:val="single" w:sz="4" w:color="D9D9D9"/>
-              <w:left w:val="single" w:sz="4" w:color="D9D9D9"/>
-              <w:bottom w:val="single" w:sz="4" w:color="D9D9D9"/>
-              <w:right w:val="single" w:sz="4" w:color="D9D9D9"/>
-              <w:insideH w:val="single" w:sz="4" w:color="D9D9D9"/>
-              <w:insideV w:val="single" w:sz="4" w:color="D9D9D9"/>
-            </w:tcBorders>
-          </w:tcPr>
-          <w:p>
-            <w:r>
-              <w:rPr>
-                <w:sz w:val="17"/>
-              </w:rPr>
-              <w:t>sound.js</w:t>
-            </w:r>
-          </w:p>
-        </w:tc>
-        <w:tc>
-          <w:tcPr>
-            <w:tcW w:type="dxa" w:w="5256"/>
-            <w:vAlign w:val="center"/>
-            <w:shd w:fill="F3F4F6"/>
-            <w:tcBorders>
-              <w:top w:val="single" w:sz="4" w:color="D9D9D9"/>
-              <w:left w:val="single" w:sz="4" w:color="D9D9D9"/>
-              <w:bottom w:val="single" w:sz="4" w:color="D9D9D9"/>
-              <w:right w:val="single" w:sz="4" w:color="D9D9D9"/>
-              <w:insideH w:val="single" w:sz="4" w:color="D9D9D9"/>
-              <w:insideV w:val="single" w:sz="4" w:color="D9D9D9"/>
-            </w:tcBorders>
-          </w:tcPr>
-          <w:p>
-            <w:r>
-              <w:rPr>
-                <w:sz w:val="17"/>
-              </w:rPr>
-              <w:t>Quiet interface click feedback</w:t>
-            </w:r>
-          </w:p>
-        </w:tc>
-        <w:tc>
-          <w:tcPr>
-            <w:tcW w:type="dxa" w:w="2808"/>
-            <w:vAlign w:val="center"/>
-            <w:shd w:fill="F3F4F6"/>
-            <w:tcBorders>
-              <w:top w:val="single" w:sz="4" w:color="D9D9D9"/>
-              <w:left w:val="single" w:sz="4" w:color="D9D9D9"/>
-              <w:bottom w:val="single" w:sz="4" w:color="D9D9D9"/>
-              <w:right w:val="single" w:sz="4" w:color="D9D9D9"/>
-              <w:insideH w:val="single" w:sz="4" w:color="D9D9D9"/>
-              <w:insideV w:val="single" w:sz="4" w:color="D9D9D9"/>
-            </w:tcBorders>
-          </w:tcPr>
-          <w:p>
-            <w:r>
-              <w:rPr>
-                <w:sz w:val="17"/>
-              </w:rPr>
-              <w:t>lines 8, 20-42</w:t>
-            </w:r>
-          </w:p>
-        </w:tc>
-      </w:tr>
-      <w:tr>
-        <w:tc>
-          <w:tcPr>
-            <w:tcW w:type="dxa" w:w="1944"/>
-            <w:vAlign w:val="center"/>
-            <w:tcBorders>
-              <w:top w:val="single" w:sz="4" w:color="D9D9D9"/>
-              <w:left w:val="single" w:sz="4" w:color="D9D9D9"/>
-              <w:bottom w:val="single" w:sz="4" w:color="D9D9D9"/>
-              <w:right w:val="single" w:sz="4" w:color="D9D9D9"/>
-              <w:insideH w:val="single" w:sz="4" w:color="D9D9D9"/>
-              <w:insideV w:val="single" w:sz="4" w:color="D9D9D9"/>
-            </w:tcBorders>
-          </w:tcPr>
-          <w:p>
-            <w:r>
-              <w:rPr>
-                <w:sz w:val="17"/>
-              </w:rPr>
-              <w:t>site.css</w:t>
-            </w:r>
-          </w:p>
-        </w:tc>
-        <w:tc>
-          <w:tcPr>
-            <w:tcW w:type="dxa" w:w="5256"/>
-            <w:vAlign w:val="center"/>
-            <w:tcBorders>
-              <w:top w:val="single" w:sz="4" w:color="D9D9D9"/>
-              <w:left w:val="single" w:sz="4" w:color="D9D9D9"/>
-              <w:bottom w:val="single" w:sz="4" w:color="D9D9D9"/>
-              <w:right w:val="single" w:sz="4" w:color="D9D9D9"/>
-              <w:insideH w:val="single" w:sz="4" w:color="D9D9D9"/>
-              <w:insideV w:val="single" w:sz="4" w:color="D9D9D9"/>
-            </w:tcBorders>
-          </w:tcPr>
-          <w:p>
-            <w:r>
-              <w:rPr>
-                <w:sz w:val="17"/>
-              </w:rPr>
-              <w:t>Shared controls, dialogs, focus, responsive rules</w:t>
-            </w:r>
-          </w:p>
-        </w:tc>
-        <w:tc>
-          <w:tcPr>
-            <w:tcW w:type="dxa" w:w="2808"/>
-            <w:vAlign w:val="center"/>
-            <w:tcBorders>
-              <w:top w:val="single" w:sz="4" w:color="D9D9D9"/>
-              <w:left w:val="single" w:sz="4" w:color="D9D9D9"/>
-              <w:bottom w:val="single" w:sz="4" w:color="D9D9D9"/>
-              <w:right w:val="single" w:sz="4" w:color="D9D9D9"/>
-              <w:insideH w:val="single" w:sz="4" w:color="D9D9D9"/>
-              <w:insideV w:val="single" w:sz="4" w:color="D9D9D9"/>
-            </w:tcBorders>
-          </w:tcPr>
-          <w:p>
-            <w:r>
-              <w:rPr>
-                <w:sz w:val="17"/>
-              </w:rPr>
-              <w:t>lines 106-124, 889-904</w:t>
-            </w:r>
-          </w:p>
-        </w:tc>
-      </w:tr>
-      <w:tr>
-        <w:tc>
-          <w:tcPr>
-            <w:tcW w:type="dxa" w:w="1944"/>
-            <w:vAlign w:val="center"/>
-            <w:shd w:fill="F3F4F6"/>
-            <w:tcBorders>
-              <w:top w:val="single" w:sz="4" w:color="D9D9D9"/>
-              <w:left w:val="single" w:sz="4" w:color="D9D9D9"/>
-              <w:bottom w:val="single" w:sz="4" w:color="D9D9D9"/>
-              <w:right w:val="single" w:sz="4" w:color="D9D9D9"/>
-              <w:insideH w:val="single" w:sz="4" w:color="D9D9D9"/>
-              <w:insideV w:val="single" w:sz="4" w:color="D9D9D9"/>
-            </w:tcBorders>
-          </w:tcPr>
-          <w:p>
-            <w:r>
-              <w:rPr>
-                <w:sz w:val="17"/>
-              </w:rPr>
-              <w:t>styles.css</w:t>
-            </w:r>
-          </w:p>
-        </w:tc>
-        <w:tc>
-          <w:tcPr>
-            <w:tcW w:type="dxa" w:w="5256"/>
-            <w:vAlign w:val="center"/>
-            <w:shd w:fill="F3F4F6"/>
-            <w:tcBorders>
-              <w:top w:val="single" w:sz="4" w:color="D9D9D9"/>
-              <w:left w:val="single" w:sz="4" w:color="D9D9D9"/>
-              <w:bottom w:val="single" w:sz="4" w:color="D9D9D9"/>
-              <w:right w:val="single" w:sz="4" w:color="D9D9D9"/>
-              <w:insideH w:val="single" w:sz="4" w:color="D9D9D9"/>
-              <w:insideV w:val="single" w:sz="4" w:color="D9D9D9"/>
-            </w:tcBorders>
-          </w:tcPr>
-          <w:p>
-            <w:r>
-              <w:rPr>
-                <w:sz w:val="17"/>
-              </w:rPr>
-              <w:t>Homepage cards and responsive layout</w:t>
-            </w:r>
-          </w:p>
-        </w:tc>
-        <w:tc>
-          <w:tcPr>
-            <w:tcW w:type="dxa" w:w="2808"/>
-            <w:vAlign w:val="center"/>
-            <w:shd w:fill="F3F4F6"/>
-            <w:tcBorders>
-              <w:top w:val="single" w:sz="4" w:color="D9D9D9"/>
-              <w:left w:val="single" w:sz="4" w:color="D9D9D9"/>
-              <w:bottom w:val="single" w:sz="4" w:color="D9D9D9"/>
-              <w:right w:val="single" w:sz="4" w:color="D9D9D9"/>
-              <w:insideH w:val="single" w:sz="4" w:color="D9D9D9"/>
-              <w:insideV w:val="single" w:sz="4" w:color="D9D9D9"/>
-            </w:tcBorders>
-          </w:tcPr>
-          <w:p>
-            <w:r>
-              <w:rPr>
-                <w:sz w:val="17"/>
-              </w:rPr>
-              <w:t>lines 613-644</w:t>
-            </w:r>
-          </w:p>
-        </w:tc>
-      </w:tr>
-      <w:tr>
-        <w:tc>
-          <w:tcPr>
-            <w:tcW w:type="dxa" w:w="1944"/>
-            <w:vAlign w:val="center"/>
-            <w:tcBorders>
-              <w:top w:val="single" w:sz="4" w:color="D9D9D9"/>
-              <w:left w:val="single" w:sz="4" w:color="D9D9D9"/>
-              <w:bottom w:val="single" w:sz="4" w:color="D9D9D9"/>
-              <w:right w:val="single" w:sz="4" w:color="D9D9D9"/>
-              <w:insideH w:val="single" w:sz="4" w:color="D9D9D9"/>
-              <w:insideV w:val="single" w:sz="4" w:color="D9D9D9"/>
-            </w:tcBorders>
-          </w:tcPr>
-          <w:p>
-            <w:r>
-              <w:rPr>
-                <w:sz w:val="17"/>
-              </w:rPr>
-              <w:t>about.html</w:t>
-            </w:r>
-          </w:p>
-        </w:tc>
-        <w:tc>
-          <w:tcPr>
-            <w:tcW w:type="dxa" w:w="5256"/>
-            <w:vAlign w:val="center"/>
-            <w:tcBorders>
-              <w:top w:val="single" w:sz="4" w:color="D9D9D9"/>
-              <w:left w:val="single" w:sz="4" w:color="D9D9D9"/>
-              <w:bottom w:val="single" w:sz="4" w:color="D9D9D9"/>
-              <w:right w:val="single" w:sz="4" w:color="D9D9D9"/>
-              <w:insideH w:val="single" w:sz="4" w:color="D9D9D9"/>
-              <w:insideV w:val="single" w:sz="4" w:color="D9D9D9"/>
-            </w:tcBorders>
-          </w:tcPr>
-          <w:p>
-            <w:r>
-              <w:rPr>
-                <w:sz w:val="17"/>
-              </w:rPr>
-              <w:t>Limits, privacy, and unsupported claims</w:t>
-            </w:r>
-          </w:p>
-        </w:tc>
-        <w:tc>
-          <w:tcPr>
-            <w:tcW w:type="dxa" w:w="2808"/>
-            <w:vAlign w:val="center"/>
-            <w:tcBorders>
-              <w:top w:val="single" w:sz="4" w:color="D9D9D9"/>
-              <w:left w:val="single" w:sz="4" w:color="D9D9D9"/>
-              <w:bottom w:val="single" w:sz="4" w:color="D9D9D9"/>
-              <w:right w:val="single" w:sz="4" w:color="D9D9D9"/>
-              <w:insideH w:val="single" w:sz="4" w:color="D9D9D9"/>
-              <w:insideV w:val="single" w:sz="4" w:color="D9D9D9"/>
-            </w:tcBorders>
-          </w:tcPr>
-          <w:p>
-            <w:r>
-              <w:rPr>
-                <w:sz w:val="17"/>
-              </w:rPr>
-              <w:t>page structure</w:t>
-            </w:r>
-          </w:p>
-        </w:tc>
-      </w:tr>
-      <w:tr>
-        <w:tc>
-          <w:tcPr>
-            <w:tcW w:type="dxa" w:w="1944"/>
-            <w:vAlign w:val="center"/>
-            <w:shd w:fill="F3F4F6"/>
-            <w:tcBorders>
-              <w:top w:val="single" w:sz="4" w:color="D9D9D9"/>
-              <w:left w:val="single" w:sz="4" w:color="D9D9D9"/>
-              <w:bottom w:val="single" w:sz="4" w:color="D9D9D9"/>
-              <w:right w:val="single" w:sz="4" w:color="D9D9D9"/>
-              <w:insideH w:val="single" w:sz="4" w:color="D9D9D9"/>
-              <w:insideV w:val="single" w:sz="4" w:color="D9D9D9"/>
-            </w:tcBorders>
-          </w:tcPr>
-          <w:p>
-            <w:r>
-              <w:rPr>
-                <w:sz w:val="17"/>
-              </w:rPr>
-              <w:t>risk-zones.html</w:t>
-            </w:r>
-          </w:p>
-        </w:tc>
-        <w:tc>
-          <w:tcPr>
-            <w:tcW w:type="dxa" w:w="5256"/>
-            <w:vAlign w:val="center"/>
-            <w:shd w:fill="F3F4F6"/>
-            <w:tcBorders>
-              <w:top w:val="single" w:sz="4" w:color="D9D9D9"/>
-              <w:left w:val="single" w:sz="4" w:color="D9D9D9"/>
-              <w:bottom w:val="single" w:sz="4" w:color="D9D9D9"/>
-              <w:right w:val="single" w:sz="4" w:color="D9D9D9"/>
-              <w:insideH w:val="single" w:sz="4" w:color="D9D9D9"/>
-              <w:insideV w:val="single" w:sz="4" w:color="D9D9D9"/>
-            </w:tcBorders>
-          </w:tcPr>
-          <w:p>
-            <w:r>
-              <w:rPr>
-                <w:sz w:val="17"/>
-              </w:rPr>
-              <w:t>Privacy-thresholded planning map</w:t>
-            </w:r>
-          </w:p>
-        </w:tc>
-        <w:tc>
-          <w:tcPr>
-            <w:tcW w:type="dxa" w:w="2808"/>
-            <w:vAlign w:val="center"/>
-            <w:shd w:fill="F3F4F6"/>
-            <w:tcBorders>
-              <w:top w:val="single" w:sz="4" w:color="D9D9D9"/>
-              <w:left w:val="single" w:sz="4" w:color="D9D9D9"/>
-              <w:bottom w:val="single" w:sz="4" w:color="D9D9D9"/>
-              <w:right w:val="single" w:sz="4" w:color="D9D9D9"/>
-              <w:insideH w:val="single" w:sz="4" w:color="D9D9D9"/>
-              <w:insideV w:val="single" w:sz="4" w:color="D9D9D9"/>
-            </w:tcBorders>
-          </w:tcPr>
-          <w:p>
-            <w:r>
-              <w:rPr>
-                <w:sz w:val="17"/>
-              </w:rPr>
-              <w:t>inline script</w:t>
-            </w:r>
-          </w:p>
-        </w:tc>
-      </w:tr>
-      <w:tr>
-        <w:tc>
-          <w:tcPr>
-            <w:tcW w:type="dxa" w:w="1944"/>
-            <w:vAlign w:val="center"/>
-            <w:tcBorders>
-              <w:top w:val="single" w:sz="4" w:color="D9D9D9"/>
-              <w:left w:val="single" w:sz="4" w:color="D9D9D9"/>
-              <w:bottom w:val="single" w:sz="4" w:color="D9D9D9"/>
-              <w:right w:val="single" w:sz="4" w:color="D9D9D9"/>
-              <w:insideH w:val="single" w:sz="4" w:color="D9D9D9"/>
-              <w:insideV w:val="single" w:sz="4" w:color="D9D9D9"/>
-            </w:tcBorders>
-          </w:tcPr>
-          <w:p>
-            <w:r>
-              <w:rPr>
-                <w:sz w:val="17"/>
-              </w:rPr>
-              <w:t>safewalk.html</w:t>
-            </w:r>
-          </w:p>
-        </w:tc>
-        <w:tc>
-          <w:tcPr>
-            <w:tcW w:type="dxa" w:w="5256"/>
-            <w:vAlign w:val="center"/>
-            <w:tcBorders>
-              <w:top w:val="single" w:sz="4" w:color="D9D9D9"/>
-              <w:left w:val="single" w:sz="4" w:color="D9D9D9"/>
-              <w:bottom w:val="single" w:sz="4" w:color="D9D9D9"/>
-              <w:right w:val="single" w:sz="4" w:color="D9D9D9"/>
-              <w:insideH w:val="single" w:sz="4" w:color="D9D9D9"/>
-              <w:insideV w:val="single" w:sz="4" w:color="D9D9D9"/>
-            </w:tcBorders>
-          </w:tcPr>
-          <w:p>
-            <w:r>
-              <w:rPr>
-                <w:sz w:val="17"/>
-              </w:rPr>
-              <w:t>Timed check-in and nearby-care search</w:t>
-            </w:r>
-          </w:p>
-        </w:tc>
-        <w:tc>
-          <w:tcPr>
-            <w:tcW w:type="dxa" w:w="2808"/>
-            <w:vAlign w:val="center"/>
-            <w:tcBorders>
-              <w:top w:val="single" w:sz="4" w:color="D9D9D9"/>
-              <w:left w:val="single" w:sz="4" w:color="D9D9D9"/>
-              <w:bottom w:val="single" w:sz="4" w:color="D9D9D9"/>
-              <w:right w:val="single" w:sz="4" w:color="D9D9D9"/>
-              <w:insideH w:val="single" w:sz="4" w:color="D9D9D9"/>
-              <w:insideV w:val="single" w:sz="4" w:color="D9D9D9"/>
-            </w:tcBorders>
-          </w:tcPr>
-          <w:p>
-            <w:r>
-              <w:rPr>
-                <w:sz w:val="17"/>
-              </w:rPr>
-              <w:t>inline script</w:t>
-            </w:r>
-          </w:p>
-        </w:tc>
-      </w:tr>
-      <w:tr>
-        <w:tc>
-          <w:tcPr>
-            <w:tcW w:type="dxa" w:w="1944"/>
-            <w:vAlign w:val="center"/>
-            <w:shd w:fill="F3F4F6"/>
-            <w:tcBorders>
-              <w:top w:val="single" w:sz="4" w:color="D9D9D9"/>
-              <w:left w:val="single" w:sz="4" w:color="D9D9D9"/>
-              <w:bottom w:val="single" w:sz="4" w:color="D9D9D9"/>
-              <w:right w:val="single" w:sz="4" w:color="D9D9D9"/>
-              <w:insideH w:val="single" w:sz="4" w:color="D9D9D9"/>
-              <w:insideV w:val="single" w:sz="4" w:color="D9D9D9"/>
-            </w:tcBorders>
-          </w:tcPr>
-          <w:p>
-            <w:r>
-              <w:rPr>
-                <w:sz w:val="17"/>
-              </w:rPr>
-              <w:t>shelters.html</w:t>
-            </w:r>
-          </w:p>
-        </w:tc>
-        <w:tc>
-          <w:tcPr>
-            <w:tcW w:type="dxa" w:w="5256"/>
-            <w:vAlign w:val="center"/>
-            <w:shd w:fill="F3F4F6"/>
-            <w:tcBorders>
-              <w:top w:val="single" w:sz="4" w:color="D9D9D9"/>
-              <w:left w:val="single" w:sz="4" w:color="D9D9D9"/>
-              <w:bottom w:val="single" w:sz="4" w:color="D9D9D9"/>
-              <w:right w:val="single" w:sz="4" w:color="D9D9D9"/>
-              <w:insideH w:val="single" w:sz="4" w:color="D9D9D9"/>
-              <w:insideV w:val="single" w:sz="4" w:color="D9D9D9"/>
-            </w:tcBorders>
-          </w:tcPr>
-          <w:p>
-            <w:r>
-              <w:rPr>
-                <w:sz w:val="17"/>
-              </w:rPr>
-              <w:t>Nearby public-safety resources</w:t>
-            </w:r>
-          </w:p>
-        </w:tc>
-        <w:tc>
-          <w:tcPr>
-            <w:tcW w:type="dxa" w:w="2808"/>
-            <w:vAlign w:val="center"/>
-            <w:shd w:fill="F3F4F6"/>
-            <w:tcBorders>
-              <w:top w:val="single" w:sz="4" w:color="D9D9D9"/>
-              <w:left w:val="single" w:sz="4" w:color="D9D9D9"/>
-              <w:bottom w:val="single" w:sz="4" w:color="D9D9D9"/>
-              <w:right w:val="single" w:sz="4" w:color="D9D9D9"/>
-              <w:insideH w:val="single" w:sz="4" w:color="D9D9D9"/>
-              <w:insideV w:val="single" w:sz="4" w:color="D9D9D9"/>
-            </w:tcBorders>
-          </w:tcPr>
-          <w:p>
-            <w:r>
-              <w:rPr>
-                <w:sz w:val="17"/>
-              </w:rPr>
-              <w:t>inline script</w:t>
-            </w:r>
-          </w:p>
-        </w:tc>
-      </w:tr>
-      <w:tr>
-        <w:tc>
-          <w:tcPr>
-            <w:tcW w:type="dxa" w:w="1944"/>
-            <w:vAlign w:val="center"/>
-            <w:tcBorders>
-              <w:top w:val="single" w:sz="4" w:color="D9D9D9"/>
-              <w:left w:val="single" w:sz="4" w:color="D9D9D9"/>
-              <w:bottom w:val="single" w:sz="4" w:color="D9D9D9"/>
-              <w:right w:val="single" w:sz="4" w:color="D9D9D9"/>
-              <w:insideH w:val="single" w:sz="4" w:color="D9D9D9"/>
-              <w:insideV w:val="single" w:sz="4" w:color="D9D9D9"/>
-            </w:tcBorders>
-          </w:tcPr>
-          <w:p>
-            <w:r>
-              <w:rPr>
-                <w:sz w:val="17"/>
-              </w:rPr>
-              <w:t>hazard.html</w:t>
-            </w:r>
-          </w:p>
-        </w:tc>
-        <w:tc>
-          <w:tcPr>
-            <w:tcW w:type="dxa" w:w="5256"/>
-            <w:vAlign w:val="center"/>
-            <w:tcBorders>
-              <w:top w:val="single" w:sz="4" w:color="D9D9D9"/>
-              <w:left w:val="single" w:sz="4" w:color="D9D9D9"/>
-              <w:bottom w:val="single" w:sz="4" w:color="D9D9D9"/>
-              <w:right w:val="single" w:sz="4" w:color="D9D9D9"/>
-              <w:insideH w:val="single" w:sz="4" w:color="D9D9D9"/>
-              <w:insideV w:val="single" w:sz="4" w:color="D9D9D9"/>
-            </w:tcBorders>
-          </w:tcPr>
-          <w:p>
-            <w:r>
-              <w:rPr>
-                <w:sz w:val="17"/>
-              </w:rPr>
-              <w:t>Community hazard reporting and merging</w:t>
-            </w:r>
-          </w:p>
-        </w:tc>
-        <w:tc>
-          <w:tcPr>
-            <w:tcW w:type="dxa" w:w="2808"/>
-            <w:vAlign w:val="center"/>
-            <w:tcBorders>
-              <w:top w:val="single" w:sz="4" w:color="D9D9D9"/>
-              <w:left w:val="single" w:sz="4" w:color="D9D9D9"/>
-              <w:bottom w:val="single" w:sz="4" w:color="D9D9D9"/>
-              <w:right w:val="single" w:sz="4" w:color="D9D9D9"/>
-              <w:insideH w:val="single" w:sz="4" w:color="D9D9D9"/>
-              <w:insideV w:val="single" w:sz="4" w:color="D9D9D9"/>
-            </w:tcBorders>
-          </w:tcPr>
-          <w:p>
-            <w:r>
-              <w:rPr>
-                <w:sz w:val="17"/>
-              </w:rPr>
-              <w:t>inline script</w:t>
-            </w:r>
-          </w:p>
-        </w:tc>
-      </w:tr>
-      <w:tr>
-        <w:tc>
-          <w:tcPr>
-            <w:tcW w:type="dxa" w:w="1944"/>
-            <w:vAlign w:val="center"/>
-            <w:shd w:fill="F3F4F6"/>
-            <w:tcBorders>
-              <w:top w:val="single" w:sz="4" w:color="D9D9D9"/>
-              <w:left w:val="single" w:sz="4" w:color="D9D9D9"/>
-              <w:bottom w:val="single" w:sz="4" w:color="D9D9D9"/>
-              <w:right w:val="single" w:sz="4" w:color="D9D9D9"/>
-              <w:insideH w:val="single" w:sz="4" w:color="D9D9D9"/>
-              <w:insideV w:val="single" w:sz="4" w:color="D9D9D9"/>
-            </w:tcBorders>
-          </w:tcPr>
-          <w:p>
-            <w:r>
-              <w:rPr>
-                <w:sz w:val="17"/>
-              </w:rPr>
-              <w:t>script.js</w:t>
-            </w:r>
-          </w:p>
-        </w:tc>
-        <w:tc>
-          <w:tcPr>
-            <w:tcW w:type="dxa" w:w="5256"/>
-            <w:vAlign w:val="center"/>
-            <w:shd w:fill="F3F4F6"/>
-            <w:tcBorders>
-              <w:top w:val="single" w:sz="4" w:color="D9D9D9"/>
-              <w:left w:val="single" w:sz="4" w:color="D9D9D9"/>
-              <w:bottom w:val="single" w:sz="4" w:color="D9D9D9"/>
-              <w:right w:val="single" w:sz="4" w:color="D9D9D9"/>
-              <w:insideH w:val="single" w:sz="4" w:color="D9D9D9"/>
-              <w:insideV w:val="single" w:sz="4" w:color="D9D9D9"/>
-            </w:tcBorders>
-          </w:tcPr>
-          <w:p>
-            <w:r>
-              <w:rPr>
-                <w:sz w:val="17"/>
-              </w:rPr>
-              <w:t>Legacy illustrative city-data renderer</w:t>
-            </w:r>
-          </w:p>
-        </w:tc>
-        <w:tc>
-          <w:tcPr>
-            <w:tcW w:type="dxa" w:w="2808"/>
-            <w:vAlign w:val="center"/>
-            <w:shd w:fill="F3F4F6"/>
-            <w:tcBorders>
-              <w:top w:val="single" w:sz="4" w:color="D9D9D9"/>
-              <w:left w:val="single" w:sz="4" w:color="D9D9D9"/>
-              <w:bottom w:val="single" w:sz="4" w:color="D9D9D9"/>
-              <w:right w:val="single" w:sz="4" w:color="D9D9D9"/>
-              <w:insideH w:val="single" w:sz="4" w:color="D9D9D9"/>
-              <w:insideV w:val="single" w:sz="4" w:color="D9D9D9"/>
-            </w:tcBorders>
-          </w:tcPr>
-          <w:p>
-            <w:r>
-              <w:rPr>
-                <w:sz w:val="17"/>
-              </w:rPr>
-              <w:t>data and render functions</w:t>
-            </w:r>
-          </w:p>
-        </w:tc>
-      </w:tr>
-    </w:tbl>
+    <w:p>
+      <w:pPr>
+        <w:pStyle w:val="ListBullet"/>
+        <w:keepLines/>
+      </w:pPr>
+      <w:r>
+        <w:rPr>
+          <w:b/>
+        </w:rPr>
+        <w:t xml:space="preserve">warning-alarm.mp3. </w:t>
+      </w:r>
+      <w:r>
+        <w:t>This file contains the loud warning recording used after a detected drop. As a binary audio file, it has no readable source-code line number.</w:t>
+      </w:r>
+    </w:p>
+    <w:p>
+      <w:pPr>
+        <w:pStyle w:val="ListBullet"/>
+        <w:keepLines/>
+      </w:pPr>
+      <w:r>
+        <w:rPr>
+          <w:b/>
+        </w:rPr>
+        <w:t xml:space="preserve">documentation/Lifeline_Prompt_Aligned_Code_Presentation.docx. </w:t>
+      </w:r>
+      <w:r>
+        <w:t>This file stores the earlier prompt-aligned presentation. A DOCX is a packaged binary document, so it has pages and paragraphs rather than source lines.</w:t>
+      </w:r>
+    </w:p>
+    <w:p>
+      <w:pPr>
+        <w:pStyle w:val="ListBullet"/>
+        <w:keepLines/>
+      </w:pPr>
+      <w:r>
+        <w:rPr>
+          <w:b/>
+        </w:rPr>
+        <w:t xml:space="preserve">documentation/Lifeline_Two_Minute_Code_Presentation.docx. </w:t>
+      </w:r>
+      <w:r>
+        <w:t>This file stores the earlier two-minute presentation. A DOCX is a packaged binary document, so it has pages and paragraphs rather than source lines.</w:t>
+      </w:r>
+    </w:p>
+    <w:p>
+      <w:pPr>
+        <w:pStyle w:val="ListBullet"/>
+        <w:keepLines/>
+      </w:pPr>
+      <w:r>
+        <w:rPr>
+          <w:b/>
+        </w:rPr>
+        <w:t xml:space="preserve">documentation/PulseGuard_Code_Presentation.docx. </w:t>
+      </w:r>
+      <w:r>
+        <w:t>This file stores the current presentation deliverable. A DOCX is a packaged binary document, so it has pages and paragraphs rather than source lines.</w:t>
+      </w:r>
+    </w:p>
     <w:sectPr>
       <w:pgSz w:w="12240" w:h="15840"/>
-      <w:pgMar w:top="893" w:right="1037" w:bottom="893" w:left="1037" w:header="720" w:footer="720" w:gutter="0"/>
+      <w:pgMar w:top="792" w:right="1123" w:bottom="792" w:left="1123" w:header="720" w:footer="720" w:gutter="0"/>
       <w:cols w:space="720"/>
       <w:docGrid w:linePitch="360"/>
     </w:sectPr>
@@ -1538,7 +811,7 @@
     <w:rPr>
       <w:rFonts w:ascii="Aptos" w:hAnsi="Aptos"/>
       <w:color w:val="202428"/>
-      <w:sz w:val="21"/>
+      <w:sz w:val="20"/>
     </w:rPr>
   </w:style>
   <w:style w:type="paragraph" w:styleId="Header">
@@ -1624,10 +897,10 @@
       <w:outlineLvl w:val="1"/>
     </w:pPr>
     <w:rPr>
-      <w:rFonts w:asciiTheme="majorHAnsi" w:eastAsiaTheme="majorEastAsia" w:hAnsiTheme="majorHAnsi" w:cstheme="majorBidi" w:ascii="Georgia" w:hAnsi="Georgia"/>
-      <w:b w:val="0"/>
+      <w:rFonts w:asciiTheme="majorHAnsi" w:eastAsiaTheme="majorEastAsia" w:hAnsiTheme="majorHAnsi" w:cstheme="majorBidi"/>
+      <w:b/>
       <w:bCs/>
-      <w:color w:val="000000"/>
+      <w:color w:val="4F81BD" w:themeColor="accent1"/>
       <w:sz w:val="26"/>
       <w:szCs w:val="26"/>
     </w:rPr>

</xml_diff>

<commit_message>
Add 95-second code presentation script
</commit_message>
<xml_diff>
--- a/documentation/PulseGuard_Code_Presentation.docx
+++ b/documentation/PulseGuard_Code_Presentation.docx
@@ -7,12 +7,236 @@
         <w:pStyle w:val="Title"/>
       </w:pPr>
       <w:r>
-        <w:t>PulseGuard Repository File Presentation</w:t>
+        <w:t>PulseGuard Code Presentation</w:t>
       </w:r>
     </w:p>
     <w:p>
       <w:r>
-        <w:t>Two to three presentation sentences for every file tracked in GitHub</w:t>
+        <w:t>Approximately one minute thirty five seconds</w:t>
+      </w:r>
+    </w:p>
+    <w:p>
+      <w:pPr>
+        <w:pStyle w:val="ListBullet"/>
+        <w:keepLines/>
+        <w:spacing w:after="100"/>
+      </w:pPr>
+      <w:r>
+        <w:rPr>
+          <w:b/>
+        </w:rPr>
+        <w:t>index.html</w:t>
+      </w:r>
+      <w:r>
+        <w:t xml:space="preserve"> shows safety choices. Line 41, "Open drop tracker", shows that the homepage exposes the tracker.</w:t>
+      </w:r>
+    </w:p>
+    <w:p>
+      <w:pPr>
+        <w:pStyle w:val="ListBullet"/>
+        <w:keepLines/>
+        <w:spacing w:after="100"/>
+      </w:pPr>
+      <w:r>
+        <w:rPr>
+          <w:b/>
+        </w:rPr>
+        <w:t>fall-detection.html</w:t>
+      </w:r>
+      <w:r>
+        <w:t xml:space="preserve"> holds tracker controls. Line 75, "Start tracker", shows that the user starts monitoring.</w:t>
+      </w:r>
+    </w:p>
+    <w:p>
+      <w:pPr>
+        <w:pStyle w:val="ListBullet"/>
+        <w:keepLines/>
+        <w:spacing w:after="100"/>
+      </w:pPr>
+      <w:r>
+        <w:rPr>
+          <w:b/>
+        </w:rPr>
+        <w:t>app.js</w:t>
+      </w:r>
+      <w:r>
+        <w:t xml:space="preserve"> runs detection and escalation. Line 22, "const ARM_DELAY_S = 5;", shows that the sensor waits five seconds before arming.</w:t>
+      </w:r>
+    </w:p>
+    <w:p>
+      <w:pPr>
+        <w:pStyle w:val="ListBullet"/>
+        <w:keepLines/>
+        <w:spacing w:after="100"/>
+      </w:pPr>
+      <w:r>
+        <w:rPr>
+          <w:b/>
+        </w:rPr>
+        <w:t>auth.js</w:t>
+      </w:r>
+      <w:r>
+        <w:t xml:space="preserve"> controls accounts. Line 7, "const authDialog = document.querySelector("#auth-dialog");", shows that JavaScript selects the account dialog.</w:t>
+      </w:r>
+    </w:p>
+    <w:p>
+      <w:pPr>
+        <w:pStyle w:val="ListBullet"/>
+        <w:keepLines/>
+        <w:spacing w:after="100"/>
+      </w:pPr>
+      <w:r>
+        <w:rPr>
+          <w:b/>
+        </w:rPr>
+        <w:t>nav.js</w:t>
+      </w:r>
+      <w:r>
+        <w:t xml:space="preserve"> creates shared navigation. Line 12, "const SITE = [", shows that all page links begin in one central structure.</w:t>
+      </w:r>
+    </w:p>
+    <w:p>
+      <w:pPr>
+        <w:pStyle w:val="ListBullet"/>
+        <w:keepLines/>
+        <w:spacing w:after="100"/>
+      </w:pPr>
+      <w:r>
+        <w:rPr>
+          <w:b/>
+        </w:rPr>
+        <w:t>sound.js</w:t>
+      </w:r>
+      <w:r>
+        <w:t xml:space="preserve"> handles ordinary interface audio. Line 9, "const SOUND_FILE = "click.mp3";", shows that click feedback stays separate from the warning alarm.</w:t>
+      </w:r>
+    </w:p>
+    <w:p>
+      <w:pPr>
+        <w:pStyle w:val="ListBullet"/>
+        <w:keepLines/>
+        <w:spacing w:after="100"/>
+      </w:pPr>
+      <w:r>
+        <w:rPr>
+          <w:b/>
+        </w:rPr>
+        <w:t>site.css</w:t>
+      </w:r>
+      <w:r>
+        <w:t xml:space="preserve"> defines shared visuals. Line 1074, "--bg: #101418;", shows that pages reuse one dark background token.</w:t>
+      </w:r>
+    </w:p>
+    <w:p>
+      <w:pPr>
+        <w:pStyle w:val="ListBullet"/>
+        <w:keepLines/>
+        <w:spacing w:after="100"/>
+      </w:pPr>
+      <w:r>
+        <w:rPr>
+          <w:b/>
+        </w:rPr>
+        <w:t>styles.css</w:t>
+      </w:r>
+      <w:r>
+        <w:t xml:space="preserve"> styles the homepage layout. Line 785, ".choice-grid {", shows that the emergency choices use a dedicated grid.</w:t>
+      </w:r>
+    </w:p>
+    <w:p>
+      <w:pPr>
+        <w:pStyle w:val="ListBullet"/>
+        <w:keepLines/>
+        <w:spacing w:after="100"/>
+      </w:pPr>
+      <w:r>
+        <w:rPr>
+          <w:b/>
+        </w:rPr>
+        <w:t>about.html</w:t>
+      </w:r>
+      <w:r>
+        <w:t xml:space="preserve"> explains limits and privacy. Line 44, "No breathing or pulse sensing.", shows that the site states a sensor limitation openly.</w:t>
+      </w:r>
+    </w:p>
+    <w:p>
+      <w:pPr>
+        <w:pStyle w:val="ListBullet"/>
+        <w:keepLines/>
+        <w:spacing w:after="100"/>
+      </w:pPr>
+      <w:r>
+        <w:rPr>
+          <w:b/>
+        </w:rPr>
+        <w:t>risk-zones.html</w:t>
+      </w:r>
+      <w:r>
+        <w:t xml:space="preserve"> demonstrates privacy-aware planning. Line 124, "const MIN_CALLS = 5;", shows that small groups are hidden before a zone is drawn.</w:t>
+      </w:r>
+    </w:p>
+    <w:p>
+      <w:pPr>
+        <w:pStyle w:val="ListBullet"/>
+        <w:keepLines/>
+        <w:spacing w:after="100"/>
+      </w:pPr>
+      <w:r>
+        <w:rPr>
+          <w:b/>
+        </w:rPr>
+        <w:t>safewalk.html</w:t>
+      </w:r>
+      <w:r>
+        <w:t xml:space="preserve"> adds a timed check-in. Line 176, "const GRACE_S = 300;", shows that late status includes a five-minute grace period.</w:t>
+      </w:r>
+    </w:p>
+    <w:p>
+      <w:pPr>
+        <w:pStyle w:val="ListBullet"/>
+        <w:keepLines/>
+        <w:spacing w:after="100"/>
+      </w:pPr>
+      <w:r>
+        <w:rPr>
+          <w:b/>
+        </w:rPr>
+        <w:t>shelters.html</w:t>
+      </w:r>
+      <w:r>
+        <w:t xml:space="preserve"> ranks nearby resources. Line 89, "const NEAREST = 5;", shows that results are limited to five useful locations.</w:t>
+      </w:r>
+    </w:p>
+    <w:p>
+      <w:pPr>
+        <w:pStyle w:val="ListBullet"/>
+        <w:keepLines/>
+        <w:spacing w:after="100"/>
+      </w:pPr>
+      <w:r>
+        <w:rPr>
+          <w:b/>
+        </w:rPr>
+        <w:t>hazard.html</w:t>
+      </w:r>
+      <w:r>
+        <w:t xml:space="preserve"> merges nearby hazard reports. Line 88, "const MERGE_M = 60;", shows that reports within sixty metres can become one issue.</w:t>
+      </w:r>
+    </w:p>
+    <w:p>
+      <w:pPr>
+        <w:pStyle w:val="ListBullet"/>
+        <w:keepLines/>
+        <w:spacing w:after="100"/>
+      </w:pPr>
+      <w:r>
+        <w:rPr>
+          <w:b/>
+        </w:rPr>
+        <w:t>script.js</w:t>
+      </w:r>
+      <w:r>
+        <w:t xml:space="preserve"> renders illustrative city data. Line 24, "const CITIES = [", shows that the older dashboard reads from one defined dataset.</w:t>
       </w:r>
     </w:p>
     <w:p>
@@ -20,421 +244,15 @@
         <w:rPr>
           <w:b/>
         </w:rPr>
-        <w:t xml:space="preserve">How to use this document  </w:t>
+        <w:t xml:space="preserve">Timing  </w:t>
       </w:r>
       <w:r>
-        <w:t>Each bullet identifies a file's feature, quotes an exact current line when the file is readable text, and explains what that line proves about the implementation.</w:t>
-      </w:r>
-    </w:p>
-    <w:p>
-      <w:pPr>
-        <w:pStyle w:val="Heading1"/>
-      </w:pPr>
-      <w:r>
-        <w:t>Source and configuration files</w:t>
-      </w:r>
-    </w:p>
-    <w:p>
-      <w:pPr>
-        <w:pStyle w:val="ListBullet"/>
-        <w:keepLines/>
-      </w:pPr>
-      <w:r>
-        <w:rPr>
-          <w:b/>
-        </w:rPr>
-        <w:t xml:space="preserve">.gitignore. </w:t>
-      </w:r>
-      <w:r>
-        <w:t>This file keeps machine-specific files and secrets out of GitHub. Line 3, ".env", shows the exact code used for that feature. This protects repository hygiene without affecting the website.</w:t>
-      </w:r>
-    </w:p>
-    <w:p>
-      <w:pPr>
-        <w:pStyle w:val="ListBullet"/>
-        <w:keepLines/>
-      </w:pPr>
-      <w:r>
-        <w:rPr>
-          <w:b/>
-        </w:rPr>
-        <w:t xml:space="preserve">README.md. </w:t>
-      </w:r>
-      <w:r>
-        <w:t>This file explains how to run and evaluate the project. Line 1, "# PulseGuard", shows the exact code used for that feature. This gives another developer enough context to open the prototype correctly.</w:t>
-      </w:r>
-    </w:p>
-    <w:p>
-      <w:pPr>
-        <w:pStyle w:val="ListBullet"/>
-        <w:keepLines/>
-      </w:pPr>
-      <w:r>
-        <w:rPr>
-          <w:b/>
-        </w:rPr>
-        <w:t xml:space="preserve">about.html. </w:t>
-      </w:r>
-      <w:r>
-        <w:t>This file states the prototype's limits, privacy model, and evidence boundaries. Line 23, "&lt;h1&gt;What Lifeline can—and cannot—do.&lt;/h1&gt;", shows the exact code used for that feature. This keeps the safety claim focused on warning patterns instead of diagnosis.</w:t>
-      </w:r>
-    </w:p>
-    <w:p>
-      <w:pPr>
-        <w:pStyle w:val="ListBullet"/>
-        <w:keepLines/>
-      </w:pPr>
-      <w:r>
-        <w:rPr>
-          <w:b/>
-        </w:rPr>
-        <w:t xml:space="preserve">app.js. </w:t>
-      </w:r>
-      <w:r>
-        <w:t>This file controls the five-second arming delay, drop alarm, sensors, and nearby-care prompt. Line 20, "const ARM_DELAY_S = 5;        /* time to put the phone down after pressing Start */", shows the exact code used for that feature. This file contains the main safety sequence rather than only changing page appearance.</w:t>
-      </w:r>
-    </w:p>
-    <w:p>
-      <w:pPr>
-        <w:pStyle w:val="ListBullet"/>
-        <w:keepLines/>
-      </w:pPr>
-      <w:r>
-        <w:rPr>
-          <w:b/>
-        </w:rPr>
-        <w:t xml:space="preserve">auth.js. </w:t>
-      </w:r>
-      <w:r>
-        <w:t>This file opens the prototype login and sign-up dialog. Line 24, "if (!authDialog.open) authDialog.showModal();", shows the exact code used for that feature. The code makes the account interface interactive without pretending that a backend exists.</w:t>
-      </w:r>
-    </w:p>
-    <w:p>
-      <w:pPr>
-        <w:pStyle w:val="ListBullet"/>
-        <w:keepLines/>
-      </w:pPr>
-      <w:r>
-        <w:rPr>
-          <w:b/>
-        </w:rPr>
-        <w:t xml:space="preserve">fall-detection.html. </w:t>
-      </w:r>
-      <w:r>
-        <w:t>This file provides the tracker button, alarm panel, Stop control, map prompt, and audio element. Line 143, "&lt;audio id="alarmSound" src="warning-alarm.mp3" preload="auto" loop&gt;&lt;/audio&gt;", shows the exact code used for that feature. This markup is the visible structure that app.js updates.</w:t>
-      </w:r>
-    </w:p>
-    <w:p>
-      <w:pPr>
-        <w:pStyle w:val="ListBullet"/>
-        <w:keepLines/>
-      </w:pPr>
-      <w:r>
-        <w:rPr>
-          <w:b/>
-        </w:rPr>
-        <w:t xml:space="preserve">hazard.html. </w:t>
-      </w:r>
-      <w:r>
-        <w:t>This file demonstrates community hazard reporting and duplicate merging. Line 71, "const MERGE_M = 60;", shows the exact code used for that feature. It is a supporting public-safety experiment rather than the core drop tracker.</w:t>
-      </w:r>
-    </w:p>
-    <w:p>
-      <w:pPr>
-        <w:pStyle w:val="ListBullet"/>
-        <w:keepLines/>
-      </w:pPr>
-      <w:r>
-        <w:rPr>
-          <w:b/>
-        </w:rPr>
-        <w:t xml:space="preserve">index.html. </w:t>
-      </w:r>
-      <w:r>
-        <w:t>This file presents the main emergency choices and a visible route to the tracker. Line 32, "&lt;a class="primary-btn" href="fall-detection.html"&gt;Open drop tracker&lt;/a&gt;", shows the exact code used for that feature. This makes the primary working feature easy to find from the homepage.</w:t>
-      </w:r>
-    </w:p>
-    <w:p>
-      <w:pPr>
-        <w:pStyle w:val="ListBullet"/>
-        <w:keepLines/>
-      </w:pPr>
-      <w:r>
-        <w:rPr>
-          <w:b/>
-        </w:rPr>
-        <w:t xml:space="preserve">nav.js. </w:t>
-      </w:r>
-      <w:r>
-        <w:t>This file builds one shared navigation menu for every page. Line 11, "const SITE = [", shows the exact code used for that feature. Centralizing the link list prevents different pages from showing inconsistent destinations.</w:t>
-      </w:r>
-    </w:p>
-    <w:p>
-      <w:pPr>
-        <w:pStyle w:val="ListBullet"/>
-        <w:keepLines/>
-      </w:pPr>
-      <w:r>
-        <w:rPr>
-          <w:b/>
-        </w:rPr>
-        <w:t xml:space="preserve">risk-zones.html. </w:t>
-      </w:r>
-      <w:r>
-        <w:t>This file maps privacy-thresholded response-planning zones. Line 96, "const MIN_CALLS = 5;        /* a zone below this is never drawn */", shows the exact code used for that feature. The page explores community planning while avoiding a claim about individual emergencies.</w:t>
-      </w:r>
-    </w:p>
-    <w:p>
-      <w:pPr>
-        <w:pStyle w:val="ListBullet"/>
-        <w:keepLines/>
-      </w:pPr>
-      <w:r>
-        <w:rPr>
-          <w:b/>
-        </w:rPr>
-        <w:t xml:space="preserve">robots.txt. </w:t>
-      </w:r>
-      <w:r>
-        <w:t>This file allows search crawlers to access the public site. Line 2, "Allow: /", shows the exact code used for that feature. This is the smallest site-wide SEO instruction in the repository.</w:t>
-      </w:r>
-    </w:p>
-    <w:p>
-      <w:pPr>
-        <w:pStyle w:val="ListBullet"/>
-        <w:keepLines/>
-      </w:pPr>
-      <w:r>
-        <w:rPr>
-          <w:b/>
-        </w:rPr>
-        <w:t xml:space="preserve">safewalk.html. </w:t>
-      </w:r>
-      <w:r>
-        <w:t>This file demonstrates a timed check-in and nearby emergency-care search. Line 137, "const GRACE_S = 300;             /* five minutes late before the alarm */", shows the exact code used for that feature. It supports the broader goal of shortening the route to human help.</w:t>
-      </w:r>
-    </w:p>
-    <w:p>
-      <w:pPr>
-        <w:pStyle w:val="ListBullet"/>
-        <w:keepLines/>
-      </w:pPr>
-      <w:r>
-        <w:rPr>
-          <w:b/>
-        </w:rPr>
-        <w:t xml:space="preserve">script.js. </w:t>
-      </w:r>
-      <w:r>
-        <w:t>This file renders the older illustrative city-data dashboard. Line 22, "const CITIES = [", shows the exact code used for that feature. Its data stays clearly separate from the live drop-tracker logic.</w:t>
-      </w:r>
-    </w:p>
-    <w:p>
-      <w:pPr>
-        <w:pStyle w:val="ListBullet"/>
-        <w:keepLines/>
-      </w:pPr>
-      <w:r>
-        <w:rPr>
-          <w:b/>
-        </w:rPr>
-        <w:t xml:space="preserve">shelters.html. </w:t>
-      </w:r>
-      <w:r>
-        <w:t>This file ranks nearby AED, shelter, and hydrant records. Line 68, "const NEAREST = 5;", shows the exact code used for that feature. This supporting page shows how location could surface practical safety resources.</w:t>
-      </w:r>
-    </w:p>
-    <w:p>
-      <w:pPr>
-        <w:pStyle w:val="ListBullet"/>
-        <w:keepLines/>
-      </w:pPr>
-      <w:r>
-        <w:rPr>
-          <w:b/>
-        </w:rPr>
-        <w:t xml:space="preserve">site.css. </w:t>
-      </w:r>
-      <w:r>
-        <w:t>This file defines shared navigation, controls, dialogs, accessibility states, and mobile rules. Line 889, ".care-dialog { width: min(430px, calc(100% - 32px)); padding: 24px; background: #202122; color: var(--text); border: 1px solid var(--line); }", shows the exact code used for that feature. This keeps the interface consistent across all pages.</w:t>
-      </w:r>
-    </w:p>
-    <w:p>
-      <w:pPr>
-        <w:pStyle w:val="ListBullet"/>
-        <w:keepLines/>
-      </w:pPr>
-      <w:r>
-        <w:rPr>
-          <w:b/>
-        </w:rPr>
-        <w:t xml:space="preserve">sound.js. </w:t>
-      </w:r>
-      <w:r>
-        <w:t>This file plays optional quiet feedback for ordinary interface actions. Line 8, "const SOUND_FILE = "click.mp3";", shows the exact code used for that feature. It deliberately uses click.mp3 separately from the loud warning alarm.</w:t>
-      </w:r>
-    </w:p>
-    <w:p>
-      <w:pPr>
-        <w:pStyle w:val="ListBullet"/>
-        <w:keepLines/>
-      </w:pPr>
-      <w:r>
-        <w:rPr>
-          <w:b/>
-        </w:rPr>
-        <w:t xml:space="preserve">styles.css. </w:t>
-      </w:r>
-      <w:r>
-        <w:t>This file styles homepage choices and responsive layout. Line 613, ".choice-grid { display: grid; grid-template-columns: repeat(3, 1fr); gap: 14px; }", shows the exact code used for that feature. The grid becomes one column on smaller screens so the safety actions remain readable.</w:t>
-      </w:r>
-    </w:p>
-    <w:p>
-      <w:pPr>
-        <w:pStyle w:val="ListBullet"/>
-        <w:keepLines/>
-      </w:pPr>
-      <w:r>
-        <w:rPr>
-          <w:b/>
-        </w:rPr>
-        <w:t xml:space="preserve">documentation/build_prompt_aligned_presentation.py. </w:t>
-      </w:r>
-      <w:r>
-        <w:t>This file generates the prompt-relevance version of the Word presentation. Line 7, "OUT = r"C:\Users\rishi\Downloads\public_safety_hackathon_site\public_safety_hackathon_final\documentation\Lifeline_Prompt_Aligned_Code_Presentation.docx"", shows the exact code used for that feature. Keeping the generator in GitHub makes that document reproducible.</w:t>
-      </w:r>
-    </w:p>
-    <w:p>
-      <w:pPr>
-        <w:pStyle w:val="ListBullet"/>
-        <w:keepLines/>
-      </w:pPr>
-      <w:r>
-        <w:rPr>
-          <w:b/>
-        </w:rPr>
-        <w:t xml:space="preserve">documentation/build_pulseguard_105s_presentation.py. </w:t>
-      </w:r>
-      <w:r>
-        <w:t>This file generates the earlier 105-second bullet presentation. Line 9, "talk = [", shows the exact code used for that feature. Its talk list stores the exact presenter wording before Word formatting is applied.</w:t>
-      </w:r>
-    </w:p>
-    <w:p>
-      <w:pPr>
-        <w:pStyle w:val="ListBullet"/>
-        <w:keepLines/>
-      </w:pPr>
-      <w:r>
-        <w:rPr>
-          <w:b/>
-        </w:rPr>
-        <w:t xml:space="preserve">documentation/build_two_minute_presentation.py. </w:t>
-      </w:r>
-      <w:r>
-        <w:t>This file generates the two-minute code overview. Line 8, "OUT = r"C:\Users\rishi\Downloads\public_safety_hackathon_site\PulseGuard_Code_Presentation.docx"", shows the exact code used for that feature. It records the intended output path and can rebuild the document after code changes.</w:t>
-      </w:r>
-    </w:p>
-    <w:p>
-      <w:pPr>
-        <w:pStyle w:val="ListBullet"/>
-        <w:keepLines/>
-      </w:pPr>
-      <w:r>
-        <w:rPr>
-          <w:b/>
-        </w:rPr>
-        <w:t xml:space="preserve">documentation/build_repo_file_bullets.py. </w:t>
-      </w:r>
-      <w:r>
-        <w:t>This file generates this repository-wide line-reference presentation. Line 10, "ENTRIES = [", shows the exact code used for that feature. It reads the current files to calculate line numbers instead of relying on stale manual references.</w:t>
-      </w:r>
-    </w:p>
-    <w:p>
-      <w:pPr>
-        <w:pStyle w:val="Heading1"/>
-      </w:pPr>
-      <w:r>
-        <w:t>Binary files</w:t>
-      </w:r>
-    </w:p>
-    <w:p>
-      <w:pPr>
-        <w:pStyle w:val="ListBullet"/>
-        <w:keepLines/>
-      </w:pPr>
-      <w:r>
-        <w:rPr>
-          <w:b/>
-        </w:rPr>
-        <w:t xml:space="preserve">click.mp3. </w:t>
-      </w:r>
-      <w:r>
-        <w:t>This file contains the short sound used for ordinary interface feedback. As a binary audio file, it has no readable source-code line number.</w:t>
-      </w:r>
-    </w:p>
-    <w:p>
-      <w:pPr>
-        <w:pStyle w:val="ListBullet"/>
-        <w:keepLines/>
-      </w:pPr>
-      <w:r>
-        <w:rPr>
-          <w:b/>
-        </w:rPr>
-        <w:t xml:space="preserve">warning-alarm.mp3. </w:t>
-      </w:r>
-      <w:r>
-        <w:t>This file contains the loud warning recording used after a detected drop. As a binary audio file, it has no readable source-code line number.</w:t>
-      </w:r>
-    </w:p>
-    <w:p>
-      <w:pPr>
-        <w:pStyle w:val="ListBullet"/>
-        <w:keepLines/>
-      </w:pPr>
-      <w:r>
-        <w:rPr>
-          <w:b/>
-        </w:rPr>
-        <w:t xml:space="preserve">documentation/Lifeline_Prompt_Aligned_Code_Presentation.docx. </w:t>
-      </w:r>
-      <w:r>
-        <w:t>This file stores the earlier prompt-aligned presentation. A DOCX is a packaged binary document, so it has pages and paragraphs rather than source lines.</w:t>
-      </w:r>
-    </w:p>
-    <w:p>
-      <w:pPr>
-        <w:pStyle w:val="ListBullet"/>
-        <w:keepLines/>
-      </w:pPr>
-      <w:r>
-        <w:rPr>
-          <w:b/>
-        </w:rPr>
-        <w:t xml:space="preserve">documentation/Lifeline_Two_Minute_Code_Presentation.docx. </w:t>
-      </w:r>
-      <w:r>
-        <w:t>This file stores the earlier two-minute presentation. A DOCX is a packaged binary document, so it has pages and paragraphs rather than source lines.</w:t>
-      </w:r>
-    </w:p>
-    <w:p>
-      <w:pPr>
-        <w:pStyle w:val="ListBullet"/>
-        <w:keepLines/>
-      </w:pPr>
-      <w:r>
-        <w:rPr>
-          <w:b/>
-        </w:rPr>
-        <w:t xml:space="preserve">documentation/PulseGuard_Code_Presentation.docx. </w:t>
-      </w:r>
-      <w:r>
-        <w:t>This file stores the current presentation deliverable. A DOCX is a packaged binary document, so it has pages and paragraphs rather than source lines.</w:t>
+        <w:t>264 spoken words at about 170 words per minute.</w:t>
       </w:r>
     </w:p>
     <w:sectPr>
       <w:pgSz w:w="12240" w:h="15840"/>
-      <w:pgMar w:top="792" w:right="1123" w:bottom="792" w:left="1123" w:header="720" w:footer="720" w:gutter="0"/>
+      <w:pgMar w:top="792" w:right="1037" w:bottom="792" w:left="1037" w:header="720" w:footer="720" w:gutter="0"/>
       <w:cols w:space="720"/>
       <w:docGrid w:linePitch="360"/>
     </w:sectPr>
@@ -873,11 +691,11 @@
       <w:outlineLvl w:val="0"/>
     </w:pPr>
     <w:rPr>
-      <w:rFonts w:asciiTheme="majorHAnsi" w:eastAsiaTheme="majorEastAsia" w:hAnsiTheme="majorHAnsi" w:cstheme="majorBidi" w:ascii="Georgia" w:hAnsi="Georgia"/>
-      <w:b w:val="0"/>
+      <w:rFonts w:asciiTheme="majorHAnsi" w:eastAsiaTheme="majorEastAsia" w:hAnsiTheme="majorHAnsi" w:cstheme="majorBidi"/>
+      <w:b/>
       <w:bCs/>
-      <w:color w:val="000000"/>
-      <w:sz w:val="34"/>
+      <w:color w:val="365F91" w:themeColor="accent1" w:themeShade="BF"/>
+      <w:sz w:val="28"/>
       <w:szCs w:val="28"/>
     </w:rPr>
   </w:style>
@@ -1163,7 +981,7 @@
       <w:color w:val="000000"/>
       <w:spacing w:val="5"/>
       <w:kern w:val="28"/>
-      <w:sz w:val="52"/>
+      <w:sz w:val="50"/>
       <w:szCs w:val="52"/>
     </w:rPr>
   </w:style>

</xml_diff>

<commit_message>
Add Google Maps nearest care locator
</commit_message>
<xml_diff>
--- a/documentation/PulseGuard_Code_Presentation.docx
+++ b/documentation/PulseGuard_Code_Presentation.docx
@@ -44,7 +44,7 @@
         <w:t>fall-detection.html</w:t>
       </w:r>
       <w:r>
-        <w:t xml:space="preserve"> holds tracker controls. Line 75, "Start tracker", shows that the user starts monitoring.</w:t>
+        <w:t xml:space="preserve"> holds tracker and care controls. Line 165, "Find nearest care", shows that the page exposes the AED and hospital locator.</w:t>
       </w:r>
     </w:p>
     <w:p>
@@ -60,7 +60,7 @@
         <w:t>app.js</w:t>
       </w:r>
       <w:r>
-        <w:t xml:space="preserve"> runs detection and escalation. Line 22, "const ARM_DELAY_S = 5;", shows that the sensor waits five seconds before arming.</w:t>
+        <w:t xml:space="preserve"> runs detection and care lookup. Line 248, "const [hospitals, aeds] = await Promise.all([", shows that Google Places searches both resource types together.</w:t>
       </w:r>
     </w:p>
     <w:p>
@@ -247,7 +247,7 @@
         <w:t xml:space="preserve">Timing  </w:t>
       </w:r>
       <w:r>
-        <w:t>264 spoken words at about 170 words per minute.</w:t>
+        <w:t>274 spoken words at about 170 words per minute.</w:t>
       </w:r>
     </w:p>
     <w:sectPr>

</xml_diff>

<commit_message>
Update Safeguard tracker, live AED lookup, audio and code guides
</commit_message>
<xml_diff>
--- a/documentation/PulseGuard_Code_Presentation.docx
+++ b/documentation/PulseGuard_Code_Presentation.docx
@@ -7,257 +7,4155 @@
         <w:pStyle w:val="Title"/>
       </w:pPr>
       <w:r>
-        <w:t>PulseGuard Code Presentation</w:t>
-      </w:r>
-    </w:p>
-    <w:p>
-      <w:r>
-        <w:t>Approximately one minute thirty five seconds</w:t>
-      </w:r>
-    </w:p>
-    <w:p>
-      <w:pPr>
-        <w:pStyle w:val="ListBullet"/>
-        <w:keepLines/>
-        <w:spacing w:after="100"/>
+        <w:t>Safeguard Code Explanation</w:t>
+      </w:r>
+    </w:p>
+    <w:p>
+      <w:r>
+        <w:t>Updated repository presentation with individual explanations of selected source lines in every text file. Each entry quotes the actual line, explains its syntax, and shows what it contributes to the file. This is an expanded reading guide, not an annotation of every physical line in the repository.</w:t>
+      </w:r>
+    </w:p>
+    <w:p>
+      <w:r>
+        <w:t xml:space="preserve">Repository  </w:t>
+      </w:r>
+      <w:hyperlink r:id="rId9">
+        <w:r>
+          <w:rPr>
+            <w:color w:val="245A81"/>
+          </w:rPr>
+          <w:t>Canopy10979 PulseGuard_hackathon</w:t>
+        </w:r>
+      </w:hyperlink>
+    </w:p>
+    <w:p>
+      <w:r>
+        <w:t>Updated September 6 2026 against the edited local repository, based on GitHub revision 0fd57fd664bd. References describe this generated source snapshot. Parenthetical references count physical source lines, including blanks. Links open the accompanying code_reference_snapshot files; the reference manifest records their SHA256 hashes.</w:t>
+      </w:r>
+    </w:p>
+    <w:p>
+      <w:pPr>
+        <w:pStyle w:val="Heading1"/>
+      </w:pPr>
+      <w:r>
+        <w:t>Current website behavior</w:t>
+      </w:r>
+    </w:p>
+    <w:p>
+      <w:r>
+        <w:t>Safeguard is the current site name. The Team block, Who built what heading, name placeholders and AI assistance disclosure are absent from About and the README. The original requested opening paragraph remains removed from the tracker.</w:t>
+      </w:r>
+    </w:p>
+    <w:p>
+      <w:r>
+        <w:t>The attached index.tsx supplies the mobile flow: possible drop, settling, recovery, stillness, check-in and possible unresponsiveness. Its imported config/settings and screen components were not attached. The browser therefore keeps its existing design and uses named, adjustable thresholds rather than claiming an exact native-app port.</w:t>
+      </w:r>
+    </w:p>
+    <w:p>
+      <w:r>
+        <w:t>Start tracker has a five-second arming delay. After recovery and eight seconds of stillness, the check-in lasts five seconds. If unanswered, the supplied MP3 plays for ten seconds of media progress, unless Stop is pressed. Selecting Test alarm in the location-marker popup starts that same five-second countdown directly and labels the prepared message as a demonstration.</w:t>
+      </w:r>
+    </w:p>
+    <w:p>
+      <w:r>
+        <w:t>The homepage embeds the tracker. A location watch plots the user’s reported position, timestamp and accuracy circle on satellite imagery. The map is not live satellite footage. A laptop must expose motion measurements for drop detection; geolocation does not make missing motion hardware work.</w:t>
+      </w:r>
+    </w:p>
+    <w:p>
+      <w:r>
+        <w:t>An OpenStreetMap Overpass query finds up to five AED records within 10 km, sorted by straight-line distance. It refreshes after movement exceeding 100 metres or on request. Missing records are not filled with examples. Availability and access are not verified. Coordinates are sent to the third-party map and AED services to obtain results.</w:t>
+      </w:r>
+    </w:p>
+    <w:p>
+      <w:r>
+        <w:t>The ZIP supplied the earlier map/list pattern and distance calculation concept. Its example AED entries are not used as live results. The site still prepares messages for a person to send; it does not automatically call or dispatch assistance.</w:t>
+      </w:r>
+    </w:p>
+    <w:p>
+      <w:r>
+        <w:t>Explanatory comments describe groups of roughly two or three source lines. References below were regenerated after those comments. Binary audio and Word documents do not have source-code line numbers.</w:t>
+      </w:r>
+    </w:p>
+    <w:p>
+      <w:r>
+        <w:t>The warning MP3 exactly matches the supplied attachment. Playback explicitly uses an unmuted media element at normal speed and full application volume. The embedded homepage permits audio playback. Failed downloads can be retried, permission blocks show a Play warning sound button, and buffering does not consume the ten-second timer. Physical audibility still depends on device output and browser-tab settings.</w:t>
+      </w:r>
+    </w:p>
+    <w:p>
+      <w:pPr>
+        <w:pStyle w:val="Heading1"/>
+      </w:pPr>
+      <w:r>
+        <w:t>File and line explanations</w:t>
+      </w:r>
+    </w:p>
+    <w:p>
+      <w:pPr>
+        <w:pStyle w:val="Heading2"/>
+      </w:pPr>
+      <w:r>
+        <w:t>Repository housekeeping rules</w:t>
+      </w:r>
+    </w:p>
+    <w:p>
+      <w:pPr>
+        <w:keepNext/>
+      </w:pPr>
+      <w:r>
+        <w:t>.gitignore</w:t>
+      </w:r>
+    </w:p>
+    <w:p>
+      <w:pPr>
+        <w:keepNext/>
+      </w:pPr>
+      <w:hyperlink r:id="rId11">
+        <w:r>
+          <w:rPr>
+            <w:color w:val="245A81"/>
+          </w:rPr>
+          <w:t>(.gitignore, line 3)</w:t>
+        </w:r>
+      </w:hyperlink>
+    </w:p>
+    <w:p>
+      <w:pPr>
+        <w:keepNext/>
+      </w:pPr>
+      <w:r>
+        <w:rPr>
+          <w:rFonts w:ascii="Consolas" w:hAnsi="Consolas"/>
+          <w:sz w:val="18"/>
+        </w:rPr>
+        <w:t>.env</w:t>
+      </w:r>
+    </w:p>
+    <w:p>
+      <w:pPr>
+        <w:keepNext/>
       </w:pPr>
       <w:r>
         <w:rPr>
           <w:b/>
         </w:rPr>
-        <w:t>index.html</w:t>
-      </w:r>
-      <w:r>
-        <w:t xml:space="preserve"> shows safety choices. Line 41, "Open drop tracker", shows that the homepage exposes the tracker.</w:t>
-      </w:r>
-    </w:p>
-    <w:p>
-      <w:pPr>
-        <w:pStyle w:val="ListBullet"/>
-        <w:keepLines/>
-        <w:spacing w:after="100"/>
-      </w:pPr>
+        <w:t xml:space="preserve">Meaning  </w:t>
+      </w:r>
+      <w:r>
+        <w:t>This Git ignore pattern matches files named .env, which commonly contain local configuration. It does not remove files already tracked.</w:t>
+      </w:r>
+    </w:p>
+    <w:p>
       <w:r>
         <w:rPr>
           <w:b/>
         </w:rPr>
-        <w:t>fall-detection.html</w:t>
-      </w:r>
-      <w:r>
-        <w:t xml:space="preserve"> holds tracker and care controls. Line 165, "Find nearest care", shows that the page exposes the AED and hospital locator.</w:t>
-      </w:r>
-    </w:p>
-    <w:p>
-      <w:pPr>
-        <w:pStyle w:val="ListBullet"/>
-        <w:keepLines/>
-        <w:spacing w:after="100"/>
+        <w:t xml:space="preserve">Contribution  </w:t>
+      </w:r>
+      <w:r>
+        <w:t>It reduces accidental inclusion of local configuration in later commits.</w:t>
+      </w:r>
+    </w:p>
+    <w:p>
+      <w:pPr>
+        <w:pStyle w:val="Heading2"/>
+      </w:pPr>
+      <w:r>
+        <w:t>Project overview and setup instructions</w:t>
+      </w:r>
+    </w:p>
+    <w:p>
+      <w:pPr>
+        <w:keepNext/>
+      </w:pPr>
+      <w:r>
+        <w:t>README.md</w:t>
+      </w:r>
+    </w:p>
+    <w:p>
+      <w:pPr>
+        <w:keepNext/>
+      </w:pPr>
+      <w:hyperlink r:id="rId12">
+        <w:r>
+          <w:rPr>
+            <w:color w:val="245A81"/>
+          </w:rPr>
+          <w:t>(README.md, line 1)</w:t>
+        </w:r>
+      </w:hyperlink>
+    </w:p>
+    <w:p>
+      <w:pPr>
+        <w:keepNext/>
+      </w:pPr>
+      <w:r>
+        <w:rPr>
+          <w:rFonts w:ascii="Consolas" w:hAnsi="Consolas"/>
+          <w:sz w:val="18"/>
+        </w:rPr>
+        <w:t># PulseGuard</w:t>
+      </w:r>
+    </w:p>
+    <w:p>
+      <w:pPr>
+        <w:keepNext/>
       </w:pPr>
       <w:r>
         <w:rPr>
           <w:b/>
         </w:rPr>
-        <w:t>app.js</w:t>
-      </w:r>
-      <w:r>
-        <w:t xml:space="preserve"> runs detection and care lookup. Line 248, "const [hospitals, aeds] = await Promise.all([", shows that Google Places searches both resource types together.</w:t>
-      </w:r>
-    </w:p>
-    <w:p>
-      <w:pPr>
-        <w:pStyle w:val="ListBullet"/>
-        <w:keepLines/>
-        <w:spacing w:after="100"/>
-      </w:pPr>
+        <w:t xml:space="preserve">Meaning  </w:t>
+      </w:r>
+      <w:r>
+        <w:t>The leading # makes PulseGuard a level one Markdown heading.</w:t>
+      </w:r>
+    </w:p>
+    <w:p>
       <w:r>
         <w:rPr>
           <w:b/>
         </w:rPr>
-        <w:t>auth.js</w:t>
-      </w:r>
-      <w:r>
-        <w:t xml:space="preserve"> controls accounts. Line 7, "const authDialog = document.querySelector("#auth-dialog");", shows that JavaScript selects the account dialog.</w:t>
-      </w:r>
-    </w:p>
-    <w:p>
-      <w:pPr>
-        <w:pStyle w:val="ListBullet"/>
-        <w:keepLines/>
-        <w:spacing w:after="100"/>
+        <w:t xml:space="preserve">Contribution  </w:t>
+      </w:r>
+      <w:r>
+        <w:t>It identifies the repository; the interface still uses the Safeguard name.</w:t>
+      </w:r>
+    </w:p>
+    <w:p>
+      <w:pPr>
+        <w:keepNext/>
+      </w:pPr>
+      <w:hyperlink r:id="rId12">
+        <w:r>
+          <w:rPr>
+            <w:color w:val="245A81"/>
+          </w:rPr>
+          <w:t>(README.md, line 18)</w:t>
+        </w:r>
+      </w:hyperlink>
+    </w:p>
+    <w:p>
+      <w:pPr>
+        <w:keepNext/>
+      </w:pPr>
+      <w:r>
+        <w:rPr>
+          <w:rFonts w:ascii="Consolas" w:hAnsi="Consolas"/>
+          <w:sz w:val="18"/>
+        </w:rPr>
+        <w:t>- It does not sense breathing, pulse or oxygen.</w:t>
+      </w:r>
+    </w:p>
+    <w:p>
+      <w:pPr>
+        <w:keepNext/>
       </w:pPr>
       <w:r>
         <w:rPr>
           <w:b/>
         </w:rPr>
-        <w:t>nav.js</w:t>
-      </w:r>
-      <w:r>
-        <w:t xml:space="preserve"> creates shared navigation. Line 12, "const SITE = [", shows that all page links begin in one central structure.</w:t>
-      </w:r>
-    </w:p>
-    <w:p>
-      <w:pPr>
-        <w:pStyle w:val="ListBullet"/>
-        <w:keepLines/>
-        <w:spacing w:after="100"/>
-      </w:pPr>
+        <w:t xml:space="preserve">Meaning  </w:t>
+      </w:r>
+      <w:r>
+        <w:t>This is a Markdown list item describing an absent capability, not executable code.</w:t>
+      </w:r>
+    </w:p>
+    <w:p>
       <w:r>
         <w:rPr>
           <w:b/>
         </w:rPr>
-        <w:t>sound.js</w:t>
-      </w:r>
-      <w:r>
-        <w:t xml:space="preserve"> handles ordinary interface audio. Line 9, "const SOUND_FILE = "click.mp3";", shows that click feedback stays separate from the warning alarm.</w:t>
-      </w:r>
-    </w:p>
-    <w:p>
-      <w:pPr>
-        <w:pStyle w:val="ListBullet"/>
-        <w:keepLines/>
-        <w:spacing w:after="100"/>
+        <w:t xml:space="preserve">Contribution  </w:t>
+      </w:r>
+      <w:r>
+        <w:t>It limits the reader's interpretation of the sensor demonstration.</w:t>
+      </w:r>
+    </w:p>
+    <w:p>
+      <w:pPr>
+        <w:pStyle w:val="Heading2"/>
+      </w:pPr>
+      <w:r>
+        <w:t>Method and limits page</w:t>
+      </w:r>
+    </w:p>
+    <w:p>
+      <w:pPr>
+        <w:keepNext/>
+      </w:pPr>
+      <w:r>
+        <w:t>about.html</w:t>
+      </w:r>
+    </w:p>
+    <w:p>
+      <w:pPr>
+        <w:keepNext/>
+      </w:pPr>
+      <w:hyperlink r:id="rId13">
+        <w:r>
+          <w:rPr>
+            <w:color w:val="245A81"/>
+          </w:rPr>
+          <w:t>(about.html, line 30)</w:t>
+        </w:r>
+      </w:hyperlink>
+    </w:p>
+    <w:p>
+      <w:pPr>
+        <w:keepNext/>
+      </w:pPr>
+      <w:r>
+        <w:rPr>
+          <w:rFonts w:ascii="Consolas" w:hAnsi="Consolas"/>
+          <w:sz w:val="18"/>
+        </w:rPr>
+        <w:t>&lt;h1&gt;What Safeguard can—and cannot—do.&lt;/h1&gt;</w:t>
+      </w:r>
+    </w:p>
+    <w:p>
+      <w:pPr>
+        <w:keepNext/>
       </w:pPr>
       <w:r>
         <w:rPr>
           <w:b/>
         </w:rPr>
-        <w:t>site.css</w:t>
-      </w:r>
-      <w:r>
-        <w:t xml:space="preserve"> defines shared visuals. Line 1074, "--bg: #101418;", shows that pages reuse one dark background token.</w:t>
-      </w:r>
-    </w:p>
-    <w:p>
-      <w:pPr>
-        <w:pStyle w:val="ListBullet"/>
-        <w:keepLines/>
-        <w:spacing w:after="100"/>
-      </w:pPr>
+        <w:t xml:space="preserve">Meaning  </w:t>
+      </w:r>
+      <w:r>
+        <w:t>The h1 element marks the page's main heading; its text introduces capabilities and limitations.</w:t>
+      </w:r>
+    </w:p>
+    <w:p>
       <w:r>
         <w:rPr>
           <w:b/>
         </w:rPr>
-        <w:t>styles.css</w:t>
-      </w:r>
-      <w:r>
-        <w:t xml:space="preserve"> styles the homepage layout. Line 785, ".choice-grid {", shows that the emergency choices use a dedicated grid.</w:t>
-      </w:r>
-    </w:p>
-    <w:p>
-      <w:pPr>
-        <w:pStyle w:val="ListBullet"/>
-        <w:keepLines/>
-        <w:spacing w:after="100"/>
+        <w:t xml:space="preserve">Contribution  </w:t>
+      </w:r>
+      <w:r>
+        <w:t>It introduces the method, evidence and privacy sections. The page now ends after privacy; the team placeholders and AI assistance section have been removed.</w:t>
+      </w:r>
+    </w:p>
+    <w:p>
+      <w:pPr>
+        <w:keepNext/>
+      </w:pPr>
+      <w:hyperlink r:id="rId13">
+        <w:r>
+          <w:rPr>
+            <w:color w:val="245A81"/>
+          </w:rPr>
+          <w:t>(about.html, line 47)</w:t>
+        </w:r>
+      </w:hyperlink>
+    </w:p>
+    <w:p>
+      <w:pPr>
+        <w:keepNext/>
+      </w:pPr>
+      <w:r>
+        <w:rPr>
+          <w:rFonts w:ascii="Consolas" w:hAnsi="Consolas"/>
+          <w:sz w:val="18"/>
+        </w:rPr>
+        <w:t>&lt;li class="signal"&gt;No breathing or pulse sensing. This does not detect an overdose.&lt;/li&gt;</w:t>
+      </w:r>
+    </w:p>
+    <w:p>
+      <w:pPr>
+        <w:keepNext/>
       </w:pPr>
       <w:r>
         <w:rPr>
           <w:b/>
         </w:rPr>
-        <w:t>about.html</w:t>
-      </w:r>
-      <w:r>
-        <w:t xml:space="preserve"> explains limits and privacy. Line 44, "No breathing or pulse sensing.", shows that the site states a sensor limitation openly.</w:t>
-      </w:r>
-    </w:p>
-    <w:p>
-      <w:pPr>
-        <w:pStyle w:val="ListBullet"/>
-        <w:keepLines/>
-        <w:spacing w:after="100"/>
-      </w:pPr>
+        <w:t xml:space="preserve">Meaning  </w:t>
+      </w:r>
+      <w:r>
+        <w:t>A list item presents a visible limitation using the signal CSS class.</w:t>
+      </w:r>
+    </w:p>
+    <w:p>
       <w:r>
         <w:rPr>
           <w:b/>
         </w:rPr>
-        <w:t>risk-zones.html</w:t>
-      </w:r>
-      <w:r>
-        <w:t xml:space="preserve"> demonstrates privacy-aware planning. Line 124, "const MIN_CALLS = 5;", shows that small groups are hidden before a zone is drawn.</w:t>
-      </w:r>
-    </w:p>
-    <w:p>
-      <w:pPr>
-        <w:pStyle w:val="ListBullet"/>
-        <w:keepLines/>
-        <w:spacing w:after="100"/>
+        <w:t xml:space="preserve">Contribution  </w:t>
+      </w:r>
+      <w:r>
+        <w:t>It tells the reader what the sensors cannot measure.</w:t>
+      </w:r>
+    </w:p>
+    <w:p>
+      <w:pPr>
+        <w:pStyle w:val="Heading2"/>
+      </w:pPr>
+      <w:r>
+        <w:t>Motion sensing and the local warning sequence</w:t>
+      </w:r>
+    </w:p>
+    <w:p>
+      <w:pPr>
+        <w:keepNext/>
+      </w:pPr>
+      <w:r>
+        <w:t>app.js</w:t>
+      </w:r>
+    </w:p>
+    <w:p>
+      <w:pPr>
+        <w:keepNext/>
+      </w:pPr>
+      <w:hyperlink r:id="rId14">
+        <w:r>
+          <w:rPr>
+            <w:color w:val="245A81"/>
+          </w:rPr>
+          <w:t>(app.js, line 16)</w:t>
+        </w:r>
+      </w:hyperlink>
+    </w:p>
+    <w:p>
+      <w:pPr>
+        <w:keepNext/>
+      </w:pPr>
+      <w:r>
+        <w:rPr>
+          <w:rFonts w:ascii="Consolas" w:hAnsi="Consolas"/>
+          <w:sz w:val="18"/>
+        </w:rPr>
+        <w:t>const IMPACT_MS2 = 25;        /* about 2.5 g. Walking peaks near 15. */</w:t>
+      </w:r>
+    </w:p>
+    <w:p>
+      <w:pPr>
+        <w:keepNext/>
       </w:pPr>
       <w:r>
         <w:rPr>
           <w:b/>
         </w:rPr>
-        <w:t>safewalk.html</w:t>
-      </w:r>
-      <w:r>
-        <w:t xml:space="preserve"> adds a timed check-in. Line 176, "const GRACE_S = 300;", shows that late status includes a five-minute grace period.</w:t>
-      </w:r>
-    </w:p>
-    <w:p>
-      <w:pPr>
-        <w:pStyle w:val="ListBullet"/>
-        <w:keepLines/>
-        <w:spacing w:after="100"/>
-      </w:pPr>
+        <w:t xml:space="preserve">Meaning  </w:t>
+      </w:r>
+      <w:r>
+        <w:t>Names the impact threshold in metres per second squared.</w:t>
+      </w:r>
+    </w:p>
+    <w:p>
       <w:r>
         <w:rPr>
           <w:b/>
         </w:rPr>
-        <w:t>shelters.html</w:t>
-      </w:r>
-      <w:r>
-        <w:t xml:space="preserve"> ranks nearby resources. Line 89, "const NEAREST = 5;", shows that results are limited to five useful locations.</w:t>
-      </w:r>
-    </w:p>
-    <w:p>
-      <w:pPr>
-        <w:pStyle w:val="ListBullet"/>
-        <w:keepLines/>
-        <w:spacing w:after="100"/>
+        <w:t xml:space="preserve">Contribution  </w:t>
+      </w:r>
+      <w:r>
+        <w:t>A reading above this value begins a possible drop event.</w:t>
+      </w:r>
+    </w:p>
+    <w:p>
+      <w:pPr>
+        <w:keepNext/>
+      </w:pPr>
+      <w:hyperlink r:id="rId14">
+        <w:r>
+          <w:rPr>
+            <w:color w:val="245A81"/>
+          </w:rPr>
+          <w:t>(app.js, line 18)</w:t>
+        </w:r>
+      </w:hyperlink>
+    </w:p>
+    <w:p>
+      <w:pPr>
+        <w:keepNext/>
+      </w:pPr>
+      <w:r>
+        <w:rPr>
+          <w:rFonts w:ascii="Consolas" w:hAnsi="Consolas"/>
+          <w:sz w:val="18"/>
+        </w:rPr>
+        <w:t>const STILL_MS = 8000;        /* how long that stillness must last */</w:t>
+      </w:r>
+    </w:p>
+    <w:p>
+      <w:pPr>
+        <w:keepNext/>
       </w:pPr>
       <w:r>
         <w:rPr>
           <w:b/>
         </w:rPr>
-        <w:t>hazard.html</w:t>
-      </w:r>
-      <w:r>
-        <w:t xml:space="preserve"> merges nearby hazard reports. Line 88, "const MERGE_M = 60;", shows that reports within sixty metres can become one issue.</w:t>
-      </w:r>
-    </w:p>
-    <w:p>
-      <w:pPr>
-        <w:pStyle w:val="ListBullet"/>
-        <w:keepLines/>
-        <w:spacing w:after="100"/>
-      </w:pPr>
+        <w:t xml:space="preserve">Meaning  </w:t>
+      </w:r>
+      <w:r>
+        <w:t>Defines eight seconds of stillness.</w:t>
+      </w:r>
+    </w:p>
+    <w:p>
       <w:r>
         <w:rPr>
           <w:b/>
         </w:rPr>
-        <w:t>script.js</w:t>
-      </w:r>
-      <w:r>
-        <w:t xml:space="preserve"> renders illustrative city data. Line 24, "const CITIES = [", shows that the older dashboard reads from one defined dataset.</w:t>
-      </w:r>
-    </w:p>
-    <w:p>
+        <w:t xml:space="preserve">Contribution  </w:t>
+      </w:r>
+      <w:r>
+        <w:t>Stillness after recovery supplies the second required event signal.</w:t>
+      </w:r>
+    </w:p>
+    <w:p>
+      <w:pPr>
+        <w:keepNext/>
+      </w:pPr>
+      <w:hyperlink r:id="rId14">
+        <w:r>
+          <w:rPr>
+            <w:color w:val="245A81"/>
+          </w:rPr>
+          <w:t>(app.js, line 20)</w:t>
+        </w:r>
+      </w:hyperlink>
+    </w:p>
+    <w:p>
+      <w:pPr>
+        <w:keepNext/>
+      </w:pPr>
+      <w:r>
+        <w:rPr>
+          <w:rFonts w:ascii="Consolas" w:hAnsi="Consolas"/>
+          <w:sz w:val="18"/>
+        </w:rPr>
+        <w:t>const COUNTDOWN_S = 5;       /* seconds to answer before the alert is prepared */</w:t>
+      </w:r>
+    </w:p>
+    <w:p>
+      <w:pPr>
+        <w:keepNext/>
+      </w:pPr>
       <w:r>
         <w:rPr>
           <w:b/>
         </w:rPr>
-        <w:t xml:space="preserve">Timing  </w:t>
-      </w:r>
-      <w:r>
-        <w:t>274 spoken words at about 170 words per minute.</w:t>
-      </w:r>
+        <w:t xml:space="preserve">Meaning  </w:t>
+      </w:r>
+      <w:r>
+        <w:t>Sets the response countdown to five seconds.</w:t>
+      </w:r>
+    </w:p>
+    <w:p>
+      <w:r>
+        <w:rPr>
+          <w:b/>
+        </w:rPr>
+        <w:t xml:space="preserve">Contribution  </w:t>
+      </w:r>
+      <w:r>
+        <w:t>Both the verified movement flow and marker test use this interval.</w:t>
+      </w:r>
+    </w:p>
+    <w:p>
+      <w:pPr>
+        <w:keepNext/>
+      </w:pPr>
+      <w:hyperlink r:id="rId14">
+        <w:r>
+          <w:rPr>
+            <w:color w:val="245A81"/>
+          </w:rPr>
+          <w:t>(app.js, line 21)</w:t>
+        </w:r>
+      </w:hyperlink>
+    </w:p>
+    <w:p>
+      <w:pPr>
+        <w:keepNext/>
+      </w:pPr>
+      <w:r>
+        <w:rPr>
+          <w:rFonts w:ascii="Consolas" w:hAnsi="Consolas"/>
+          <w:sz w:val="18"/>
+        </w:rPr>
+        <w:t>const DROP_ALARM_S = 10;      /* alarm length after a hard phone drop */</w:t>
+      </w:r>
+    </w:p>
+    <w:p>
+      <w:pPr>
+        <w:keepNext/>
+      </w:pPr>
+      <w:r>
+        <w:rPr>
+          <w:b/>
+        </w:rPr>
+        <w:t xml:space="preserve">Meaning  </w:t>
+      </w:r>
+      <w:r>
+        <w:t>Sets ten seconds of warning playback.</w:t>
+      </w:r>
+    </w:p>
+    <w:p>
+      <w:r>
+        <w:rPr>
+          <w:b/>
+        </w:rPr>
+        <w:t xml:space="preserve">Contribution  </w:t>
+      </w:r>
+      <w:r>
+        <w:t>The media-progress clock ends playback after this duration unless Stop is pressed.</w:t>
+      </w:r>
+    </w:p>
+    <w:p>
+      <w:pPr>
+        <w:keepNext/>
+      </w:pPr>
+      <w:hyperlink r:id="rId14">
+        <w:r>
+          <w:rPr>
+            <w:color w:val="245A81"/>
+          </w:rPr>
+          <w:t>(app.js, line 75)</w:t>
+        </w:r>
+      </w:hyperlink>
+    </w:p>
+    <w:p>
+      <w:pPr>
+        <w:keepNext/>
+      </w:pPr>
+      <w:r>
+        <w:rPr>
+          <w:rFonts w:ascii="Consolas" w:hAnsi="Consolas"/>
+          <w:sz w:val="18"/>
+        </w:rPr>
+        <w:t>const SETTLE_MS = 1500;</w:t>
+      </w:r>
+    </w:p>
+    <w:p>
+      <w:pPr>
+        <w:keepNext/>
+      </w:pPr>
+      <w:r>
+        <w:rPr>
+          <w:b/>
+        </w:rPr>
+        <w:t xml:space="preserve">Meaning  </w:t>
+      </w:r>
+      <w:r>
+        <w:t>Defines a 1.5-second settling interval.</w:t>
+      </w:r>
+    </w:p>
+    <w:p>
+      <w:r>
+        <w:rPr>
+          <w:b/>
+        </w:rPr>
+        <w:t xml:space="preserve">Contribution  </w:t>
+      </w:r>
+      <w:r>
+        <w:t>Initial impact motion is allowed to settle before recovery is evaluated.</w:t>
+      </w:r>
+    </w:p>
+    <w:p>
+      <w:pPr>
+        <w:keepNext/>
+      </w:pPr>
+      <w:hyperlink r:id="rId14">
+        <w:r>
+          <w:rPr>
+            <w:color w:val="245A81"/>
+          </w:rPr>
+          <w:t>(app.js, line 76)</w:t>
+        </w:r>
+      </w:hyperlink>
+    </w:p>
+    <w:p>
+      <w:pPr>
+        <w:keepNext/>
+      </w:pPr>
+      <w:r>
+        <w:rPr>
+          <w:rFonts w:ascii="Consolas" w:hAnsi="Consolas"/>
+          <w:sz w:val="18"/>
+        </w:rPr>
+        <w:t>const RECOVERY_MS = 2000;</w:t>
+      </w:r>
+    </w:p>
+    <w:p>
+      <w:pPr>
+        <w:keepNext/>
+      </w:pPr>
+      <w:r>
+        <w:rPr>
+          <w:b/>
+        </w:rPr>
+        <w:t xml:space="preserve">Meaning  </w:t>
+      </w:r>
+      <w:r>
+        <w:t>Defines a two-second recovery observation interval.</w:t>
+      </w:r>
+    </w:p>
+    <w:p>
+      <w:r>
+        <w:rPr>
+          <w:b/>
+        </w:rPr>
+        <w:t xml:space="preserve">Contribution  </w:t>
+      </w:r>
+      <w:r>
+        <w:t>Motion below the recovery threshold must persist before stillness is timed.</w:t>
+      </w:r>
+    </w:p>
+    <w:p>
+      <w:pPr>
+        <w:keepNext/>
+      </w:pPr>
+      <w:hyperlink r:id="rId14">
+        <w:r>
+          <w:rPr>
+            <w:color w:val="245A81"/>
+          </w:rPr>
+          <w:t>(app.js, line 149)</w:t>
+        </w:r>
+      </w:hyperlink>
+    </w:p>
+    <w:p>
+      <w:pPr>
+        <w:keepNext/>
+      </w:pPr>
+      <w:r>
+        <w:rPr>
+          <w:rFonts w:ascii="Consolas" w:hAnsi="Consolas"/>
+          <w:sz w:val="18"/>
+        </w:rPr>
+        <w:t>if (now &gt;= alarmLastTime) alarmPlayed += now - alarmLastTime;</w:t>
+      </w:r>
+    </w:p>
+    <w:p>
+      <w:pPr>
+        <w:keepNext/>
+      </w:pPr>
+      <w:r>
+        <w:rPr>
+          <w:b/>
+        </w:rPr>
+        <w:t xml:space="preserve">Meaning  </w:t>
+      </w:r>
+      <w:r>
+        <w:t>Adds the change in media playback position to accumulated playback.</w:t>
+      </w:r>
+    </w:p>
+    <w:p>
+      <w:r>
+        <w:rPr>
+          <w:b/>
+        </w:rPr>
+        <w:t xml:space="preserve">Contribution  </w:t>
+      </w:r>
+      <w:r>
+        <w:t>Buffering and blocked playback do not consume the ten-second allowance; a separate branch handles looping.</w:t>
+      </w:r>
+    </w:p>
+    <w:p>
+      <w:pPr>
+        <w:keepNext/>
+      </w:pPr>
+      <w:hyperlink r:id="rId14">
+        <w:r>
+          <w:rPr>
+            <w:color w:val="245A81"/>
+          </w:rPr>
+          <w:t>(app.js, line 160)</w:t>
+        </w:r>
+      </w:hyperlink>
+    </w:p>
+    <w:p>
+      <w:pPr>
+        <w:keepNext/>
+      </w:pPr>
+      <w:r>
+        <w:rPr>
+          <w:rFonts w:ascii="Consolas" w:hAnsi="Consolas"/>
+          <w:sz w:val="18"/>
+        </w:rPr>
+        <w:t>function audioFailure(error) {</w:t>
+      </w:r>
+    </w:p>
+    <w:p>
+      <w:pPr>
+        <w:keepNext/>
+      </w:pPr>
+      <w:r>
+        <w:rPr>
+          <w:b/>
+        </w:rPr>
+        <w:t xml:space="preserve">Meaning  </w:t>
+      </w:r>
+      <w:r>
+        <w:t>Defines the audio failure handler.</w:t>
+      </w:r>
+    </w:p>
+    <w:p>
+      <w:r>
+        <w:rPr>
+          <w:b/>
+        </w:rPr>
+        <w:t xml:space="preserve">Contribution  </w:t>
+      </w:r>
+      <w:r>
+        <w:t>Permission blocks prompt a Play click; download or decoding failures prompt a connection check and retry.</w:t>
+      </w:r>
+    </w:p>
+    <w:p>
+      <w:pPr>
+        <w:keepNext/>
+      </w:pPr>
+      <w:hyperlink r:id="rId14">
+        <w:r>
+          <w:rPr>
+            <w:color w:val="245A81"/>
+          </w:rPr>
+          <w:t>(app.js, line 174)</w:t>
+        </w:r>
+      </w:hyperlink>
+    </w:p>
+    <w:p>
+      <w:pPr>
+        <w:keepNext/>
+      </w:pPr>
+      <w:r>
+        <w:rPr>
+          <w:rFonts w:ascii="Consolas" w:hAnsi="Consolas"/>
+          <w:sz w:val="18"/>
+        </w:rPr>
+        <w:t>if (audio.error) {</w:t>
+      </w:r>
+    </w:p>
+    <w:p>
+      <w:pPr>
+        <w:keepNext/>
+      </w:pPr>
+      <w:r>
+        <w:rPr>
+          <w:b/>
+        </w:rPr>
+        <w:t xml:space="preserve">Meaning  </w:t>
+      </w:r>
+      <w:r>
+        <w:t>Checks whether the media element has recorded an error.</w:t>
+      </w:r>
+    </w:p>
+    <w:p>
+      <w:r>
+        <w:rPr>
+          <w:b/>
+        </w:rPr>
+        <w:t xml:space="preserve">Contribution  </w:t>
+      </w:r>
+      <w:r>
+        <w:t>An explicit retry reloads the MP3 and resets the playback allowance.</w:t>
+      </w:r>
+    </w:p>
+    <w:p>
+      <w:pPr>
+        <w:keepNext/>
+      </w:pPr>
+      <w:hyperlink r:id="rId14">
+        <w:r>
+          <w:rPr>
+            <w:color w:val="245A81"/>
+          </w:rPr>
+          <w:t>(app.js, line 182)</w:t>
+        </w:r>
+      </w:hyperlink>
+    </w:p>
+    <w:p>
+      <w:pPr>
+        <w:keepNext/>
+      </w:pPr>
+      <w:r>
+        <w:rPr>
+          <w:rFonts w:ascii="Consolas" w:hAnsi="Consolas"/>
+          <w:sz w:val="18"/>
+        </w:rPr>
+        <w:t>audio.volume = 1;</w:t>
+      </w:r>
+    </w:p>
+    <w:p>
+      <w:pPr>
+        <w:keepNext/>
+      </w:pPr>
+      <w:r>
+        <w:rPr>
+          <w:b/>
+        </w:rPr>
+        <w:t xml:space="preserve">Meaning  </w:t>
+      </w:r>
+      <w:r>
+        <w:t>Sets the warning media element to its full application volume.</w:t>
+      </w:r>
+    </w:p>
+    <w:p>
+      <w:r>
+        <w:rPr>
+          <w:b/>
+        </w:rPr>
+        <w:t xml:space="preserve">Contribution  </w:t>
+      </w:r>
+      <w:r>
+        <w:t>playWarning also clears element mute and restores normal playback speed before requesting playback.</w:t>
+      </w:r>
+    </w:p>
+    <w:p>
+      <w:pPr>
+        <w:keepNext/>
+      </w:pPr>
+      <w:hyperlink r:id="rId14">
+        <w:r>
+          <w:rPr>
+            <w:color w:val="245A81"/>
+          </w:rPr>
+          <w:t>(app.js, line 190)</w:t>
+        </w:r>
+      </w:hyperlink>
+    </w:p>
+    <w:p>
+      <w:pPr>
+        <w:keepNext/>
+      </w:pPr>
+      <w:r>
+        <w:rPr>
+          <w:rFonts w:ascii="Consolas" w:hAnsi="Consolas"/>
+          <w:sz w:val="18"/>
+        </w:rPr>
+        <w:t>}).catch(audioFailure);</w:t>
+      </w:r>
+    </w:p>
+    <w:p>
+      <w:pPr>
+        <w:keepNext/>
+      </w:pPr>
+      <w:r>
+        <w:rPr>
+          <w:b/>
+        </w:rPr>
+        <w:t xml:space="preserve">Meaning  </w:t>
+      </w:r>
+      <w:r>
+        <w:t>Routes a rejected playback promise to the failure handler.</w:t>
+      </w:r>
+    </w:p>
+    <w:p>
+      <w:r>
+        <w:rPr>
+          <w:b/>
+        </w:rPr>
+        <w:t xml:space="preserve">Contribution  </w:t>
+      </w:r>
+      <w:r>
+        <w:t>The interface distinguishes a playback request from successful playback.</w:t>
+      </w:r>
+    </w:p>
+    <w:p>
+      <w:pPr>
+        <w:keepNext/>
+      </w:pPr>
+      <w:hyperlink r:id="rId14">
+        <w:r>
+          <w:rPr>
+            <w:color w:val="245A81"/>
+          </w:rPr>
+          <w:t>(app.js, line 193)</w:t>
+        </w:r>
+      </w:hyperlink>
+    </w:p>
+    <w:p>
+      <w:pPr>
+        <w:keepNext/>
+      </w:pPr>
+      <w:r>
+        <w:rPr>
+          <w:rFonts w:ascii="Consolas" w:hAnsi="Consolas"/>
+          <w:sz w:val="18"/>
+        </w:rPr>
+        <w:t>function testFromMarker() {</w:t>
+      </w:r>
+    </w:p>
+    <w:p>
+      <w:pPr>
+        <w:keepNext/>
+      </w:pPr>
+      <w:r>
+        <w:rPr>
+          <w:b/>
+        </w:rPr>
+        <w:t xml:space="preserve">Meaning  </w:t>
+      </w:r>
+      <w:r>
+        <w:t>Declares the manual test handler.</w:t>
+      </w:r>
+    </w:p>
+    <w:p>
+      <w:r>
+        <w:rPr>
+          <w:b/>
+        </w:rPr>
+        <w:t xml:space="preserve">Contribution  </w:t>
+      </w:r>
+      <w:r>
+        <w:t>The location marker popup and Test alarm button invoke the same cancelable five-second sequence.</w:t>
+      </w:r>
+    </w:p>
+    <w:p>
+      <w:pPr>
+        <w:keepNext/>
+      </w:pPr>
+      <w:hyperlink r:id="rId14">
+        <w:r>
+          <w:rPr>
+            <w:color w:val="245A81"/>
+          </w:rPr>
+          <w:t>(app.js, line 278)</w:t>
+        </w:r>
+      </w:hyperlink>
+    </w:p>
+    <w:p>
+      <w:pPr>
+        <w:keepNext/>
+      </w:pPr>
+      <w:r>
+        <w:rPr>
+          <w:rFonts w:ascii="Consolas" w:hAnsi="Consolas"/>
+          <w:sz w:val="18"/>
+        </w:rPr>
+        <w:t>const query = '[out:json][timeout:20];nwr["emergency"="defibrillator"](around:10000,' + origin.lat + ',' + origin.lon + ');out center tags;';</w:t>
+      </w:r>
+    </w:p>
+    <w:p>
+      <w:pPr>
+        <w:keepNext/>
+      </w:pPr>
+      <w:r>
+        <w:rPr>
+          <w:b/>
+        </w:rPr>
+        <w:t xml:space="preserve">Meaning  </w:t>
+      </w:r>
+      <w:r>
+        <w:t>Builds an Overpass query for objects tagged emergency=defibrillator within 10 km of the latest fix.</w:t>
+      </w:r>
+    </w:p>
+    <w:p>
+      <w:r>
+        <w:rPr>
+          <w:b/>
+        </w:rPr>
+        <w:t xml:space="preserve">Contribution  </w:t>
+      </w:r>
+      <w:r>
+        <w:t>Searches mapped AED records rather than the old ZIP’s example data or mixed hospital results.</w:t>
+      </w:r>
+    </w:p>
+    <w:p>
+      <w:pPr>
+        <w:keepNext/>
+      </w:pPr>
+      <w:hyperlink r:id="rId14">
+        <w:r>
+          <w:rPr>
+            <w:color w:val="245A81"/>
+          </w:rPr>
+          <w:t>(app.js, line 286)</w:t>
+        </w:r>
+      </w:hyperlink>
+    </w:p>
+    <w:p>
+      <w:pPr>
+        <w:keepNext/>
+      </w:pPr>
+      <w:r>
+        <w:rPr>
+          <w:rFonts w:ascii="Consolas" w:hAnsi="Consolas"/>
+          <w:sz w:val="18"/>
+        </w:rPr>
+        <w:t>if (request !== aedRequest) return;</w:t>
+      </w:r>
+    </w:p>
+    <w:p>
+      <w:pPr>
+        <w:keepNext/>
+      </w:pPr>
+      <w:r>
+        <w:rPr>
+          <w:b/>
+        </w:rPr>
+        <w:t xml:space="preserve">Meaning  </w:t>
+      </w:r>
+      <w:r>
+        <w:t>Rejects an obsolete asynchronous AED response.</w:t>
+      </w:r>
+    </w:p>
+    <w:p>
+      <w:r>
+        <w:rPr>
+          <w:b/>
+        </w:rPr>
+        <w:t xml:space="preserve">Contribution  </w:t>
+      </w:r>
+      <w:r>
+        <w:t>A newer search or stopping the tracker invalidates prior requests.</w:t>
+      </w:r>
+    </w:p>
+    <w:p>
+      <w:pPr>
+        <w:keepNext/>
+      </w:pPr>
+      <w:hyperlink r:id="rId14">
+        <w:r>
+          <w:rPr>
+            <w:color w:val="245A81"/>
+          </w:rPr>
+          <w:t>(app.js, line 294)</w:t>
+        </w:r>
+      </w:hyperlink>
+    </w:p>
+    <w:p>
+      <w:pPr>
+        <w:keepNext/>
+      </w:pPr>
+      <w:r>
+        <w:rPr>
+          <w:rFonts w:ascii="Consolas" w:hAnsi="Consolas"/>
+          <w:sz w:val="18"/>
+        </w:rPr>
+        <w:t>.sort((a, b) =&gt; a.distance - b.distance).slice(0, 5);</w:t>
+      </w:r>
+    </w:p>
+    <w:p>
+      <w:pPr>
+        <w:keepNext/>
+      </w:pPr>
+      <w:r>
+        <w:rPr>
+          <w:b/>
+        </w:rPr>
+        <w:t xml:space="preserve">Meaning  </w:t>
+      </w:r>
+      <w:r>
+        <w:t>Sorts numerical distances ascending and retains at most five entries.</w:t>
+      </w:r>
+    </w:p>
+    <w:p>
+      <w:r>
+        <w:rPr>
+          <w:b/>
+        </w:rPr>
+        <w:t xml:space="preserve">Contribution  </w:t>
+      </w:r>
+      <w:r>
+        <w:t>The ordered list and numbered map popups use the same closest-first result set.</w:t>
+      </w:r>
+    </w:p>
+    <w:p>
+      <w:pPr>
+        <w:keepNext/>
+      </w:pPr>
+      <w:hyperlink r:id="rId14">
+        <w:r>
+          <w:rPr>
+            <w:color w:val="245A81"/>
+          </w:rPr>
+          <w:t>(app.js, line 309)</w:t>
+        </w:r>
+      </w:hyperlink>
+    </w:p>
+    <w:p>
+      <w:pPr>
+        <w:keepNext/>
+      </w:pPr>
+      <w:r>
+        <w:rPr>
+          <w:rFonts w:ascii="Consolas" w:hAnsi="Consolas"/>
+          <w:sz w:val="18"/>
+        </w:rPr>
+        <w:t>detail.textContent = Math.round(item.distance) + " m straight-line · Access: " + (tags.access || "not recorded") + " · Hours: " + (tags.opening_hours || "not recorded");</w:t>
+      </w:r>
+    </w:p>
+    <w:p>
+      <w:pPr>
+        <w:keepNext/>
+      </w:pPr>
+      <w:r>
+        <w:rPr>
+          <w:b/>
+        </w:rPr>
+        <w:t xml:space="preserve">Meaning  </w:t>
+      </w:r>
+      <w:r>
+        <w:t>Writes distance, access and opening-hours metadata as plain text.</w:t>
+      </w:r>
+    </w:p>
+    <w:p>
+      <w:r>
+        <w:rPr>
+          <w:b/>
+        </w:rPr>
+        <w:t xml:space="preserve">Contribution  </w:t>
+      </w:r>
+      <w:r>
+        <w:t>Missing access or hours are displayed as not recorded.</w:t>
+      </w:r>
+    </w:p>
+    <w:p>
+      <w:pPr>
+        <w:keepNext/>
+      </w:pPr>
+      <w:hyperlink r:id="rId14">
+        <w:r>
+          <w:rPr>
+            <w:color w:val="245A81"/>
+          </w:rPr>
+          <w:t>(app.js, line 426)</w:t>
+        </w:r>
+      </w:hyperlink>
+    </w:p>
+    <w:p>
+      <w:pPr>
+        <w:keepNext/>
+      </w:pPr>
+      <w:r>
+        <w:rPr>
+          <w:rFonts w:ascii="Consolas" w:hAnsi="Consolas"/>
+          <w:sz w:val="18"/>
+        </w:rPr>
+        <w:t>if (Math.abs(mag - 9.81) &gt; RECOVERY_MS2) {</w:t>
+      </w:r>
+    </w:p>
+    <w:p>
+      <w:pPr>
+        <w:keepNext/>
+      </w:pPr>
+      <w:r>
+        <w:rPr>
+          <w:b/>
+        </w:rPr>
+        <w:t xml:space="preserve">Meaning  </w:t>
+      </w:r>
+      <w:r>
+        <w:t>Compares movement away from resting gravity with the recovery threshold.</w:t>
+      </w:r>
+    </w:p>
+    <w:p>
+      <w:r>
+        <w:rPr>
+          <w:b/>
+        </w:rPr>
+        <w:t xml:space="preserve">Contribution  </w:t>
+      </w:r>
+      <w:r>
+        <w:t>Resumed movement clears the pending drop and returns to monitoring.</w:t>
+      </w:r>
+    </w:p>
+    <w:p>
+      <w:pPr>
+        <w:keepNext/>
+      </w:pPr>
+      <w:hyperlink r:id="rId14">
+        <w:r>
+          <w:rPr>
+            <w:color w:val="245A81"/>
+          </w:rPr>
+          <w:t>(app.js, line 441)</w:t>
+        </w:r>
+      </w:hyperlink>
+    </w:p>
+    <w:p>
+      <w:pPr>
+        <w:keepNext/>
+      </w:pPr>
+      <w:r>
+        <w:rPr>
+          <w:rFonts w:ascii="Consolas" w:hAnsi="Consolas"/>
+          <w:sz w:val="18"/>
+        </w:rPr>
+        <w:t>if (Date.now() - stillSince &gt;= STILL_MS) fire("stillness");</w:t>
+      </w:r>
+    </w:p>
+    <w:p>
+      <w:pPr>
+        <w:keepNext/>
+      </w:pPr>
+      <w:r>
+        <w:rPr>
+          <w:b/>
+        </w:rPr>
+        <w:t xml:space="preserve">Meaning  </w:t>
+      </w:r>
+      <w:r>
+        <w:t>Checks elapsed stillness against eight seconds.</w:t>
+      </w:r>
+    </w:p>
+    <w:p>
+      <w:r>
+        <w:rPr>
+          <w:b/>
+        </w:rPr>
+        <w:t xml:space="preserve">Contribution  </w:t>
+      </w:r>
+      <w:r>
+        <w:t>Records stillness, which allows the guarded check-in to begin.</w:t>
+      </w:r>
+    </w:p>
+    <w:p>
+      <w:pPr>
+        <w:keepNext/>
+      </w:pPr>
+      <w:hyperlink r:id="rId14">
+        <w:r>
+          <w:rPr>
+            <w:color w:val="245A81"/>
+          </w:rPr>
+          <w:t>(app.js, line 644)</w:t>
+        </w:r>
+      </w:hyperlink>
+    </w:p>
+    <w:p>
+      <w:pPr>
+        <w:keepNext/>
+      </w:pPr>
+      <w:r>
+        <w:rPr>
+          <w:rFonts w:ascii="Consolas" w:hAnsi="Consolas"/>
+          <w:sz w:val="18"/>
+        </w:rPr>
+        <w:t>place = { lat: c.latitude, lon: c.longitude, acc: Math.ceil(c.accuracy), at: p.timestamp };</w:t>
+      </w:r>
+    </w:p>
+    <w:p>
+      <w:pPr>
+        <w:keepNext/>
+      </w:pPr>
+      <w:r>
+        <w:rPr>
+          <w:b/>
+        </w:rPr>
+        <w:t xml:space="preserve">Meaning  </w:t>
+      </w:r>
+      <w:r>
+        <w:t>Stores latitude, longitude, accuracy and timestamp.</w:t>
+      </w:r>
+    </w:p>
+    <w:p>
+      <w:r>
+        <w:rPr>
+          <w:b/>
+        </w:rPr>
+        <w:t xml:space="preserve">Contribution  </w:t>
+      </w:r>
+      <w:r>
+        <w:t>Text readouts and the satellite marker use the same validated fix.</w:t>
+      </w:r>
+    </w:p>
+    <w:p>
+      <w:pPr>
+        <w:keepNext/>
+      </w:pPr>
+      <w:hyperlink r:id="rId14">
+        <w:r>
+          <w:rPr>
+            <w:color w:val="245A81"/>
+          </w:rPr>
+          <w:t>(app.js, line 697)</w:t>
+        </w:r>
+      </w:hyperlink>
+    </w:p>
+    <w:p>
+      <w:pPr>
+        <w:keepNext/>
+      </w:pPr>
+      <w:r>
+        <w:rPr>
+          <w:rFonts w:ascii="Consolas" w:hAnsi="Consolas"/>
+          <w:sz w:val="18"/>
+        </w:rPr>
+        <w:t>accuracyCircle = L.circle(point, { radius: place.acc, color: "#69b7ff", fillOpacity: 0.12 }).addTo(satelliteMap);</w:t>
+      </w:r>
+    </w:p>
+    <w:p>
+      <w:pPr>
+        <w:keepNext/>
+      </w:pPr>
+      <w:r>
+        <w:rPr>
+          <w:b/>
+        </w:rPr>
+        <w:t xml:space="preserve">Meaning  </w:t>
+      </w:r>
+      <w:r>
+        <w:t>Draws the reported accuracy radius in metres.</w:t>
+      </w:r>
+    </w:p>
+    <w:p>
+      <w:r>
+        <w:rPr>
+          <w:b/>
+        </w:rPr>
+        <w:t xml:space="preserve">Contribution  </w:t>
+      </w:r>
+      <w:r>
+        <w:t>The circle surrounds the live location marker.</w:t>
+      </w:r>
+    </w:p>
+    <w:p>
+      <w:pPr>
+        <w:keepNext/>
+      </w:pPr>
+      <w:hyperlink r:id="rId14">
+        <w:r>
+          <w:rPr>
+            <w:color w:val="245A81"/>
+          </w:rPr>
+          <w:t>(app.js, line 707)</w:t>
+        </w:r>
+      </w:hyperlink>
+    </w:p>
+    <w:p>
+      <w:pPr>
+        <w:keepNext/>
+      </w:pPr>
+      <w:r>
+        <w:rPr>
+          <w:rFonts w:ascii="Consolas" w:hAnsi="Consolas"/>
+          <w:sz w:val="18"/>
+        </w:rPr>
+        <w:t>if ((!aedOrigin &amp;&amp; Date.now() - aedAttemptAt &gt; 30000) || (aedOrigin &amp;&amp; metresBetween(aedOrigin, place) &gt; 100)) listNearestCare();</w:t>
+      </w:r>
+    </w:p>
+    <w:p>
+      <w:pPr>
+        <w:keepNext/>
+      </w:pPr>
+      <w:r>
+        <w:rPr>
+          <w:b/>
+        </w:rPr>
+        <w:t xml:space="preserve">Meaning  </w:t>
+      </w:r>
+      <w:r>
+        <w:t>Refreshes AED records on the first fix or after moving more than 100 metres.</w:t>
+      </w:r>
+    </w:p>
+    <w:p>
+      <w:r>
+        <w:rPr>
+          <w:b/>
+        </w:rPr>
+        <w:t xml:space="preserve">Contribution  </w:t>
+      </w:r>
+      <w:r>
+        <w:t>Avoids querying the remote service for every sensor update.</w:t>
+      </w:r>
+    </w:p>
+    <w:p>
+      <w:pPr>
+        <w:keepNext/>
+      </w:pPr>
+      <w:hyperlink r:id="rId14">
+        <w:r>
+          <w:rPr>
+            <w:color w:val="245A81"/>
+          </w:rPr>
+          <w:t>(app.js, line 725)</w:t>
+        </w:r>
+      </w:hyperlink>
+    </w:p>
+    <w:p>
+      <w:pPr>
+        <w:keepNext/>
+      </w:pPr>
+      <w:r>
+        <w:rPr>
+          <w:rFonts w:ascii="Consolas" w:hAnsi="Consolas"/>
+          <w:sz w:val="18"/>
+        </w:rPr>
+        <w:t>locationWatch = navigator.geolocation.watchPosition(p =&gt; {</w:t>
+      </w:r>
+    </w:p>
+    <w:p>
+      <w:pPr>
+        <w:keepNext/>
+      </w:pPr>
+      <w:r>
+        <w:rPr>
+          <w:b/>
+        </w:rPr>
+        <w:t xml:space="preserve">Meaning  </w:t>
+      </w:r>
+      <w:r>
+        <w:t>Subscribes to browser location updates.</w:t>
+      </w:r>
+    </w:p>
+    <w:p>
+      <w:r>
+        <w:rPr>
+          <w:b/>
+        </w:rPr>
+        <w:t xml:space="preserve">Contribution  </w:t>
+      </w:r>
+      <w:r>
+        <w:t>The marker follows reported positions until Stop tracker or page exit.</w:t>
+      </w:r>
+    </w:p>
+    <w:p>
+      <w:pPr>
+        <w:keepNext/>
+      </w:pPr>
+      <w:hyperlink r:id="rId14">
+        <w:r>
+          <w:rPr>
+            <w:color w:val="245A81"/>
+          </w:rPr>
+          <w:t>(app.js, line 726)</w:t>
+        </w:r>
+      </w:hyperlink>
+    </w:p>
+    <w:p>
+      <w:pPr>
+        <w:keepNext/>
+      </w:pPr>
+      <w:r>
+        <w:rPr>
+          <w:rFonts w:ascii="Consolas" w:hAnsi="Consolas"/>
+          <w:sz w:val="18"/>
+        </w:rPr>
+        <w:t>if (run === session) showPosition(p);</w:t>
+      </w:r>
+    </w:p>
+    <w:p>
+      <w:pPr>
+        <w:keepNext/>
+      </w:pPr>
+      <w:r>
+        <w:rPr>
+          <w:b/>
+        </w:rPr>
+        <w:t xml:space="preserve">Meaning  </w:t>
+      </w:r>
+      <w:r>
+        <w:t>Checks that the location callback belongs to the current session.</w:t>
+      </w:r>
+    </w:p>
+    <w:p>
+      <w:r>
+        <w:rPr>
+          <w:b/>
+        </w:rPr>
+        <w:t xml:space="preserve">Contribution  </w:t>
+      </w:r>
+      <w:r>
+        <w:t>Location can run separately from motion, including on a laptop without motion sensors.</w:t>
+      </w:r>
+    </w:p>
+    <w:p>
+      <w:pPr>
+        <w:keepNext/>
+      </w:pPr>
+      <w:hyperlink r:id="rId14">
+        <w:r>
+          <w:rPr>
+            <w:color w:val="245A81"/>
+          </w:rPr>
+          <w:t>(app.js, line 769)</w:t>
+        </w:r>
+      </w:hyperlink>
+    </w:p>
+    <w:p>
+      <w:pPr>
+        <w:keepNext/>
+      </w:pPr>
+      <w:r>
+        <w:rPr>
+          <w:rFonts w:ascii="Consolas" w:hAnsi="Consolas"/>
+          <w:sz w:val="18"/>
+        </w:rPr>
+        <w:t>fired.noReply = true;</w:t>
+      </w:r>
+    </w:p>
+    <w:p>
+      <w:pPr>
+        <w:keepNext/>
+      </w:pPr>
+      <w:r>
+        <w:rPr>
+          <w:b/>
+        </w:rPr>
+        <w:t xml:space="preserve">Meaning  </w:t>
+      </w:r>
+      <w:r>
+        <w:t>Records that the check-in expired without a response.</w:t>
+      </w:r>
+    </w:p>
+    <w:p>
+      <w:r>
+        <w:rPr>
+          <w:b/>
+        </w:rPr>
+        <w:t xml:space="preserve">Contribution  </w:t>
+      </w:r>
+      <w:r>
+        <w:t>The next statements prepare a message and start warning playback.</w:t>
+      </w:r>
+    </w:p>
+    <w:p>
+      <w:pPr>
+        <w:keepNext/>
+      </w:pPr>
+      <w:hyperlink r:id="rId14">
+        <w:r>
+          <w:rPr>
+            <w:color w:val="245A81"/>
+          </w:rPr>
+          <w:t>(app.js, line 855)</w:t>
+        </w:r>
+      </w:hyperlink>
+    </w:p>
+    <w:p>
+      <w:pPr>
+        <w:keepNext/>
+      </w:pPr>
+      <w:r>
+        <w:rPr>
+          <w:rFonts w:ascii="Consolas" w:hAnsi="Consolas"/>
+          <w:sz w:val="18"/>
+        </w:rPr>
+        <w:t>link.href = "sms:" + person.phone + "?body=" + encodeURIComponent(message);</w:t>
+      </w:r>
+    </w:p>
+    <w:p>
+      <w:pPr>
+        <w:keepNext/>
+      </w:pPr>
+      <w:r>
+        <w:rPr>
+          <w:b/>
+        </w:rPr>
+        <w:t xml:space="preserve">Meaning  </w:t>
+      </w:r>
+      <w:r>
+        <w:t>Creates a messaging-app link containing the prepared message.</w:t>
+      </w:r>
+    </w:p>
+    <w:p>
+      <w:r>
+        <w:rPr>
+          <w:b/>
+        </w:rPr>
+        <w:t xml:space="preserve">Contribution  </w:t>
+      </w:r>
+      <w:r>
+        <w:t>A person still reviews and sends it in their own app.</w:t>
+      </w:r>
+    </w:p>
+    <w:p>
+      <w:pPr>
+        <w:pStyle w:val="Heading2"/>
+      </w:pPr>
+      <w:r>
+        <w:t>Prototype account dialog interactions</w:t>
+      </w:r>
+    </w:p>
+    <w:p>
+      <w:pPr>
+        <w:keepNext/>
+      </w:pPr>
+      <w:r>
+        <w:t>auth.js</w:t>
+      </w:r>
+    </w:p>
+    <w:p>
+      <w:pPr>
+        <w:keepNext/>
+      </w:pPr>
+      <w:hyperlink r:id="rId15">
+        <w:r>
+          <w:rPr>
+            <w:color w:val="245A81"/>
+          </w:rPr>
+          <w:t>(auth.js, line 31)</w:t>
+        </w:r>
+      </w:hyperlink>
+    </w:p>
+    <w:p>
+      <w:pPr>
+        <w:keepNext/>
+      </w:pPr>
+      <w:r>
+        <w:rPr>
+          <w:rFonts w:ascii="Consolas" w:hAnsi="Consolas"/>
+          <w:sz w:val="18"/>
+        </w:rPr>
+        <w:t>if (!authDialog.open) authDialog.showModal();</w:t>
+      </w:r>
+    </w:p>
+    <w:p>
+      <w:pPr>
+        <w:keepNext/>
+      </w:pPr>
+      <w:r>
+        <w:rPr>
+          <w:b/>
+        </w:rPr>
+        <w:t xml:space="preserve">Meaning  </w:t>
+      </w:r>
+      <w:r>
+        <w:t>! negates the open property, so showModal runs only when the dialog is closed.</w:t>
+      </w:r>
+    </w:p>
+    <w:p>
+      <w:r>
+        <w:rPr>
+          <w:b/>
+        </w:rPr>
+        <w:t xml:space="preserve">Contribution  </w:t>
+      </w:r>
+      <w:r>
+        <w:t>It opens the account dialog after selecting the desired form.</w:t>
+      </w:r>
+    </w:p>
+    <w:p>
+      <w:pPr>
+        <w:keepNext/>
+      </w:pPr>
+      <w:hyperlink r:id="rId15">
+        <w:r>
+          <w:rPr>
+            <w:color w:val="245A81"/>
+          </w:rPr>
+          <w:t>(auth.js, line 64)</w:t>
+        </w:r>
+      </w:hyperlink>
+    </w:p>
+    <w:p>
+      <w:pPr>
+        <w:keepNext/>
+      </w:pPr>
+      <w:r>
+        <w:rPr>
+          <w:rFonts w:ascii="Consolas" w:hAnsi="Consolas"/>
+          <w:sz w:val="18"/>
+        </w:rPr>
+        <w:t>authStatus.textContent = "Accounts are not connected yet. Nothing was sent or saved.";</w:t>
+      </w:r>
+    </w:p>
+    <w:p>
+      <w:pPr>
+        <w:keepNext/>
+      </w:pPr>
+      <w:r>
+        <w:rPr>
+          <w:b/>
+        </w:rPr>
+        <w:t xml:space="preserve">Meaning  </w:t>
+      </w:r>
+      <w:r>
+        <w:t>This assignment displays the account submission limitation as plain text.</w:t>
+      </w:r>
+    </w:p>
+    <w:p>
+      <w:r>
+        <w:rPr>
+          <w:b/>
+        </w:rPr>
+        <w:t xml:space="preserve">Contribution  </w:t>
+      </w:r>
+      <w:r>
+        <w:t>The submit handler prevents normal submission and clears password fields.</w:t>
+      </w:r>
+    </w:p>
+    <w:p>
+      <w:pPr>
+        <w:pStyle w:val="Heading2"/>
+      </w:pPr>
+      <w:r>
+        <w:t>Controls and panels for the tracker</w:t>
+      </w:r>
+    </w:p>
+    <w:p>
+      <w:pPr>
+        <w:keepNext/>
+      </w:pPr>
+      <w:r>
+        <w:t>fall-detection.html</w:t>
+      </w:r>
+    </w:p>
+    <w:p>
+      <w:pPr>
+        <w:keepNext/>
+      </w:pPr>
+      <w:hyperlink r:id="rId16">
+        <w:r>
+          <w:rPr>
+            <w:color w:val="245A81"/>
+          </w:rPr>
+          <w:t>(fall-detection.html, line 79)</w:t>
+        </w:r>
+      </w:hyperlink>
+    </w:p>
+    <w:p>
+      <w:pPr>
+        <w:keepNext/>
+      </w:pPr>
+      <w:r>
+        <w:rPr>
+          <w:rFonts w:ascii="Consolas" w:hAnsi="Consolas"/>
+          <w:sz w:val="18"/>
+        </w:rPr>
+        <w:t>&lt;button id="armTrackerBtn" class="button primary" type="button"&gt;Start tracker&lt;/button&gt;</w:t>
+      </w:r>
+    </w:p>
+    <w:p>
+      <w:pPr>
+        <w:keepNext/>
+      </w:pPr>
+      <w:r>
+        <w:rPr>
+          <w:b/>
+        </w:rPr>
+        <w:t xml:space="preserve">Meaning  </w:t>
+      </w:r>
+      <w:r>
+        <w:t>This button has the identifier app.js uses to attach armTracker; type button avoids form submission.</w:t>
+      </w:r>
+    </w:p>
+    <w:p>
+      <w:r>
+        <w:rPr>
+          <w:b/>
+        </w:rPr>
+        <w:t xml:space="preserve">Contribution  </w:t>
+      </w:r>
+      <w:r>
+        <w:t>It supplies the Start tracker control that later changes to Stop tracker.</w:t>
+      </w:r>
+    </w:p>
+    <w:p>
+      <w:pPr>
+        <w:keepNext/>
+      </w:pPr>
+      <w:hyperlink r:id="rId16">
+        <w:r>
+          <w:rPr>
+            <w:color w:val="245A81"/>
+          </w:rPr>
+          <w:t>(fall-detection.html, line 158)</w:t>
+        </w:r>
+      </w:hyperlink>
+    </w:p>
+    <w:p>
+      <w:pPr>
+        <w:keepNext/>
+      </w:pPr>
+      <w:r>
+        <w:rPr>
+          <w:rFonts w:ascii="Consolas" w:hAnsi="Consolas"/>
+          <w:sz w:val="18"/>
+        </w:rPr>
+        <w:t>&lt;button id="testAlarmBtn" class="button secondary" type="button"&gt;Test alarm · 5s countdown + 10s sound&lt;/button&gt;</w:t>
+      </w:r>
+    </w:p>
+    <w:p>
+      <w:pPr>
+        <w:keepNext/>
+      </w:pPr>
+      <w:r>
+        <w:rPr>
+          <w:b/>
+        </w:rPr>
+        <w:t xml:space="preserve">Meaning  </w:t>
+      </w:r>
+      <w:r>
+        <w:t>Defines the explicit alarm test button.</w:t>
+      </w:r>
+    </w:p>
+    <w:p>
+      <w:r>
+        <w:rPr>
+          <w:b/>
+        </w:rPr>
+        <w:t xml:space="preserve">Contribution  </w:t>
+      </w:r>
+      <w:r>
+        <w:t>Its handler is shared with the user-location marker popup.</w:t>
+      </w:r>
+    </w:p>
+    <w:p>
+      <w:pPr>
+        <w:keepNext/>
+      </w:pPr>
+      <w:hyperlink r:id="rId16">
+        <w:r>
+          <w:rPr>
+            <w:color w:val="245A81"/>
+          </w:rPr>
+          <w:t>(fall-detection.html, line 206)</w:t>
+        </w:r>
+      </w:hyperlink>
+    </w:p>
+    <w:p>
+      <w:pPr>
+        <w:keepNext/>
+      </w:pPr>
+      <w:r>
+        <w:rPr>
+          <w:rFonts w:ascii="Consolas" w:hAnsi="Consolas"/>
+          <w:sz w:val="18"/>
+        </w:rPr>
+        <w:t>&lt;audio id="alarmSound" src="warning-alarm.mp3" preload="auto" playsinline loop&gt;&lt;/audio&gt;</w:t>
+      </w:r>
+    </w:p>
+    <w:p>
+      <w:pPr>
+        <w:keepNext/>
+      </w:pPr>
+      <w:r>
+        <w:rPr>
+          <w:b/>
+        </w:rPr>
+        <w:t xml:space="preserve">Meaning  </w:t>
+      </w:r>
+      <w:r>
+        <w:t>The audio element names warning-alarm.mp3 as its source; preload auto requests preparation and loop repeats playback.</w:t>
+      </w:r>
+    </w:p>
+    <w:p>
+      <w:r>
+        <w:rPr>
+          <w:b/>
+        </w:rPr>
+        <w:t xml:space="preserve">Contribution  </w:t>
+      </w:r>
+      <w:r>
+        <w:t>app.js controls this element to start, stop and reset the warning.</w:t>
+      </w:r>
+    </w:p>
+    <w:p>
+      <w:pPr>
+        <w:keepNext/>
+      </w:pPr>
+      <w:hyperlink r:id="rId16">
+        <w:r>
+          <w:rPr>
+            <w:color w:val="245A81"/>
+          </w:rPr>
+          <w:t>(fall-detection.html, line 218)</w:t>
+        </w:r>
+      </w:hyperlink>
+    </w:p>
+    <w:p>
+      <w:pPr>
+        <w:keepNext/>
+      </w:pPr>
+      <w:r>
+        <w:rPr>
+          <w:rFonts w:ascii="Consolas" w:hAnsi="Consolas"/>
+          <w:sz w:val="18"/>
+        </w:rPr>
+        <w:t>&lt;button id="okayBtn" class="button primary" type="button"&gt;I am okay&lt;/button&gt;</w:t>
+      </w:r>
+    </w:p>
+    <w:p>
+      <w:pPr>
+        <w:keepNext/>
+      </w:pPr>
+      <w:r>
+        <w:rPr>
+          <w:b/>
+        </w:rPr>
+        <w:t xml:space="preserve">Meaning  </w:t>
+      </w:r>
+      <w:r>
+        <w:t>This button supplies the okayBtn identifier and the visible I am okay label.</w:t>
+      </w:r>
+    </w:p>
+    <w:p>
+      <w:r>
+        <w:rPr>
+          <w:b/>
+        </w:rPr>
+        <w:t xml:space="preserve">Contribution  </w:t>
+      </w:r>
+      <w:r>
+        <w:t>app.js connects it to closeAlert.</w:t>
+      </w:r>
+    </w:p>
+    <w:p>
+      <w:pPr>
+        <w:pStyle w:val="Heading2"/>
+      </w:pPr>
+      <w:r>
+        <w:t>Local community hazard reporting experiment</w:t>
+      </w:r>
+    </w:p>
+    <w:p>
+      <w:pPr>
+        <w:keepNext/>
+      </w:pPr>
+      <w:r>
+        <w:t>hazard.html</w:t>
+      </w:r>
+    </w:p>
+    <w:p>
+      <w:pPr>
+        <w:keepNext/>
+      </w:pPr>
+      <w:hyperlink r:id="rId17">
+        <w:r>
+          <w:rPr>
+            <w:color w:val="245A81"/>
+          </w:rPr>
+          <w:t>(hazard.html, line 88)</w:t>
+        </w:r>
+      </w:hyperlink>
+    </w:p>
+    <w:p>
+      <w:pPr>
+        <w:keepNext/>
+      </w:pPr>
+      <w:r>
+        <w:rPr>
+          <w:rFonts w:ascii="Consolas" w:hAnsi="Consolas"/>
+          <w:sz w:val="18"/>
+        </w:rPr>
+        <w:t>const MERGE_M = 60;</w:t>
+      </w:r>
+    </w:p>
+    <w:p>
+      <w:pPr>
+        <w:keepNext/>
+      </w:pPr>
+      <w:r>
+        <w:rPr>
+          <w:b/>
+        </w:rPr>
+        <w:t xml:space="preserve">Meaning  </w:t>
+      </w:r>
+      <w:r>
+        <w:t>This constant sets a sixty-metre search radius.</w:t>
+      </w:r>
+    </w:p>
+    <w:p>
+      <w:r>
+        <w:rPr>
+          <w:b/>
+        </w:rPr>
+        <w:t xml:space="preserve">Contribution  </w:t>
+      </w:r>
+      <w:r>
+        <w:t>findTicket starts its nearest-match search with this distance limit.</w:t>
+      </w:r>
+    </w:p>
+    <w:p>
+      <w:pPr>
+        <w:keepNext/>
+      </w:pPr>
+      <w:hyperlink r:id="rId17">
+        <w:r>
+          <w:rPr>
+            <w:color w:val="245A81"/>
+          </w:rPr>
+          <w:t>(hazard.html, line 180)</w:t>
+        </w:r>
+      </w:hyperlink>
+    </w:p>
+    <w:p>
+      <w:pPr>
+        <w:keepNext/>
+      </w:pPr>
+      <w:r>
+        <w:rPr>
+          <w:rFonts w:ascii="Consolas" w:hAnsi="Consolas"/>
+          <w:sz w:val="18"/>
+        </w:rPr>
+        <w:t>if (r.cat !== cat)</w:t>
+      </w:r>
+    </w:p>
+    <w:p>
+      <w:pPr>
+        <w:keepNext/>
+      </w:pPr>
+      <w:r>
+        <w:rPr>
+          <w:b/>
+        </w:rPr>
+        <w:t xml:space="preserve">Meaning  </w:t>
+      </w:r>
+      <w:r>
+        <w:t>The inequality test detects reports whose category differs from the new report; the next return skips them.</w:t>
+      </w:r>
+    </w:p>
+    <w:p>
+      <w:r>
+        <w:rPr>
+          <w:b/>
+        </w:rPr>
+        <w:t xml:space="preserve">Contribution  </w:t>
+      </w:r>
+      <w:r>
+        <w:t>Only matching hazard categories compete to share a ticket.</w:t>
+      </w:r>
+    </w:p>
+    <w:p>
+      <w:pPr>
+        <w:keepNext/>
+      </w:pPr>
+      <w:hyperlink r:id="rId17">
+        <w:r>
+          <w:rPr>
+            <w:color w:val="245A81"/>
+          </w:rPr>
+          <w:t>(hazard.html, line 259)</w:t>
+        </w:r>
+      </w:hyperlink>
+    </w:p>
+    <w:p>
+      <w:pPr>
+        <w:keepNext/>
+      </w:pPr>
+      <w:r>
+        <w:rPr>
+          <w:rFonts w:ascii="Consolas" w:hAnsi="Consolas"/>
+          <w:sz w:val="18"/>
+        </w:rPr>
+        <w:t>localStorage.setItem(KEY, JSON.stringify(reports));</w:t>
+      </w:r>
+    </w:p>
+    <w:p>
+      <w:pPr>
+        <w:keepNext/>
+      </w:pPr>
+      <w:r>
+        <w:rPr>
+          <w:b/>
+        </w:rPr>
+        <w:t xml:space="preserve">Meaning  </w:t>
+      </w:r>
+      <w:r>
+        <w:t>It serializes the full report array and saves it in this browser.</w:t>
+      </w:r>
+    </w:p>
+    <w:p>
+      <w:r>
+        <w:rPr>
+          <w:b/>
+        </w:rPr>
+        <w:t xml:space="preserve">Contribution  </w:t>
+      </w:r>
+      <w:r>
+        <w:t>Reports persist locally across reloads.</w:t>
+      </w:r>
+    </w:p>
+    <w:p>
+      <w:pPr>
+        <w:pStyle w:val="Heading2"/>
+      </w:pPr>
+      <w:r>
+        <w:t>Homepage and emergency choices</w:t>
+      </w:r>
+    </w:p>
+    <w:p>
+      <w:pPr>
+        <w:keepNext/>
+      </w:pPr>
+      <w:r>
+        <w:t>index.html</w:t>
+      </w:r>
+    </w:p>
+    <w:p>
+      <w:pPr>
+        <w:keepNext/>
+      </w:pPr>
+      <w:hyperlink r:id="rId18">
+        <w:r>
+          <w:rPr>
+            <w:color w:val="245A81"/>
+          </w:rPr>
+          <w:t>(index.html, line 53)</w:t>
+        </w:r>
+      </w:hyperlink>
+    </w:p>
+    <w:p>
+      <w:pPr>
+        <w:keepNext/>
+      </w:pPr>
+      <w:r>
+        <w:rPr>
+          <w:rFonts w:ascii="Consolas" w:hAnsi="Consolas"/>
+          <w:sz w:val="18"/>
+        </w:rPr>
+        <w:t>&lt;article class="choice-card"&gt;&lt;p class="card-kicker"&gt;Bystander&lt;/p&gt;&lt;h3&gt;Help someone else&lt;/h3&gt;&lt;p&gt;If they cannot wake or are not breathing normally, call 911 now. You do not need to identify the substance first.&lt;/p&gt;&lt;a class="secondary-btn" href="tel:911"&gt;Call 911 for them&lt;/a&gt;&lt;/article&gt;</w:t>
+      </w:r>
+    </w:p>
+    <w:p>
+      <w:pPr>
+        <w:keepNext/>
+      </w:pPr>
+      <w:r>
+        <w:rPr>
+          <w:b/>
+        </w:rPr>
+        <w:t xml:space="preserve">Meaning  </w:t>
+      </w:r>
+      <w:r>
+        <w:t>This article contains a bystander heading, brief guidance and a tel:911 link.</w:t>
+      </w:r>
+    </w:p>
+    <w:p>
+      <w:r>
+        <w:rPr>
+          <w:b/>
+        </w:rPr>
+        <w:t xml:space="preserve">Contribution  </w:t>
+      </w:r>
+      <w:r>
+        <w:t>The complete line combines the explanation and a device dialer link in one card.</w:t>
+      </w:r>
+    </w:p>
+    <w:p>
+      <w:pPr>
+        <w:keepNext/>
+      </w:pPr>
+      <w:hyperlink r:id="rId18">
+        <w:r>
+          <w:rPr>
+            <w:color w:val="245A81"/>
+          </w:rPr>
+          <w:t>(index.html, line 72)</w:t>
+        </w:r>
+      </w:hyperlink>
+    </w:p>
+    <w:p>
+      <w:pPr>
+        <w:keepNext/>
+      </w:pPr>
+      <w:r>
+        <w:rPr>
+          <w:rFonts w:ascii="Consolas" w:hAnsi="Consolas"/>
+          <w:sz w:val="18"/>
+        </w:rPr>
+        <w:t>&lt;p class="microcopy"&gt;Future breathing, smartwatch, scheduled, and always-on modes are concepts only and are not implemented in this website.&lt;/p&gt;</w:t>
+      </w:r>
+    </w:p>
+    <w:p>
+      <w:pPr>
+        <w:keepNext/>
+      </w:pPr>
+      <w:r>
+        <w:rPr>
+          <w:b/>
+        </w:rPr>
+        <w:t xml:space="preserve">Meaning  </w:t>
+      </w:r>
+      <w:r>
+        <w:t>This paragraph labels several monitoring modes as unimplemented concepts.</w:t>
+      </w:r>
+    </w:p>
+    <w:p>
+      <w:r>
+        <w:rPr>
+          <w:b/>
+        </w:rPr>
+        <w:t xml:space="preserve">Contribution  </w:t>
+      </w:r>
+      <w:r>
+        <w:t>It limits how readers should interpret the sequence shown above it.</w:t>
+      </w:r>
+    </w:p>
+    <w:p>
+      <w:pPr>
+        <w:keepNext/>
+      </w:pPr>
+      <w:hyperlink r:id="rId18">
+        <w:r>
+          <w:rPr>
+            <w:color w:val="245A81"/>
+          </w:rPr>
+          <w:t>(index.html, line 144)</w:t>
+        </w:r>
+      </w:hyperlink>
+    </w:p>
+    <w:p>
+      <w:pPr>
+        <w:keepNext/>
+      </w:pPr>
+      <w:r>
+        <w:rPr>
+          <w:rFonts w:ascii="Consolas" w:hAnsi="Consolas"/>
+          <w:sz w:val="18"/>
+        </w:rPr>
+        <w:t>&lt;iframe title="Safeguard live location and motion tracker" src="fall-detection.html?embedded=1" allow="geolocation; accelerometer; gyroscope; autoplay" loading="lazy" style="width:100%;height:900px;border:0;border-radius:16px"&gt;&lt;/iframe&gt;</w:t>
+      </w:r>
+    </w:p>
+    <w:p>
+      <w:pPr>
+        <w:keepNext/>
+      </w:pPr>
+      <w:r>
+        <w:rPr>
+          <w:b/>
+        </w:rPr>
+        <w:t xml:space="preserve">Meaning  </w:t>
+      </w:r>
+      <w:r>
+        <w:t>Embeds the same tracker page in the existing dashboard.</w:t>
+      </w:r>
+    </w:p>
+    <w:p>
+      <w:r>
+        <w:rPr>
+          <w:b/>
+        </w:rPr>
+        <w:t xml:space="preserve">Contribution  </w:t>
+      </w:r>
+      <w:r>
+        <w:t>The iframe isolates the tracker’s controls and styling while allowing location and motion permissions.</w:t>
+      </w:r>
+    </w:p>
+    <w:p>
+      <w:pPr>
+        <w:pStyle w:val="Heading2"/>
+      </w:pPr>
+      <w:r>
+        <w:t>Shared navigation and experiment labels</w:t>
+      </w:r>
+    </w:p>
+    <w:p>
+      <w:pPr>
+        <w:keepNext/>
+      </w:pPr>
+      <w:r>
+        <w:t>nav.js</w:t>
+      </w:r>
+    </w:p>
+    <w:p>
+      <w:pPr>
+        <w:keepNext/>
+      </w:pPr>
+      <w:hyperlink r:id="rId19">
+        <w:r>
+          <w:rPr>
+            <w:color w:val="245A81"/>
+          </w:rPr>
+          <w:t>(nav.js, line 12)</w:t>
+        </w:r>
+      </w:hyperlink>
+    </w:p>
+    <w:p>
+      <w:pPr>
+        <w:keepNext/>
+      </w:pPr>
+      <w:r>
+        <w:rPr>
+          <w:rFonts w:ascii="Consolas" w:hAnsi="Consolas"/>
+          <w:sz w:val="18"/>
+        </w:rPr>
+        <w:t>const SITE = [</w:t>
+      </w:r>
+    </w:p>
+    <w:p>
+      <w:pPr>
+        <w:keepNext/>
+      </w:pPr>
+      <w:r>
+        <w:rPr>
+          <w:b/>
+        </w:rPr>
+        <w:t xml:space="preserve">Meaning  </w:t>
+      </w:r>
+      <w:r>
+        <w:t>This starts an array of grouped navigation records; later entries specify identifiers, URLs and labels.</w:t>
+      </w:r>
+    </w:p>
+    <w:p>
+      <w:r>
+        <w:rPr>
+          <w:b/>
+        </w:rPr>
+        <w:t xml:space="preserve">Contribution  </w:t>
+      </w:r>
+      <w:r>
+        <w:t>buildNav and buildFooter both read this shared list.</w:t>
+      </w:r>
+    </w:p>
+    <w:p>
+      <w:pPr>
+        <w:keepNext/>
+      </w:pPr>
+      <w:hyperlink r:id="rId19">
+        <w:r>
+          <w:rPr>
+            <w:color w:val="245A81"/>
+          </w:rPr>
+          <w:t>(nav.js, line 42)</w:t>
+        </w:r>
+      </w:hyperlink>
+    </w:p>
+    <w:p>
+      <w:pPr>
+        <w:keepNext/>
+      </w:pPr>
+      <w:r>
+        <w:rPr>
+          <w:rFonts w:ascii="Consolas" w:hAnsi="Consolas"/>
+          <w:sz w:val="18"/>
+        </w:rPr>
+        <w:t>const TRIAL = ["safewalk", "shelters", "hazard"];</w:t>
+      </w:r>
+    </w:p>
+    <w:p>
+      <w:pPr>
+        <w:keepNext/>
+      </w:pPr>
+      <w:r>
+        <w:rPr>
+          <w:b/>
+        </w:rPr>
+        <w:t xml:space="preserve">Meaning  </w:t>
+      </w:r>
+      <w:r>
+        <w:t>The array identifies the safewalk, shelters and hazard pages as supporting experiments.</w:t>
+      </w:r>
+    </w:p>
+    <w:p>
+      <w:r>
+        <w:rPr>
+          <w:b/>
+        </w:rPr>
+        <w:t xml:space="preserve">Contribution  </w:t>
+      </w:r>
+      <w:r>
+        <w:t>buildTrialBanner uses it to add explanatory banners.</w:t>
+      </w:r>
+    </w:p>
+    <w:p>
+      <w:pPr>
+        <w:keepNext/>
+      </w:pPr>
+      <w:hyperlink r:id="rId19">
+        <w:r>
+          <w:rPr>
+            <w:color w:val="245A81"/>
+          </w:rPr>
+          <w:t>(nav.js, line 53)</w:t>
+        </w:r>
+      </w:hyperlink>
+    </w:p>
+    <w:p>
+      <w:pPr>
+        <w:keepNext/>
+      </w:pPr>
+      <w:r>
+        <w:rPr>
+          <w:rFonts w:ascii="Consolas" w:hAnsi="Consolas"/>
+          <w:sz w:val="18"/>
+        </w:rPr>
+        <w:t>skip.href = "#main-content";</w:t>
+      </w:r>
+    </w:p>
+    <w:p>
+      <w:pPr>
+        <w:keepNext/>
+      </w:pPr>
+      <w:r>
+        <w:rPr>
+          <w:b/>
+        </w:rPr>
+        <w:t xml:space="preserve">Meaning  </w:t>
+      </w:r>
+      <w:r>
+        <w:t>This assigns an in-page fragment destination to the skip link.</w:t>
+      </w:r>
+    </w:p>
+    <w:p>
+      <w:r>
+        <w:rPr>
+          <w:b/>
+        </w:rPr>
+        <w:t xml:space="preserve">Contribution  </w:t>
+      </w:r>
+      <w:r>
+        <w:t>Keyboard users can jump past navigation to the main content.</w:t>
+      </w:r>
+    </w:p>
+    <w:p>
+      <w:pPr>
+        <w:pStyle w:val="Heading2"/>
+      </w:pPr>
+      <w:r>
+        <w:t>Illustrative area planning map</w:t>
+      </w:r>
+    </w:p>
+    <w:p>
+      <w:pPr>
+        <w:keepNext/>
+      </w:pPr>
+      <w:r>
+        <w:t>risk-zones.html</w:t>
+      </w:r>
+    </w:p>
+    <w:p>
+      <w:pPr>
+        <w:keepNext/>
+      </w:pPr>
+      <w:hyperlink r:id="rId20">
+        <w:r>
+          <w:rPr>
+            <w:color w:val="245A81"/>
+          </w:rPr>
+          <w:t>(risk-zones.html, line 124)</w:t>
+        </w:r>
+      </w:hyperlink>
+    </w:p>
+    <w:p>
+      <w:pPr>
+        <w:keepNext/>
+      </w:pPr>
+      <w:r>
+        <w:rPr>
+          <w:rFonts w:ascii="Consolas" w:hAnsi="Consolas"/>
+          <w:sz w:val="18"/>
+        </w:rPr>
+        <w:t>const MIN_CALLS = 5;        /* a zone below this is never drawn */</w:t>
+      </w:r>
+    </w:p>
+    <w:p>
+      <w:pPr>
+        <w:keepNext/>
+      </w:pPr>
+      <w:r>
+        <w:rPr>
+          <w:b/>
+        </w:rPr>
+        <w:t xml:space="preserve">Meaning  </w:t>
+      </w:r>
+      <w:r>
+        <w:t>This constant defines a minimum of five calls for a retained zone.</w:t>
+      </w:r>
+    </w:p>
+    <w:p>
+      <w:r>
+        <w:rPr>
+          <w:b/>
+        </w:rPr>
+        <w:t xml:space="preserve">Contribution  </w:t>
+      </w:r>
+      <w:r>
+        <w:t>The filter later removes lower-count groups.</w:t>
+      </w:r>
+    </w:p>
+    <w:p>
+      <w:pPr>
+        <w:keepNext/>
+      </w:pPr>
+      <w:hyperlink r:id="rId20">
+        <w:r>
+          <w:rPr>
+            <w:color w:val="245A81"/>
+          </w:rPr>
+          <w:t>(risk-zones.html, line 193)</w:t>
+        </w:r>
+      </w:hyperlink>
+    </w:p>
+    <w:p>
+      <w:pPr>
+        <w:keepNext/>
+      </w:pPr>
+      <w:r>
+        <w:rPr>
+          <w:rFonts w:ascii="Consolas" w:hAnsi="Consolas"/>
+          <w:sz w:val="18"/>
+        </w:rPr>
+        <w:t>const key = Math.round(e.lat / CELL) + ":" + Math.round(e.lon / CELL);</w:t>
+      </w:r>
+    </w:p>
+    <w:p>
+      <w:pPr>
+        <w:keepNext/>
+      </w:pPr>
+      <w:r>
+        <w:rPr>
+          <w:b/>
+        </w:rPr>
+        <w:t xml:space="preserve">Meaning  </w:t>
+      </w:r>
+      <w:r>
+        <w:t>The expression rounds latitude and longitude divided by CELL and joins them into a grouping key.</w:t>
+      </w:r>
+    </w:p>
+    <w:p>
+      <w:r>
+        <w:rPr>
+          <w:b/>
+        </w:rPr>
+        <w:t xml:space="preserve">Contribution  </w:t>
+      </w:r>
+      <w:r>
+        <w:t>Nearby coordinates fall into angular bins that can be aggregated.</w:t>
+      </w:r>
+    </w:p>
+    <w:p>
+      <w:pPr>
+        <w:keepNext/>
+      </w:pPr>
+      <w:hyperlink r:id="rId20">
+        <w:r>
+          <w:rPr>
+            <w:color w:val="245A81"/>
+          </w:rPr>
+          <w:t>(risk-zones.html, line 218)</w:t>
+        </w:r>
+      </w:hyperlink>
+    </w:p>
+    <w:p>
+      <w:pPr>
+        <w:keepNext/>
+      </w:pPr>
+      <w:r>
+        <w:rPr>
+          <w:rFonts w:ascii="Consolas" w:hAnsi="Consolas"/>
+          <w:sz w:val="18"/>
+        </w:rPr>
+        <w:t>const kept = all.filter(z =&gt; z.calls &gt;= MIN_CALLS);</w:t>
+      </w:r>
+    </w:p>
+    <w:p>
+      <w:pPr>
+        <w:keepNext/>
+      </w:pPr>
+      <w:r>
+        <w:rPr>
+          <w:b/>
+        </w:rPr>
+        <w:t xml:space="preserve">Meaning  </w:t>
+      </w:r>
+      <w:r>
+        <w:t>filter creates an array containing only zones whose count meets the threshold.</w:t>
+      </w:r>
+    </w:p>
+    <w:p>
+      <w:r>
+        <w:rPr>
+          <w:b/>
+        </w:rPr>
+        <w:t xml:space="preserve">Contribution  </w:t>
+      </w:r>
+      <w:r>
+        <w:t>It implements the earlier minimum-count rule before map and table rendering.</w:t>
+      </w:r>
+    </w:p>
+    <w:p>
+      <w:pPr>
+        <w:pStyle w:val="Heading2"/>
+      </w:pPr>
+      <w:r>
+        <w:t>Crawler instructions</w:t>
+      </w:r>
+    </w:p>
+    <w:p>
+      <w:pPr>
+        <w:keepNext/>
+      </w:pPr>
+      <w:r>
+        <w:t>robots.txt</w:t>
+      </w:r>
+    </w:p>
+    <w:p>
+      <w:pPr>
+        <w:keepNext/>
+      </w:pPr>
+      <w:hyperlink r:id="rId21">
+        <w:r>
+          <w:rPr>
+            <w:color w:val="245A81"/>
+          </w:rPr>
+          <w:t>(robots.txt, line 1)</w:t>
+        </w:r>
+      </w:hyperlink>
+    </w:p>
+    <w:p>
+      <w:pPr>
+        <w:keepNext/>
+      </w:pPr>
+      <w:r>
+        <w:rPr>
+          <w:rFonts w:ascii="Consolas" w:hAnsi="Consolas"/>
+          <w:sz w:val="18"/>
+        </w:rPr>
+        <w:t>User-agent: *</w:t>
+      </w:r>
+    </w:p>
+    <w:p>
+      <w:pPr>
+        <w:keepNext/>
+      </w:pPr>
+      <w:r>
+        <w:rPr>
+          <w:b/>
+        </w:rPr>
+        <w:t xml:space="preserve">Meaning  </w:t>
+      </w:r>
+      <w:r>
+        <w:t>The wildcard applies the following rule to all crawler user agents that honor this file.</w:t>
+      </w:r>
+    </w:p>
+    <w:p>
+      <w:r>
+        <w:rPr>
+          <w:b/>
+        </w:rPr>
+        <w:t xml:space="preserve">Contribution  </w:t>
+      </w:r>
+      <w:r>
+        <w:t>It defines the audience for the Allow directive.</w:t>
+      </w:r>
+    </w:p>
+    <w:p>
+      <w:pPr>
+        <w:keepNext/>
+      </w:pPr>
+      <w:hyperlink r:id="rId21">
+        <w:r>
+          <w:rPr>
+            <w:color w:val="245A81"/>
+          </w:rPr>
+          <w:t>(robots.txt, line 2)</w:t>
+        </w:r>
+      </w:hyperlink>
+    </w:p>
+    <w:p>
+      <w:pPr>
+        <w:keepNext/>
+      </w:pPr>
+      <w:r>
+        <w:rPr>
+          <w:rFonts w:ascii="Consolas" w:hAnsi="Consolas"/>
+          <w:sz w:val="18"/>
+        </w:rPr>
+        <w:t>Allow: /</w:t>
+      </w:r>
+    </w:p>
+    <w:p>
+      <w:pPr>
+        <w:keepNext/>
+      </w:pPr>
+      <w:r>
+        <w:rPr>
+          <w:b/>
+        </w:rPr>
+        <w:t xml:space="preserve">Meaning  </w:t>
+      </w:r>
+      <w:r>
+        <w:t>The directive permits crawling from the site root.</w:t>
+      </w:r>
+    </w:p>
+    <w:p>
+      <w:r>
+        <w:rPr>
+          <w:b/>
+        </w:rPr>
+        <w:t xml:space="preserve">Contribution  </w:t>
+      </w:r>
+      <w:r>
+        <w:t>It expresses crawler access, without forcing indexing or replacing access control.</w:t>
+      </w:r>
+    </w:p>
+    <w:p>
+      <w:pPr>
+        <w:pStyle w:val="Heading2"/>
+      </w:pPr>
+      <w:r>
+        <w:t>Timed check-in and map-search experiment</w:t>
+      </w:r>
+    </w:p>
+    <w:p>
+      <w:pPr>
+        <w:keepNext/>
+      </w:pPr>
+      <w:r>
+        <w:t>safewalk.html</w:t>
+      </w:r>
+    </w:p>
+    <w:p>
+      <w:pPr>
+        <w:keepNext/>
+      </w:pPr>
+      <w:hyperlink r:id="rId22">
+        <w:r>
+          <w:rPr>
+            <w:color w:val="245A81"/>
+          </w:rPr>
+          <w:t>(safewalk.html, line 176)</w:t>
+        </w:r>
+      </w:hyperlink>
+    </w:p>
+    <w:p>
+      <w:pPr>
+        <w:keepNext/>
+      </w:pPr>
+      <w:r>
+        <w:rPr>
+          <w:rFonts w:ascii="Consolas" w:hAnsi="Consolas"/>
+          <w:sz w:val="18"/>
+        </w:rPr>
+        <w:t>const GRACE_S = 300;             /* five minutes late before the alarm */</w:t>
+      </w:r>
+    </w:p>
+    <w:p>
+      <w:pPr>
+        <w:keepNext/>
+      </w:pPr>
+      <w:r>
+        <w:rPr>
+          <w:b/>
+        </w:rPr>
+        <w:t xml:space="preserve">Meaning  </w:t>
+      </w:r>
+      <w:r>
+        <w:t>This defines a five-minute lateness allowance in seconds.</w:t>
+      </w:r>
+    </w:p>
+    <w:p>
+      <w:r>
+        <w:rPr>
+          <w:b/>
+        </w:rPr>
+        <w:t xml:space="preserve">Contribution  </w:t>
+      </w:r>
+      <w:r>
+        <w:t>show uses it to decide when a walking session displays Late.</w:t>
+      </w:r>
+    </w:p>
+    <w:p>
+      <w:pPr>
+        <w:keepNext/>
+      </w:pPr>
+      <w:hyperlink r:id="rId22">
+        <w:r>
+          <w:rPr>
+            <w:color w:val="245A81"/>
+          </w:rPr>
+          <w:t>(safewalk.html, line 374)</w:t>
+        </w:r>
+      </w:hyperlink>
+    </w:p>
+    <w:p>
+      <w:pPr>
+        <w:keepNext/>
+      </w:pPr>
+      <w:r>
+        <w:rPr>
+          <w:rFonts w:ascii="Consolas" w:hAnsi="Consolas"/>
+          <w:sz w:val="18"/>
+        </w:rPr>
+        <w:t>if (lateBy &gt; GRACE_S) {</w:t>
+      </w:r>
+    </w:p>
+    <w:p>
+      <w:pPr>
+        <w:keepNext/>
+      </w:pPr>
+      <w:r>
+        <w:rPr>
+          <w:b/>
+        </w:rPr>
+        <w:t xml:space="preserve">Meaning  </w:t>
+      </w:r>
+      <w:r>
+        <w:t>This condition is true once lateness exceeds the grace duration.</w:t>
+      </w:r>
+    </w:p>
+    <w:p>
+      <w:r>
+        <w:rPr>
+          <w:b/>
+        </w:rPr>
+        <w:t xml:space="preserve">Contribution  </w:t>
+      </w:r>
+      <w:r>
+        <w:t>Its branch changes the displayed state and asks the reader to call the walker.</w:t>
+      </w:r>
+    </w:p>
+    <w:p>
+      <w:pPr>
+        <w:keepNext/>
+      </w:pPr>
+      <w:hyperlink r:id="rId22">
+        <w:r>
+          <w:rPr>
+            <w:color w:val="245A81"/>
+          </w:rPr>
+          <w:t>(safewalk.html, line 404)</w:t>
+        </w:r>
+      </w:hyperlink>
+    </w:p>
+    <w:p>
+      <w:pPr>
+        <w:keepNext/>
+      </w:pPr>
+      <w:r>
+        <w:rPr>
+          <w:rFonts w:ascii="Consolas" w:hAnsi="Consolas"/>
+          <w:sz w:val="18"/>
+        </w:rPr>
+        <w:t>eta: Date.now() + mins * 60000,</w:t>
+      </w:r>
+    </w:p>
+    <w:p>
+      <w:pPr>
+        <w:keepNext/>
+      </w:pPr>
+      <w:r>
+        <w:rPr>
+          <w:b/>
+        </w:rPr>
+        <w:t xml:space="preserve">Meaning  </w:t>
+      </w:r>
+      <w:r>
+        <w:t>It converts the selected minutes to milliseconds and adds them to the current timestamp.</w:t>
+      </w:r>
+    </w:p>
+    <w:p>
+      <w:r>
+        <w:rPr>
+          <w:b/>
+        </w:rPr>
+        <w:t xml:space="preserve">Contribution  </w:t>
+      </w:r>
+      <w:r>
+        <w:t>The stored ETA survives a page reload without restarting the original duration.</w:t>
+      </w:r>
+    </w:p>
+    <w:p>
+      <w:pPr>
+        <w:pStyle w:val="Heading2"/>
+      </w:pPr>
+      <w:r>
+        <w:t>Legacy illustrative dashboard renderer</w:t>
+      </w:r>
+    </w:p>
+    <w:p>
+      <w:pPr>
+        <w:keepNext/>
+      </w:pPr>
+      <w:r>
+        <w:t>script.js</w:t>
+      </w:r>
+    </w:p>
+    <w:p>
+      <w:pPr>
+        <w:keepNext/>
+      </w:pPr>
+      <w:hyperlink r:id="rId23">
+        <w:r>
+          <w:rPr>
+            <w:color w:val="245A81"/>
+          </w:rPr>
+          <w:t>(script.js, line 24)</w:t>
+        </w:r>
+      </w:hyperlink>
+    </w:p>
+    <w:p>
+      <w:pPr>
+        <w:keepNext/>
+      </w:pPr>
+      <w:r>
+        <w:rPr>
+          <w:rFonts w:ascii="Consolas" w:hAnsi="Consolas"/>
+          <w:sz w:val="18"/>
+        </w:rPr>
+        <w:t>const CITIES = [</w:t>
+      </w:r>
+    </w:p>
+    <w:p>
+      <w:pPr>
+        <w:keepNext/>
+      </w:pPr>
+      <w:r>
+        <w:rPr>
+          <w:b/>
+        </w:rPr>
+        <w:t xml:space="preserve">Meaning  </w:t>
+      </w:r>
+      <w:r>
+        <w:t>This begins an array of hand-entered city records with rate, trend and band values.</w:t>
+      </w:r>
+    </w:p>
+    <w:p>
+      <w:r>
+        <w:rPr>
+          <w:b/>
+        </w:rPr>
+        <w:t xml:space="preserve">Contribution  </w:t>
+      </w:r>
+      <w:r>
+        <w:t>The functions below calculate and display values from these records.</w:t>
+      </w:r>
+    </w:p>
+    <w:p>
+      <w:pPr>
+        <w:keepNext/>
+      </w:pPr>
+      <w:hyperlink r:id="rId23">
+        <w:r>
+          <w:rPr>
+            <w:color w:val="245A81"/>
+          </w:rPr>
+          <w:t>(script.js, line 109)</w:t>
+        </w:r>
+      </w:hyperlink>
+    </w:p>
+    <w:p>
+      <w:pPr>
+        <w:keepNext/>
+      </w:pPr>
+      <w:r>
+        <w:rPr>
+          <w:rFonts w:ascii="Consolas" w:hAnsi="Consolas"/>
+          <w:sz w:val="18"/>
+        </w:rPr>
+        <w:t>tag.textContent = "Illustrative";</w:t>
+      </w:r>
+    </w:p>
+    <w:p>
+      <w:pPr>
+        <w:keepNext/>
+      </w:pPr>
+      <w:r>
+        <w:rPr>
+          <w:b/>
+        </w:rPr>
+        <w:t xml:space="preserve">Meaning  </w:t>
+      </w:r>
+      <w:r>
+        <w:t>It sets a row label to the literal word Illustrative.</w:t>
+      </w:r>
+    </w:p>
+    <w:p>
+      <w:r>
+        <w:rPr>
+          <w:b/>
+        </w:rPr>
+        <w:t xml:space="preserve">Contribution  </w:t>
+      </w:r>
+      <w:r>
+        <w:t>When the legacy renderer is used, each row identifies its demonstration status.</w:t>
+      </w:r>
+    </w:p>
+    <w:p>
+      <w:pPr>
+        <w:pStyle w:val="Heading2"/>
+      </w:pPr>
+      <w:r>
+        <w:t>Nearby support resource experiment</w:t>
+      </w:r>
+    </w:p>
+    <w:p>
+      <w:pPr>
+        <w:keepNext/>
+      </w:pPr>
+      <w:r>
+        <w:t>shelters.html</w:t>
+      </w:r>
+    </w:p>
+    <w:p>
+      <w:pPr>
+        <w:keepNext/>
+      </w:pPr>
+      <w:hyperlink r:id="rId24">
+        <w:r>
+          <w:rPr>
+            <w:color w:val="245A81"/>
+          </w:rPr>
+          <w:t>(shelters.html, line 89)</w:t>
+        </w:r>
+      </w:hyperlink>
+    </w:p>
+    <w:p>
+      <w:pPr>
+        <w:keepNext/>
+      </w:pPr>
+      <w:r>
+        <w:rPr>
+          <w:rFonts w:ascii="Consolas" w:hAnsi="Consolas"/>
+          <w:sz w:val="18"/>
+        </w:rPr>
+        <w:t>const NEAREST = 5;</w:t>
+      </w:r>
+    </w:p>
+    <w:p>
+      <w:pPr>
+        <w:keepNext/>
+      </w:pPr>
+      <w:r>
+        <w:rPr>
+          <w:b/>
+        </w:rPr>
+        <w:t xml:space="preserve">Meaning  </w:t>
+      </w:r>
+      <w:r>
+        <w:t>This sets the maximum number of rows selected for the displayed list.</w:t>
+      </w:r>
+    </w:p>
+    <w:p>
+      <w:r>
+        <w:rPr>
+          <w:b/>
+        </w:rPr>
+        <w:t xml:space="preserve">Contribution  </w:t>
+      </w:r>
+      <w:r>
+        <w:t>draw limits the results to five records.</w:t>
+      </w:r>
+    </w:p>
+    <w:p>
+      <w:pPr>
+        <w:keepNext/>
+      </w:pPr>
+      <w:hyperlink r:id="rId24">
+        <w:r>
+          <w:rPr>
+            <w:color w:val="245A81"/>
+          </w:rPr>
+          <w:t>(shelters.html, line 182)</w:t>
+        </w:r>
+      </w:hyperlink>
+    </w:p>
+    <w:p>
+      <w:pPr>
+        <w:keepNext/>
+      </w:pPr>
+      <w:r>
+        <w:rPr>
+          <w:rFonts w:ascii="Consolas" w:hAnsi="Consolas"/>
+          <w:sz w:val="18"/>
+        </w:rPr>
+        <w:t>rows.sort((a, b) =&gt; metres(me, a) - metres(me, b));</w:t>
+      </w:r>
+    </w:p>
+    <w:p>
+      <w:pPr>
+        <w:keepNext/>
+      </w:pPr>
+      <w:r>
+        <w:rPr>
+          <w:b/>
+        </w:rPr>
+        <w:t xml:space="preserve">Meaning  </w:t>
+      </w:r>
+      <w:r>
+        <w:t>The comparator sorts by increasing straight-line distance from the user.</w:t>
+      </w:r>
+    </w:p>
+    <w:p>
+      <w:r>
+        <w:rPr>
+          <w:b/>
+        </w:rPr>
+        <w:t xml:space="preserve">Contribution  </w:t>
+      </w:r>
+      <w:r>
+        <w:t>After location is available, the closest records appear first before the list is sliced.</w:t>
+      </w:r>
+    </w:p>
+    <w:p>
+      <w:pPr>
+        <w:keepNext/>
+      </w:pPr>
+      <w:hyperlink r:id="rId24">
+        <w:r>
+          <w:rPr>
+            <w:color w:val="245A81"/>
+          </w:rPr>
+          <w:t>(shelters.html, line 315)</w:t>
+        </w:r>
+      </w:hyperlink>
+    </w:p>
+    <w:p>
+      <w:pPr>
+        <w:keepNext/>
+      </w:pPr>
+      <w:r>
+        <w:rPr>
+          <w:rFonts w:ascii="Consolas" w:hAnsi="Consolas"/>
+          <w:sz w:val="18"/>
+        </w:rPr>
+        <w:t>useLocation(false);</w:t>
+      </w:r>
+    </w:p>
+    <w:p>
+      <w:pPr>
+        <w:keepNext/>
+      </w:pPr>
+      <w:r>
+        <w:rPr>
+          <w:b/>
+        </w:rPr>
+        <w:t xml:space="preserve">Meaning  </w:t>
+      </w:r>
+      <w:r>
+        <w:t>This invokes useLocation during page startup with the fromButton flag set to false.</w:t>
+      </w:r>
+    </w:p>
+    <w:p>
+      <w:r>
+        <w:rPr>
+          <w:b/>
+        </w:rPr>
+        <w:t xml:space="preserve">Contribution  </w:t>
+      </w:r>
+      <w:r>
+        <w:t>The page requests browser location at startup as well as offering a button.</w:t>
+      </w:r>
+    </w:p>
+    <w:p>
+      <w:pPr>
+        <w:pStyle w:val="Heading2"/>
+      </w:pPr>
+      <w:r>
+        <w:t>Shared visual styles</w:t>
+      </w:r>
+    </w:p>
+    <w:p>
+      <w:pPr>
+        <w:keepNext/>
+      </w:pPr>
+      <w:r>
+        <w:t>site.css</w:t>
+      </w:r>
+    </w:p>
+    <w:p>
+      <w:pPr>
+        <w:keepNext/>
+      </w:pPr>
+      <w:hyperlink r:id="rId25">
+        <w:r>
+          <w:rPr>
+            <w:color w:val="245A81"/>
+          </w:rPr>
+          <w:t>(site.css, line 463)</w:t>
+        </w:r>
+      </w:hyperlink>
+    </w:p>
+    <w:p>
+      <w:pPr>
+        <w:keepNext/>
+      </w:pPr>
+      <w:r>
+        <w:rPr>
+          <w:rFonts w:ascii="Consolas" w:hAnsi="Consolas"/>
+          <w:sz w:val="18"/>
+        </w:rPr>
+        <w:t>outline: 3px solid var(--blue);</w:t>
+      </w:r>
+    </w:p>
+    <w:p>
+      <w:pPr>
+        <w:keepNext/>
+      </w:pPr>
+      <w:r>
+        <w:rPr>
+          <w:b/>
+        </w:rPr>
+        <w:t xml:space="preserve">Meaning  </w:t>
+      </w:r>
+      <w:r>
+        <w:t>This declaration draws a three-pixel outline using the blue custom property within the focus-visible rule.</w:t>
+      </w:r>
+    </w:p>
+    <w:p>
+      <w:r>
+        <w:rPr>
+          <w:b/>
+        </w:rPr>
+        <w:t xml:space="preserve">Contribution  </w:t>
+      </w:r>
+      <w:r>
+        <w:t>It marks the focused button or link for keyboard interaction.</w:t>
+      </w:r>
+    </w:p>
+    <w:p>
+      <w:pPr>
+        <w:keepNext/>
+      </w:pPr>
+      <w:hyperlink r:id="rId25">
+        <w:r>
+          <w:rPr>
+            <w:color w:val="245A81"/>
+          </w:rPr>
+          <w:t>(site.css, line 1126)</w:t>
+        </w:r>
+      </w:hyperlink>
+    </w:p>
+    <w:p>
+      <w:pPr>
+        <w:keepNext/>
+      </w:pPr>
+      <w:r>
+        <w:rPr>
+          <w:rFonts w:ascii="Consolas" w:hAnsi="Consolas"/>
+          <w:sz w:val="18"/>
+        </w:rPr>
+        <w:t>.care-dialog { width: min(430px, calc(100% - 32px)); padding: 24px; background: #202122; color: var(--text); border: 1px solid var(--line); }</w:t>
+      </w:r>
+    </w:p>
+    <w:p>
+      <w:pPr>
+        <w:keepNext/>
+      </w:pPr>
+      <w:r>
+        <w:rPr>
+          <w:b/>
+        </w:rPr>
+        <w:t xml:space="preserve">Meaning  </w:t>
+      </w:r>
+      <w:r>
+        <w:t>The selector targets care dialogs. min limits width to 430 pixels or the viewport minus 32 pixels; other declarations set padding, colors and border.</w:t>
+      </w:r>
+    </w:p>
+    <w:p>
+      <w:r>
+        <w:rPr>
+          <w:b/>
+        </w:rPr>
+        <w:t xml:space="preserve">Contribution  </w:t>
+      </w:r>
+      <w:r>
+        <w:t>It sizes and styles the prompt opened when the drop alarm stops.</w:t>
+      </w:r>
+    </w:p>
+    <w:p>
+      <w:pPr>
+        <w:pStyle w:val="Heading2"/>
+      </w:pPr>
+      <w:r>
+        <w:t>Optional ordinary interface sounds</w:t>
+      </w:r>
+    </w:p>
+    <w:p>
+      <w:pPr>
+        <w:keepNext/>
+      </w:pPr>
+      <w:r>
+        <w:t>sound.js</w:t>
+      </w:r>
+    </w:p>
+    <w:p>
+      <w:pPr>
+        <w:keepNext/>
+      </w:pPr>
+      <w:hyperlink r:id="rId26">
+        <w:r>
+          <w:rPr>
+            <w:color w:val="245A81"/>
+          </w:rPr>
+          <w:t>(sound.js, line 9)</w:t>
+        </w:r>
+      </w:hyperlink>
+    </w:p>
+    <w:p>
+      <w:pPr>
+        <w:keepNext/>
+      </w:pPr>
+      <w:r>
+        <w:rPr>
+          <w:rFonts w:ascii="Consolas" w:hAnsi="Consolas"/>
+          <w:sz w:val="18"/>
+        </w:rPr>
+        <w:t>const SOUND_FILE = "click.mp3";</w:t>
+      </w:r>
+    </w:p>
+    <w:p>
+      <w:pPr>
+        <w:keepNext/>
+      </w:pPr>
+      <w:r>
+        <w:rPr>
+          <w:b/>
+        </w:rPr>
+        <w:t xml:space="preserve">Meaning  </w:t>
+      </w:r>
+      <w:r>
+        <w:t>This constant names the audio file fetched and decoded for interface feedback.</w:t>
+      </w:r>
+    </w:p>
+    <w:p>
+      <w:r>
+        <w:rPr>
+          <w:b/>
+        </w:rPr>
+        <w:t xml:space="preserve">Contribution  </w:t>
+      </w:r>
+      <w:r>
+        <w:t>It keeps ordinary clicks separate from warning-alarm.mp3.</w:t>
+      </w:r>
+    </w:p>
+    <w:p>
+      <w:pPr>
+        <w:keepNext/>
+      </w:pPr>
+      <w:hyperlink r:id="rId26">
+        <w:r>
+          <w:rPr>
+            <w:color w:val="245A81"/>
+          </w:rPr>
+          <w:t>(sound.js, line 132)</w:t>
+        </w:r>
+      </w:hyperlink>
+    </w:p>
+    <w:p>
+      <w:pPr>
+        <w:keepNext/>
+      </w:pPr>
+      <w:r>
+        <w:rPr>
+          <w:rFonts w:ascii="Consolas" w:hAnsi="Consolas"/>
+          <w:sz w:val="18"/>
+        </w:rPr>
+        <w:t>localStorage.setItem(MUTE_KEY, muted ? "1" : "0");</w:t>
+      </w:r>
+    </w:p>
+    <w:p>
+      <w:pPr>
+        <w:keepNext/>
+      </w:pPr>
+      <w:r>
+        <w:rPr>
+          <w:b/>
+        </w:rPr>
+        <w:t xml:space="preserve">Meaning  </w:t>
+      </w:r>
+      <w:r>
+        <w:t>The conditional expression converts the mute state to 1 or 0 and saves it locally.</w:t>
+      </w:r>
+    </w:p>
+    <w:p>
+      <w:r>
+        <w:rPr>
+          <w:b/>
+        </w:rPr>
+        <w:t xml:space="preserve">Contribution  </w:t>
+      </w:r>
+      <w:r>
+        <w:t>The next page load restores the ordinary interface-sound preference.</w:t>
+      </w:r>
+    </w:p>
+    <w:p>
+      <w:pPr>
+        <w:pStyle w:val="Heading2"/>
+      </w:pPr>
+      <w:r>
+        <w:t>Homepage cards and responsive layout</w:t>
+      </w:r>
+    </w:p>
+    <w:p>
+      <w:pPr>
+        <w:keepNext/>
+      </w:pPr>
+      <w:r>
+        <w:t>styles.css</w:t>
+      </w:r>
+    </w:p>
+    <w:p>
+      <w:pPr>
+        <w:keepNext/>
+      </w:pPr>
+      <w:hyperlink r:id="rId27">
+        <w:r>
+          <w:rPr>
+            <w:color w:val="245A81"/>
+          </w:rPr>
+          <w:t>(styles.css, line 785)</w:t>
+        </w:r>
+      </w:hyperlink>
+    </w:p>
+    <w:p>
+      <w:pPr>
+        <w:keepNext/>
+      </w:pPr>
+      <w:r>
+        <w:rPr>
+          <w:rFonts w:ascii="Consolas" w:hAnsi="Consolas"/>
+          <w:sz w:val="18"/>
+        </w:rPr>
+        <w:t>.choice-grid { display: grid; grid-template-columns: repeat(3, 1fr); gap: 14px; }</w:t>
+      </w:r>
+    </w:p>
+    <w:p>
+      <w:pPr>
+        <w:keepNext/>
+      </w:pPr>
+      <w:r>
+        <w:rPr>
+          <w:b/>
+        </w:rPr>
+        <w:t xml:space="preserve">Meaning  </w:t>
+      </w:r>
+      <w:r>
+        <w:t>The rule creates a grid with three equally sized columns and fourteen-pixel gaps.</w:t>
+      </w:r>
+    </w:p>
+    <w:p>
+      <w:r>
+        <w:rPr>
+          <w:b/>
+        </w:rPr>
+        <w:t xml:space="preserve">Contribution  </w:t>
+      </w:r>
+      <w:r>
+        <w:t>It lays out the three homepage choice cards on wider screens.</w:t>
+      </w:r>
+    </w:p>
+    <w:p>
+      <w:pPr>
+        <w:keepNext/>
+      </w:pPr>
+      <w:hyperlink r:id="rId27">
+        <w:r>
+          <w:rPr>
+            <w:color w:val="245A81"/>
+          </w:rPr>
+          <w:t>(styles.css, line 826)</w:t>
+        </w:r>
+      </w:hyperlink>
+    </w:p>
+    <w:p>
+      <w:pPr>
+        <w:keepNext/>
+      </w:pPr>
+      <w:r>
+        <w:rPr>
+          <w:rFonts w:ascii="Consolas" w:hAnsi="Consolas"/>
+          <w:sz w:val="18"/>
+        </w:rPr>
+        <w:t>.choice-grid, .sequence-list, .local-facts { grid-template-columns: 1fr; }</w:t>
+      </w:r>
+    </w:p>
+    <w:p>
+      <w:pPr>
+        <w:keepNext/>
+      </w:pPr>
+      <w:r>
+        <w:rPr>
+          <w:b/>
+        </w:rPr>
+        <w:t xml:space="preserve">Meaning  </w:t>
+      </w:r>
+      <w:r>
+        <w:t>Inside the max-width 800px media query, the rule changes these grids to one column.</w:t>
+      </w:r>
+    </w:p>
+    <w:p>
+      <w:r>
+        <w:rPr>
+          <w:b/>
+        </w:rPr>
+        <w:t xml:space="preserve">Contribution  </w:t>
+      </w:r>
+      <w:r>
+        <w:t>The homepage stacks choices and explanatory sections on narrower screens.</w:t>
+      </w:r>
+    </w:p>
+    <w:p>
+      <w:pPr>
+        <w:pStyle w:val="Heading2"/>
+      </w:pPr>
+      <w:r>
+        <w:t>Generator for the earlier mission presentation</w:t>
+      </w:r>
+    </w:p>
+    <w:p>
+      <w:pPr>
+        <w:keepNext/>
+      </w:pPr>
+      <w:r>
+        <w:t>documentation/build_prompt_aligned_presentation.py</w:t>
+      </w:r>
+    </w:p>
+    <w:p>
+      <w:pPr>
+        <w:keepNext/>
+      </w:pPr>
+      <w:hyperlink r:id="rId28">
+        <w:r>
+          <w:rPr>
+            <w:color w:val="245A81"/>
+          </w:rPr>
+          <w:t>(documentation/build_prompt_aligned_presentation.py, line 9)</w:t>
+        </w:r>
+      </w:hyperlink>
+    </w:p>
+    <w:p>
+      <w:pPr>
+        <w:keepNext/>
+      </w:pPr>
+      <w:r>
+        <w:rPr>
+          <w:rFonts w:ascii="Consolas" w:hAnsi="Consolas"/>
+          <w:sz w:val="18"/>
+        </w:rPr>
+        <w:t>OUT = r"C:\Users\rishi\Downloads\public_safety_hackathon_site\public_safety_hackathon_final\documentation\Safeguard_Prompt_Aligned_Code_Presentation.docx"</w:t>
+      </w:r>
+    </w:p>
+    <w:p>
+      <w:pPr>
+        <w:keepNext/>
+      </w:pPr>
+      <w:r>
+        <w:rPr>
+          <w:b/>
+        </w:rPr>
+        <w:t xml:space="preserve">Meaning  </w:t>
+      </w:r>
+      <w:r>
+        <w:t>This assigns a raw-string Windows output path to OUT; the r prefix keeps backslashes literal.</w:t>
+      </w:r>
+    </w:p>
+    <w:p>
+      <w:r>
+        <w:rPr>
+          <w:b/>
+        </w:rPr>
+        <w:t xml:space="preserve">Contribution  </w:t>
+      </w:r>
+      <w:r>
+        <w:t>The generator saves its document to this machine-specific destination.</w:t>
+      </w:r>
+    </w:p>
+    <w:p>
+      <w:pPr>
+        <w:pStyle w:val="Heading2"/>
+      </w:pPr>
+      <w:r>
+        <w:t>Generator for the earlier short talk</w:t>
+      </w:r>
+    </w:p>
+    <w:p>
+      <w:pPr>
+        <w:keepNext/>
+      </w:pPr>
+      <w:r>
+        <w:t>documentation/build_pulseguard_105s_presentation.py</w:t>
+      </w:r>
+    </w:p>
+    <w:p>
+      <w:pPr>
+        <w:keepNext/>
+      </w:pPr>
+      <w:hyperlink r:id="rId29">
+        <w:r>
+          <w:rPr>
+            <w:color w:val="245A81"/>
+          </w:rPr>
+          <w:t>(documentation/build_pulseguard_105s_presentation.py, line 12)</w:t>
+        </w:r>
+      </w:hyperlink>
+    </w:p>
+    <w:p>
+      <w:pPr>
+        <w:keepNext/>
+      </w:pPr>
+      <w:r>
+        <w:rPr>
+          <w:rFonts w:ascii="Consolas" w:hAnsi="Consolas"/>
+          <w:sz w:val="18"/>
+        </w:rPr>
+        <w:t>talk = [</w:t>
+      </w:r>
+    </w:p>
+    <w:p>
+      <w:pPr>
+        <w:keepNext/>
+      </w:pPr>
+      <w:r>
+        <w:rPr>
+          <w:b/>
+        </w:rPr>
+        <w:t xml:space="preserve">Meaning  </w:t>
+      </w:r>
+      <w:r>
+        <w:t>This begins a Python list containing the presenter's paragraphs.</w:t>
+      </w:r>
+    </w:p>
+    <w:p>
+      <w:r>
+        <w:rPr>
+          <w:b/>
+        </w:rPr>
+        <w:t xml:space="preserve">Contribution  </w:t>
+      </w:r>
+      <w:r>
+        <w:t>Later code writes these strings into Word and calculates a spoken word count.</w:t>
+      </w:r>
+    </w:p>
+    <w:p>
+      <w:pPr>
+        <w:pStyle w:val="Heading2"/>
+      </w:pPr>
+      <w:r>
+        <w:t>Generator for the earlier two-minute talk</w:t>
+      </w:r>
+    </w:p>
+    <w:p>
+      <w:pPr>
+        <w:keepNext/>
+      </w:pPr>
+      <w:r>
+        <w:t>documentation/build_two_minute_presentation.py</w:t>
+      </w:r>
+    </w:p>
+    <w:p>
+      <w:pPr>
+        <w:keepNext/>
+      </w:pPr>
+      <w:hyperlink r:id="rId30">
+        <w:r>
+          <w:rPr>
+            <w:color w:val="245A81"/>
+          </w:rPr>
+          <w:t>(documentation/build_two_minute_presentation.py, line 11)</w:t>
+        </w:r>
+      </w:hyperlink>
+    </w:p>
+    <w:p>
+      <w:pPr>
+        <w:keepNext/>
+      </w:pPr>
+      <w:r>
+        <w:rPr>
+          <w:rFonts w:ascii="Consolas" w:hAnsi="Consolas"/>
+          <w:sz w:val="18"/>
+        </w:rPr>
+        <w:t>OUT = r"C:\Users\rishi\Downloads\public_safety_hackathon_site\PulseGuard_Code_Presentation.docx"</w:t>
+      </w:r>
+    </w:p>
+    <w:p>
+      <w:pPr>
+        <w:keepNext/>
+      </w:pPr>
+      <w:r>
+        <w:rPr>
+          <w:b/>
+        </w:rPr>
+        <w:t xml:space="preserve">Meaning  </w:t>
+      </w:r>
+      <w:r>
+        <w:t>This raw string defines the destination of the generated Word document.</w:t>
+      </w:r>
+    </w:p>
+    <w:p>
+      <w:r>
+        <w:rPr>
+          <w:b/>
+        </w:rPr>
+        <w:t xml:space="preserve">Contribution  </w:t>
+      </w:r>
+      <w:r>
+        <w:t>doc.save uses OUT when the script is executed.</w:t>
+      </w:r>
+    </w:p>
+    <w:p>
+      <w:pPr>
+        <w:pStyle w:val="Heading2"/>
+      </w:pPr>
+      <w:r>
+        <w:t>Generator for yesterday's repository-wide presentation</w:t>
+      </w:r>
+    </w:p>
+    <w:p>
+      <w:pPr>
+        <w:keepNext/>
+      </w:pPr>
+      <w:r>
+        <w:t>documentation/build_repo_file_bullets.py</w:t>
+      </w:r>
+    </w:p>
+    <w:p>
+      <w:pPr>
+        <w:keepNext/>
+      </w:pPr>
+      <w:hyperlink r:id="rId31">
+        <w:r>
+          <w:rPr>
+            <w:color w:val="245A81"/>
+          </w:rPr>
+          <w:t>(documentation/build_repo_file_bullets.py, line 13)</w:t>
+        </w:r>
+      </w:hyperlink>
+    </w:p>
+    <w:p>
+      <w:pPr>
+        <w:keepNext/>
+      </w:pPr>
+      <w:r>
+        <w:rPr>
+          <w:rFonts w:ascii="Consolas" w:hAnsi="Consolas"/>
+          <w:sz w:val="18"/>
+        </w:rPr>
+        <w:t>ENTRIES = [</w:t>
+      </w:r>
+    </w:p>
+    <w:p>
+      <w:pPr>
+        <w:keepNext/>
+      </w:pPr>
+      <w:r>
+        <w:rPr>
+          <w:b/>
+        </w:rPr>
+        <w:t xml:space="preserve">Meaning  </w:t>
+      </w:r>
+      <w:r>
+        <w:t>This begins a list of records containing a file, feature, explanation and search fragment.</w:t>
+      </w:r>
+    </w:p>
+    <w:p>
+      <w:r>
+        <w:rPr>
+          <w:b/>
+        </w:rPr>
+        <w:t xml:space="preserve">Contribution  </w:t>
+      </w:r>
+      <w:r>
+        <w:t>The generator processes these records to create the file-by-file presentation.</w:t>
+      </w:r>
+    </w:p>
+    <w:p>
+      <w:pPr>
+        <w:keepNext/>
+      </w:pPr>
+      <w:hyperlink r:id="rId31">
+        <w:r>
+          <w:rPr>
+            <w:color w:val="245A81"/>
+          </w:rPr>
+          <w:t>(documentation/build_repo_file_bullets.py, line 57)</w:t>
+        </w:r>
+      </w:hyperlink>
+    </w:p>
+    <w:p>
+      <w:pPr>
+        <w:keepNext/>
+      </w:pPr>
+      <w:r>
+        <w:rPr>
+          <w:rFonts w:ascii="Consolas" w:hAnsi="Consolas"/>
+          <w:sz w:val="18"/>
+        </w:rPr>
+        <w:t>for number, line in enumerate(lines, 1):</w:t>
+      </w:r>
+    </w:p>
+    <w:p>
+      <w:pPr>
+        <w:keepNext/>
+      </w:pPr>
+      <w:r>
+        <w:rPr>
+          <w:b/>
+        </w:rPr>
+        <w:t xml:space="preserve">Meaning  </w:t>
+      </w:r>
+      <w:r>
+        <w:t>enumerate pairs each source line with a number starting at one.</w:t>
+      </w:r>
+    </w:p>
+    <w:p>
+      <w:r>
+        <w:rPr>
+          <w:b/>
+        </w:rPr>
+        <w:t xml:space="preserve">Contribution  </w:t>
+      </w:r>
+      <w:r>
+        <w:t>locate searches these lines and returns the number of a matching fragment.</w:t>
+      </w:r>
+    </w:p>
+    <w:p>
+      <w:pPr>
+        <w:pStyle w:val="Heading2"/>
+      </w:pPr>
+      <w:r>
+        <w:t>Supporting file config.example</w:t>
+      </w:r>
+    </w:p>
+    <w:p>
+      <w:pPr>
+        <w:keepNext/>
+      </w:pPr>
+      <w:r>
+        <w:t>config.example.js</w:t>
+      </w:r>
+    </w:p>
+    <w:p>
+      <w:pPr>
+        <w:keepNext/>
+      </w:pPr>
+      <w:hyperlink r:id="rId32">
+        <w:r>
+          <w:rPr>
+            <w:color w:val="245A81"/>
+          </w:rPr>
+          <w:t>(config.example.js, line 1)</w:t>
+        </w:r>
+      </w:hyperlink>
+    </w:p>
+    <w:p>
+      <w:pPr>
+        <w:keepNext/>
+      </w:pPr>
+      <w:r>
+        <w:rPr>
+          <w:rFonts w:ascii="Consolas" w:hAnsi="Consolas"/>
+          <w:sz w:val="18"/>
+        </w:rPr>
+        <w:t>// Copy this file to config.js and use a browser-restricted Google Maps key.</w:t>
+      </w:r>
+    </w:p>
+    <w:p>
+      <w:pPr>
+        <w:keepNext/>
+      </w:pPr>
+      <w:r>
+        <w:rPr>
+          <w:b/>
+        </w:rPr>
+        <w:t xml:space="preserve">Meaning  </w:t>
+      </w:r>
+      <w:r>
+        <w:t>Introduces this supporting file’s configuration or source context.</w:t>
+      </w:r>
+    </w:p>
+    <w:p>
+      <w:r>
+        <w:rPr>
+          <w:b/>
+        </w:rPr>
+        <w:t xml:space="preserve">Contribution  </w:t>
+      </w:r>
+      <w:r>
+        <w:t>This file supports project setup or document generation rather than live detection.</w:t>
+      </w:r>
+    </w:p>
+    <w:p>
+      <w:pPr>
+        <w:pStyle w:val="Heading2"/>
+      </w:pPr>
+      <w:r>
+        <w:t>Supporting file build pulseguard 95s presentation</w:t>
+      </w:r>
+    </w:p>
+    <w:p>
+      <w:pPr>
+        <w:keepNext/>
+      </w:pPr>
+      <w:r>
+        <w:t>documentation/build_pulseguard_95s_presentation.py</w:t>
+      </w:r>
+    </w:p>
+    <w:p>
+      <w:pPr>
+        <w:keepNext/>
+      </w:pPr>
+      <w:hyperlink r:id="rId33">
+        <w:r>
+          <w:rPr>
+            <w:color w:val="245A81"/>
+          </w:rPr>
+          <w:t>(documentation/build_pulseguard_95s_presentation.py, line 2)</w:t>
+        </w:r>
+      </w:hyperlink>
+    </w:p>
+    <w:p>
+      <w:pPr>
+        <w:keepNext/>
+      </w:pPr>
+      <w:r>
+        <w:rPr>
+          <w:rFonts w:ascii="Consolas" w:hAnsi="Consolas"/>
+          <w:sz w:val="18"/>
+        </w:rPr>
+        <w:t>from pathlib import Path</w:t>
+      </w:r>
+    </w:p>
+    <w:p>
+      <w:pPr>
+        <w:keepNext/>
+      </w:pPr>
+      <w:r>
+        <w:rPr>
+          <w:b/>
+        </w:rPr>
+        <w:t xml:space="preserve">Meaning  </w:t>
+      </w:r>
+      <w:r>
+        <w:t>Introduces this supporting file’s configuration or source context.</w:t>
+      </w:r>
+    </w:p>
+    <w:p>
+      <w:r>
+        <w:rPr>
+          <w:b/>
+        </w:rPr>
+        <w:t xml:space="preserve">Contribution  </w:t>
+      </w:r>
+      <w:r>
+        <w:t>This file supports project setup or document generation rather than live detection.</w:t>
+      </w:r>
+    </w:p>
+    <w:p>
+      <w:pPr>
+        <w:pStyle w:val="Heading1"/>
+      </w:pPr>
+      <w:r>
+        <w:t>Files without source code lines</w:t>
+      </w:r>
+    </w:p>
+    <w:p>
+      <w:r>
+        <w:rPr>
+          <w:b/>
+        </w:rPr>
+        <w:t xml:space="preserve">click.mp3  </w:t>
+      </w:r>
+      <w:r>
+        <w:t>Binary audio for ordinary interface feedback. MP3 and DOCX files do not have stable plain-text source-code line numbers. It supports optional click feedback and is not the emergency alarm.</w:t>
+      </w:r>
+    </w:p>
+    <w:p>
+      <w:r>
+        <w:t xml:space="preserve">Related source: </w:t>
+      </w:r>
+      <w:hyperlink r:id="rId26">
+        <w:r>
+          <w:rPr>
+            <w:color w:val="245A81"/>
+          </w:rPr>
+          <w:t>(sound.js, line 9)</w:t>
+        </w:r>
+      </w:hyperlink>
+    </w:p>
+    <w:p>
+      <w:r>
+        <w:rPr>
+          <w:b/>
+        </w:rPr>
+        <w:t xml:space="preserve">warning-alarm.mp3  </w:t>
+      </w:r>
+      <w:r>
+        <w:t>Binary audio for the local drop warning. MP3 and DOCX files do not have stable plain-text source-code line numbers. Supplies the ten-second warning after the five-second check-in.</w:t>
+      </w:r>
+    </w:p>
+    <w:p>
+      <w:r>
+        <w:t xml:space="preserve">Related source: </w:t>
+      </w:r>
+      <w:hyperlink r:id="rId16">
+        <w:r>
+          <w:rPr>
+            <w:color w:val="245A81"/>
+          </w:rPr>
+          <w:t>(fall-detection.html, line 206)</w:t>
+        </w:r>
+      </w:hyperlink>
+    </w:p>
+    <w:p>
+      <w:r>
+        <w:rPr>
+          <w:b/>
+        </w:rPr>
+        <w:t xml:space="preserve">documentation/Lifeline_Prompt_Aligned_Code_Presentation.docx  </w:t>
+      </w:r>
+      <w:r>
+        <w:t>Earlier mission-aligned presenter document. MP3 and DOCX files do not have stable plain-text source-code line numbers. It communicates the mission and requires the same implementation corrections described here.</w:t>
+      </w:r>
+    </w:p>
+    <w:p>
+      <w:r>
+        <w:t xml:space="preserve">Related source: </w:t>
+      </w:r>
+      <w:hyperlink r:id="rId28">
+        <w:r>
+          <w:rPr>
+            <w:color w:val="245A81"/>
+          </w:rPr>
+          <w:t>(documentation/build_prompt_aligned_presentation.py, line 9)</w:t>
+        </w:r>
+      </w:hyperlink>
+    </w:p>
+    <w:p>
+      <w:r>
+        <w:rPr>
+          <w:b/>
+        </w:rPr>
+        <w:t xml:space="preserve">documentation/Lifeline_Two_Minute_Code_Presentation.docx  </w:t>
+      </w:r>
+      <w:r>
+        <w:t>Earlier two-minute presenter document. MP3 and DOCX files do not have stable plain-text source-code line numbers. It preserves presentation material. The generator currently points to a differently named output, so this reference identifies the save operation, not a guaranteed exact rebuild.</w:t>
+      </w:r>
+    </w:p>
+    <w:p>
+      <w:r>
+        <w:t xml:space="preserve">Related source: </w:t>
+      </w:r>
+      <w:hyperlink r:id="rId30">
+        <w:r>
+          <w:rPr>
+            <w:color w:val="245A81"/>
+          </w:rPr>
+          <w:t>(documentation/build_two_minute_presentation.py, line 148)</w:t>
+        </w:r>
+      </w:hyperlink>
+    </w:p>
+    <w:p>
+      <w:r>
+        <w:rPr>
+          <w:b/>
+        </w:rPr>
+        <w:t xml:space="preserve">documentation/PulseGuard_Code_Presentation.docx  </w:t>
+      </w:r>
+      <w:r>
+        <w:t>Existing repository-wide explanation document at the cited revision. MP3 and DOCX files do not have stable plain-text source-code line numbers. It is the earlier explanation expanded by this update; it does not run in the website.</w:t>
+      </w:r>
+    </w:p>
+    <w:p>
+      <w:r>
+        <w:t xml:space="preserve">Related source: </w:t>
+      </w:r>
+      <w:hyperlink r:id="rId31">
+        <w:r>
+          <w:rPr>
+            <w:color w:val="245A81"/>
+          </w:rPr>
+          <w:t>(documentation/build_repo_file_bullets.py, line 126)</w:t>
+        </w:r>
+      </w:hyperlink>
     </w:p>
     <w:sectPr>
+      <w:footerReference w:type="default" r:id="rId10"/>
       <w:pgSz w:w="12240" w:h="15840"/>
-      <w:pgMar w:top="792" w:right="1037" w:bottom="792" w:left="1037" w:header="720" w:footer="720" w:gutter="0"/>
+      <w:pgMar w:top="936" w:right="1080" w:bottom="936" w:left="1080" w:header="720" w:footer="720" w:gutter="0"/>
       <w:cols w:space="720"/>
       <w:docGrid w:linePitch="360"/>
     </w:sectPr>
   </w:body>
 </w:document>
+</file>
+
+<file path=word/footer1.xml><?xml version="1.0" encoding="utf-8"?>
+<w:ftr xmlns:m="http://schemas.openxmlformats.org/officeDocument/2006/math" xmlns:mc="http://schemas.openxmlformats.org/markup-compatibility/2006" xmlns:mo="http://schemas.microsoft.com/office/mac/office/2008/main" xmlns:mv="urn:schemas-microsoft-com:mac:vml" xmlns:o="urn:schemas-microsoft-com:office:office" xmlns:r="http://schemas.openxmlformats.org/officeDocument/2006/relationships" xmlns:v="urn:schemas-microsoft-com:vml" xmlns:w10="urn:schemas-microsoft-com:office:word" xmlns:w14="http://schemas.microsoft.com/office/word/2010/wordml" xmlns:w="http://schemas.openxmlformats.org/wordprocessingml/2006/main" xmlns:wne="http://schemas.microsoft.com/office/word/2006/wordml" xmlns:wp14="http://schemas.microsoft.com/office/word/2010/wordprocessingDrawing" xmlns:wp="http://schemas.openxmlformats.org/drawingml/2006/wordprocessingDrawing" xmlns:wpc="http://schemas.microsoft.com/office/word/2010/wordprocessingCanvas" xmlns:wpg="http://schemas.microsoft.com/office/word/2010/wordprocessingGroup" xmlns:wpi="http://schemas.microsoft.com/office/word/2010/wordprocessingInk" xmlns:wps="http://schemas.microsoft.com/office/word/2010/wordprocessingShape" mc:Ignorable="w14 wp14">
+  <w:p>
+    <w:pPr>
+      <w:pStyle w:val="Footer"/>
+      <w:jc w:val="right"/>
+    </w:pPr>
+    <w:fldSimple w:instr="PAGE"/>
+  </w:p>
+</w:ftr>
 </file>
 
 <file path=word/numbering.xml><?xml version="1.0" encoding="utf-8"?>
@@ -624,12 +4522,12 @@
     <w:qFormat/>
     <w:rsid w:val="00FC693F"/>
     <w:pPr>
-      <w:spacing w:after="100"/>
+      <w:spacing w:after="120" w:line="259" w:lineRule="auto"/>
     </w:pPr>
     <w:rPr>
       <w:rFonts w:ascii="Aptos" w:hAnsi="Aptos"/>
-      <w:color w:val="202428"/>
-      <w:sz w:val="20"/>
+      <w:color w:val="000000"/>
+      <w:sz w:val="22"/>
     </w:rPr>
   </w:style>
   <w:style w:type="paragraph" w:styleId="Header">
@@ -687,15 +4585,15 @@
     <w:pPr>
       <w:keepNext/>
       <w:keepLines/>
-      <w:spacing w:before="480" w:after="0"/>
+      <w:spacing w:before="480" w:after="120" w:line="259" w:lineRule="auto"/>
       <w:outlineLvl w:val="0"/>
     </w:pPr>
     <w:rPr>
-      <w:rFonts w:asciiTheme="majorHAnsi" w:eastAsiaTheme="majorEastAsia" w:hAnsiTheme="majorHAnsi" w:cstheme="majorBidi"/>
-      <w:b/>
+      <w:rFonts w:asciiTheme="majorHAnsi" w:eastAsiaTheme="majorEastAsia" w:hAnsiTheme="majorHAnsi" w:cstheme="majorBidi" w:ascii="Georgia" w:hAnsi="Georgia"/>
+      <w:b w:val="0"/>
       <w:bCs/>
-      <w:color w:val="365F91" w:themeColor="accent1" w:themeShade="BF"/>
-      <w:sz w:val="28"/>
+      <w:color w:val="000000"/>
+      <w:sz w:val="34"/>
       <w:szCs w:val="28"/>
     </w:rPr>
   </w:style>
@@ -711,14 +4609,14 @@
     <w:pPr>
       <w:keepNext/>
       <w:keepLines/>
-      <w:spacing w:before="200" w:after="0"/>
+      <w:spacing w:before="200" w:after="120" w:line="259" w:lineRule="auto"/>
       <w:outlineLvl w:val="1"/>
     </w:pPr>
     <w:rPr>
-      <w:rFonts w:asciiTheme="majorHAnsi" w:eastAsiaTheme="majorEastAsia" w:hAnsiTheme="majorHAnsi" w:cstheme="majorBidi"/>
+      <w:rFonts w:asciiTheme="majorHAnsi" w:eastAsiaTheme="majorEastAsia" w:hAnsiTheme="majorHAnsi" w:cstheme="majorBidi" w:ascii="Georgia" w:hAnsi="Georgia"/>
       <w:b/>
       <w:bCs/>
-      <w:color w:val="4F81BD" w:themeColor="accent1"/>
+      <w:color w:val="000000"/>
       <w:sz w:val="26"/>
       <w:szCs w:val="26"/>
     </w:rPr>
@@ -973,7 +4871,7 @@
     <w:qFormat/>
     <w:rsid w:val="00FC693F"/>
     <w:pPr>
-      <w:spacing w:after="300" w:line="240" w:lineRule="auto"/>
+      <w:spacing w:after="120" w:line="259" w:lineRule="auto"/>
       <w:contextualSpacing/>
     </w:pPr>
     <w:rPr>
@@ -981,7 +4879,7 @@
       <w:color w:val="000000"/>
       <w:spacing w:val="5"/>
       <w:kern w:val="28"/>
-      <w:sz w:val="50"/>
+      <w:sz w:val="52"/>
       <w:szCs w:val="52"/>
     </w:rPr>
   </w:style>

</xml_diff>